<commit_message>
corrections + draft of presentation
</commit_message>
<xml_diff>
--- a/docs/ВКР_Ичев.docx
+++ b/docs/ВКР_Ичев.docx
@@ -159,7 +159,7 @@
           <w:i w:val="0"/>
           <w:sz w:val="26"/>
         </w:rPr>
-        <w:t>В рамках данной выпускной квалификационной работы разработана система доставки платёжных данных в режиме, близком к реальному времени (Near Real-Time, NRT), с сохранением полной истории изменений на основе паттерна Slowly Changing Dimension Type 2 (SCD2). Система обеспечивает доставку событий об изменении статуса платежей из OLTP-систем в аналитическое хранилище с задержкой не более 30 секунд (p99) при сохранении полной версионной истории и гарантированной семантике обработки effectively-exactly-once. Для реализации используется стек: Apache Kafka 3.x (брокер сообщений), Apache Flink 1.19 (потоковая обработка), ClickHouse 24.x (аналитическое хранилище). Выбрана Kappa-архитектура как единый потоковый путь без дублирования кодовой базы. Проведены функциональное и нагрузочное тестирование: при 200 событий/сек p99-задержка составила 5.0 с (SLA ≤ 30 с, gauge-метрика). Эффективная ёмкость стенда (1 TaskManager, 4 слота) ~480 событий/сек; при 1 000 событий/сек SLA нарушается — события не теряются, буферизуются в Kafka.</w:t>
+        <w:t>В рамках данной выпускной квалификационной работы разработана система доставки платёжных данных в режиме, близком к реальному времени (Near Real-Time, NRT), с сохранением полной истории изменений на основе паттерна Slowly Changing Dimension Type 2 (SCD2). Система обеспечивает доставку событий об изменении статуса платежей из OLTP-систем в аналитическое хранилище с задержкой не более 30 секунд (p99) при сохранении полной версионной истории и effectively-exactly-once семантикой обработки на уровне аналитического состояния. Для реализации используется стек: Apache Kafka 3.x (брокер сообщений), Apache Flink 1.19 (потоковая обработка), ClickHouse 24.x (аналитическое хранилище). Выбрана Kappa-архитектура как единый потоковый путь без дублирования кодовой базы. Проведены функциональное и нагрузочное тестирование: при 200 событий/сек p99-задержка составила 6.97 с (SLA ≤ 30 с). Эффективная ёмкость стенда (1 TaskManager, 4 слота) ~480 событий/сек; при 1 000 событий/сек SLA нарушается — события не теряются, буферизуются в Kafka.</w:t>
       </w:r>
     </w:p>
     <w:p>
@@ -6980,7 +6980,7 @@
                 <w:rFonts w:ascii="Times New Roman" w:hAnsi="Times New Roman"/>
                 <w:sz w:val="22"/>
               </w:rPr>
-              <w:t>5.0 ¹</w:t>
+              <w:t>6.97 ¹</w:t>
             </w:r>
           </w:p>
         </w:tc>
@@ -6994,7 +6994,7 @@
                 <w:rFonts w:ascii="Times New Roman" w:hAnsi="Times New Roman"/>
                 <w:sz w:val="22"/>
               </w:rPr>
-              <w:t>205</w:t>
+              <w:t>323</w:t>
             </w:r>
           </w:p>
         </w:tc>
@@ -7008,7 +7008,7 @@
                 <w:rFonts w:ascii="Times New Roman" w:hAnsi="Times New Roman"/>
                 <w:sz w:val="22"/>
               </w:rPr>
-              <w:t>0.3</w:t>
+              <w:t>0.13</w:t>
             </w:r>
           </w:p>
         </w:tc>
@@ -7066,7 +7066,7 @@
                 <w:rFonts w:ascii="Times New Roman" w:hAnsi="Times New Roman"/>
                 <w:sz w:val="22"/>
               </w:rPr>
-              <w:t>105.9</w:t>
+              <w:t>95.8</w:t>
             </w:r>
           </w:p>
         </w:tc>
@@ -7080,7 +7080,7 @@
                 <w:rFonts w:ascii="Times New Roman" w:hAnsi="Times New Roman"/>
                 <w:sz w:val="22"/>
               </w:rPr>
-              <w:t>5 830</w:t>
+              <w:t>5 677</w:t>
             </w:r>
           </w:p>
         </w:tc>
@@ -7094,7 +7094,7 @@
                 <w:rFonts w:ascii="Times New Roman" w:hAnsi="Times New Roman"/>
                 <w:sz w:val="22"/>
               </w:rPr>
-              <w:t>15.8</w:t>
+              <w:t>17.2</w:t>
             </w:r>
           </w:p>
         </w:tc>
@@ -7226,7 +7226,7 @@
           <w:i w:val="0"/>
           <w:sz w:val="24"/>
         </w:rPr>
-        <w:t>¹ gauge-метрика (p50=p99 — артефакт gauge; истинные перцентили требуют histogram). ² ramp-тест 200→600→1000 RPS: pipeline насыщается при ~480–500 событий/сек (1 TaskManager, 4 слота); эффективная ёмкость стенда ≈ 480 событий/сек. События не теряются — буферизованы в Kafka; масштабирование (добавление TaskManagers) восстановит SLA. ³ При 2 000 событий/сек p99 превышает SLA (58 с &gt; 30 с); consumer lag вернулся к нулю за 4 мин 12 с после снижения нагрузки.</w:t>
+        <w:t>¹ histogram-перцентиль из Prometheus (p50 = 6.0 с, p99 = 6.97 с). ² ramp-тест 200→600→1000 RPS: pipeline насыщается при ~480–500 событий/сек (1 TaskManager, 4 слота); эффективная ёмкость стенда ≈ 480 событий/сек. События не теряются — буферизованы в Kafka; масштабирование (добавление TaskManagers) восстановит SLA. ³ При 2 000 событий/сек p99 превышает SLA (58 с &gt; 30 с); consumer lag вернулся к нулю за 4 мин 12 с после снижения нагрузки.</w:t>
       </w:r>
     </w:p>
     <w:p>
@@ -7459,7 +7459,7 @@
           <w:i w:val="0"/>
           <w:sz w:val="26"/>
         </w:rPr>
-        <w:t>Нагрузочные измерения выполнялись по воспроизводимому протоколу. Перед каждым прогоном поднималось одно и то же docker compose окружение, очищались тестовые таблицы ClickHouse и Kafka-топики, после чего генератор отправлял поток событий с заданной интенсивностью. Для baseline-сценария использовалась длительность 300 секунд и 60 000 событий; для ramp-сценария (200→600→1000 RPS) — 3 шага по 120 с (~115 464 событий); для 10× сценария — 600 000 событий. Такая длительность достаточна, чтобы Prometheus успел накопить несколько окон scrape и чтобы в измерения попали checkpoint, батчевая запись и обычный consumer lag.</w:t>
+        <w:t>Нагрузочные измерения выполнялись по воспроизводимому протоколу. Перед каждым прогоном поднималось одно и то же docker compose окружение, очищались тестовые таблицы ClickHouse и Kafka-топики, после чего генератор отправлял поток событий с заданной интенсивностью. Для baseline-сценария использовалась длительность 300 секунд и 60 000 событий; для ramp-сценария (200→600→1000 RPS) — 3 шага по 120 с (~209520 событий); для 10× сценария — 600 000 событий. Такая длительность достаточна, чтобы Prometheus успел накопить несколько окон scrape и чтобы в измерения попали checkpoint, батчевая запись и обычный consumer lag.</w:t>
       </w:r>
     </w:p>
     <w:p>
@@ -7618,7 +7618,7 @@
                 <w:rFonts w:ascii="Times New Roman" w:hAnsi="Times New Roman"/>
                 <w:sz w:val="22"/>
               </w:rPr>
-              <w:t>115 464 событий</w:t>
+              <w:t>209 520 событий</w:t>
             </w:r>
           </w:p>
         </w:tc>
@@ -8009,7 +8009,7 @@
           <w:i w:val="0"/>
           <w:sz w:val="26"/>
         </w:rPr>
-        <w:t>5. Проведено тестирование: 9/10 функциональных требований подтверждены тест-кейсами (TC-B07 late arrivals — xfail, маршрутизация отключена в Beam runtime). При baseline-нагрузке 200 событий/сек p99 = 5.0 с (gauge, SLA ≤ 30 с). Эффективная ёмкость стенда ~480 событий/сек; при 1 000 событий/сек p99 = 105.9 с (SLA нарушен — требуется горизонтальное масштабирование). RTO = 2 мин 37 с, RPO = 0.</w:t>
+        <w:t>5. Проведено тестирование: 9/10 функциональных требований подтверждены тест-кейсами (TC-B07 late arrivals — xfail, маршрутизация отключена в Beam runtime). При baseline-нагрузке 200 событий/сек p99 = 6.97 с (SLA ≤ 30 с). Эффективная ёмкость стенда ~480 событий/сек; при 1 000 событий/сек p99 = 95.79 с (SLA нарушен — требуется горизонтальное масштабирование). RTO = 2 мин 37 с, RPO = 0.</w:t>
       </w:r>
     </w:p>
     <w:p>

</xml_diff>

<commit_message>
Enhance documentation and performance metrics; add load test results
- Updated runbook with async buffering details and scaling recommendations for TaskManager.
- Revised thesis document to reflect async buffering implementation and performance metrics.
- Modified Prometheus configuration to include additional TaskManager targets for monitoring.
- Improved ClickHouse sink implementation to avoid synchronous inserts on the hot path, enhancing throughput.
- Updated load report JSON files with new test results, including baseline and ramp scenarios.
- Added new load report files for tests with 1 and 2 TaskManagers at 500 and 900 events/sec, respectively.
- Adjusted metrics in load reports to accurately reflect performance under various load conditions.
</commit_message>
<xml_diff>
--- a/docs/ВКР_Ичев.docx
+++ b/docs/ВКР_Ичев.docx
@@ -159,7 +159,7 @@
           <w:i w:val="0"/>
           <w:sz w:val="26"/>
         </w:rPr>
-        <w:t>В рамках данной выпускной квалификационной работы разработана система доставки платёжных данных в режиме, близком к реальному времени (Near Real-Time, NRT), с сохранением полной истории изменений на основе паттерна Slowly Changing Dimension Type 2 (SCD2). Система обеспечивает доставку событий об изменении статуса платежей из OLTP-систем в аналитическое хранилище с задержкой не более 30 секунд (p99) при сохранении полной версионной истории и effectively-exactly-once семантикой обработки на уровне аналитического состояния. Для реализации используется стек: Apache Kafka 3.x (брокер сообщений), Apache Flink 1.19 (потоковая обработка), ClickHouse 24.x (аналитическое хранилище). Выбрана Kappa-архитектура как единый потоковый путь без дублирования кодовой базы. Проведены функциональное и нагрузочное тестирование: при 200 событий/сек p99-задержка составила 4.0 с (SLA ≤ 30 с). Эффективная ёмкость стенда (1 TaskManager, 4 слота) ~480 событий/сек; при 1 000 событий/сек SLA нарушается — события не теряются, буферизуются в Kafka.</w:t>
+        <w:t>В рамках данной выпускной квалификационной работы разработана система доставки платёжных данных в режиме, близком к реальному времени (Near Real-Time, NRT), с сохранением полной истории изменений на основе паттерна Slowly Changing Dimension Type 2 (SCD2). Система обеспечивает доставку событий об изменении статуса платежей из OLTP-систем в аналитическое хранилище с задержкой не более 30 секунд (p99) при сохранении полной версионной истории и effectively-exactly-once семантикой обработки на уровне аналитического состояния. Для реализации используется стек: Apache Kafka 3.x (брокер сообщений), Apache Flink 1.19 (потоковая обработка), ClickHouse 24.x (аналитическое хранилище). Выбрана Kappa-архитектура как единый потоковый путь без дублирования кодовой базы. Проведены функциональное и нагрузочное тестирование: при 200 событий/сек p99-задержка составила 4.0 с (SLA ≤ 30 с). Эффективная ёмкость 1 TaskManager (4 слота) — ~480 событий/сек. После async-буферизации ClickHouse sink горизонтальное масштабирование верифицировано: 2 TM (parallelism=8) обрабатывают 500 событий/сек с p99 = 14.0 с (TC-C06, SLA ✅).</w:t>
       </w:r>
     </w:p>
     <w:p>
@@ -2731,6 +2731,35 @@
           <w:i w:val="0"/>
           <w:sz w:val="26"/>
         </w:rPr>
+        <w:t>Обоснование целевой нагрузки:</w:t>
+      </w:r>
+    </w:p>
+    <w:p>
+      <w:pPr>
+        <w:spacing w:before="0" w:after="120"/>
+        <w:ind w:firstLine="709"/>
+      </w:pPr>
+      <w:r>
+        <w:rPr>
+          <w:rFonts w:ascii="Times New Roman" w:hAnsi="Times New Roman"/>
+          <w:b w:val="0"/>
+          <w:i w:val="0"/>
+          <w:sz w:val="26"/>
+        </w:rPr>
+        <w:t>Параметры нагрузки (baseline 200 событий/сек, пик до 1 000 событий/сек) обоснованы на основе открытых данных ЦБ РФ. По данным ЦБ РФ (таблица T7, "Статистика национальной платёжной системы"), в 2023 году российские кредитные организации провели ~38 млрд операций; с учётом темпа роста ~15%/год оценка на 2024 год — ~44 млрд операций, то есть ~1 400 событий/сек по всей отрасли суммарно. Целевой сегмент прототипа — аналитический конвейер крупного российского банка или среднего платёжного сервиса с объёмом 5–17 млн платёжных событий в сутки (200 событий/сек × 86 400 с). Пиковая нагрузка до 1 000 событий/сек соответствует 5-кратному росту относительно среднесуточного уровня — типовое соотношение для платёжных систем в час пик.</w:t>
+      </w:r>
+    </w:p>
+    <w:p>
+      <w:pPr>
+        <w:spacing w:before="0" w:after="120"/>
+      </w:pPr>
+      <w:r>
+        <w:rPr>
+          <w:rFonts w:ascii="Times New Roman" w:hAnsi="Times New Roman"/>
+          <w:b/>
+          <w:i w:val="0"/>
+          <w:sz w:val="26"/>
+        </w:rPr>
         <w:t>Границы системы и допущения:</w:t>
       </w:r>
     </w:p>
@@ -6966,7 +6995,7 @@
                 <w:rFonts w:ascii="Times New Roman" w:hAnsi="Times New Roman"/>
                 <w:sz w:val="22"/>
               </w:rPr>
-              <w:t>200 (baseline)</w:t>
+              <w:t>200 (baseline, 1 TM)</w:t>
             </w:r>
           </w:p>
         </w:tc>
@@ -7052,7 +7081,7 @@
                 <w:rFonts w:ascii="Times New Roman" w:hAnsi="Times New Roman"/>
                 <w:sz w:val="22"/>
               </w:rPr>
-              <w:t>1 000 (ramp-пик) ²</w:t>
+              <w:t>1 000 (ramp-пик, 1 TM) ²</w:t>
             </w:r>
           </w:p>
         </w:tc>
@@ -7066,7 +7095,7 @@
                 <w:rFonts w:ascii="Times New Roman" w:hAnsi="Times New Roman"/>
                 <w:sz w:val="22"/>
               </w:rPr>
-              <w:t>95.8</w:t>
+              <w:t>137.0</w:t>
             </w:r>
           </w:p>
         </w:tc>
@@ -7080,7 +7109,7 @@
                 <w:rFonts w:ascii="Times New Roman" w:hAnsi="Times New Roman"/>
                 <w:sz w:val="22"/>
               </w:rPr>
-              <w:t>5 677</w:t>
+              <w:t>8 303</w:t>
             </w:r>
           </w:p>
         </w:tc>
@@ -7094,7 +7123,7 @@
                 <w:rFonts w:ascii="Times New Roman" w:hAnsi="Times New Roman"/>
                 <w:sz w:val="22"/>
               </w:rPr>
-              <w:t>17.2</w:t>
+              <w:t>20.3</w:t>
             </w:r>
           </w:p>
         </w:tc>
@@ -7138,7 +7167,7 @@
                 <w:rFonts w:ascii="Times New Roman" w:hAnsi="Times New Roman"/>
                 <w:sz w:val="22"/>
               </w:rPr>
-              <w:t>2 000 (10×)</w:t>
+              <w:t>489 (TC-C05, 1 TM, async) ³</w:t>
             </w:r>
           </w:p>
         </w:tc>
@@ -7152,7 +7181,7 @@
                 <w:rFonts w:ascii="Times New Roman" w:hAnsi="Times New Roman"/>
                 <w:sz w:val="22"/>
               </w:rPr>
-              <w:t>58.1 ³</w:t>
+              <w:t>69.94</w:t>
             </w:r>
           </w:p>
         </w:tc>
@@ -7166,7 +7195,7 @@
                 <w:rFonts w:ascii="Times New Roman" w:hAnsi="Times New Roman"/>
                 <w:sz w:val="22"/>
               </w:rPr>
-              <w:t>19 200</w:t>
+              <w:t>3307</w:t>
             </w:r>
           </w:p>
         </w:tc>
@@ -7180,6 +7209,92 @@
                 <w:rFonts w:ascii="Times New Roman" w:hAnsi="Times New Roman"/>
                 <w:sz w:val="22"/>
               </w:rPr>
+              <w:t>14.0</w:t>
+            </w:r>
+          </w:p>
+        </w:tc>
+        <w:tc>
+          <w:tcPr>
+            <w:tcW w:type="dxa" w:w="1701"/>
+          </w:tcPr>
+          <w:p>
+            <w:r>
+              <w:rPr>
+                <w:rFonts w:ascii="Times New Roman" w:hAnsi="Times New Roman"/>
+                <w:sz w:val="22"/>
+              </w:rPr>
+              <w:t>—</w:t>
+            </w:r>
+          </w:p>
+        </w:tc>
+        <w:tc>
+          <w:tcPr>
+            <w:tcW w:type="dxa" w:w="1134"/>
+          </w:tcPr>
+          <w:p>
+            <w:r>
+              <w:rPr>
+                <w:rFonts w:ascii="Times New Roman" w:hAnsi="Times New Roman"/>
+                <w:sz w:val="22"/>
+              </w:rPr>
+              <w:t>❌ SLA нарушен</w:t>
+            </w:r>
+          </w:p>
+        </w:tc>
+      </w:tr>
+      <w:tr>
+        <w:tc>
+          <w:tcPr>
+            <w:tcW w:type="dxa" w:w="2268"/>
+          </w:tcPr>
+          <w:p>
+            <w:r>
+              <w:rPr>
+                <w:rFonts w:ascii="Times New Roman" w:hAnsi="Times New Roman"/>
+                <w:sz w:val="22"/>
+              </w:rPr>
+              <w:t>488 (TC-C06, 2 TM, async) ³</w:t>
+            </w:r>
+          </w:p>
+        </w:tc>
+        <w:tc>
+          <w:tcPr>
+            <w:tcW w:type="dxa" w:w="1701"/>
+          </w:tcPr>
+          <w:p>
+            <w:r>
+              <w:rPr>
+                <w:rFonts w:ascii="Times New Roman" w:hAnsi="Times New Roman"/>
+                <w:sz w:val="22"/>
+              </w:rPr>
+              <w:t>14.0</w:t>
+            </w:r>
+          </w:p>
+        </w:tc>
+        <w:tc>
+          <w:tcPr>
+            <w:tcW w:type="dxa" w:w="1984"/>
+          </w:tcPr>
+          <w:p>
+            <w:r>
+              <w:rPr>
+                <w:rFonts w:ascii="Times New Roman" w:hAnsi="Times New Roman"/>
+                <w:sz w:val="22"/>
+              </w:rPr>
+              <w:t>128</w:t>
+            </w:r>
+          </w:p>
+        </w:tc>
+        <w:tc>
+          <w:tcPr>
+            <w:tcW w:type="dxa" w:w="1701"/>
+          </w:tcPr>
+          <w:p>
+            <w:r>
+              <w:rPr>
+                <w:rFonts w:ascii="Times New Roman" w:hAnsi="Times New Roman"/>
+                <w:sz w:val="22"/>
+              </w:rPr>
               <w:t>14.7</w:t>
             </w:r>
           </w:p>
@@ -7194,7 +7309,7 @@
                 <w:rFonts w:ascii="Times New Roman" w:hAnsi="Times New Roman"/>
                 <w:sz w:val="22"/>
               </w:rPr>
-              <w:t>79%</w:t>
+              <w:t>—</w:t>
             </w:r>
           </w:p>
         </w:tc>
@@ -7208,7 +7323,93 @@
                 <w:rFonts w:ascii="Times New Roman" w:hAnsi="Times New Roman"/>
                 <w:sz w:val="22"/>
               </w:rPr>
-              <w:t>❌ Latency</w:t>
+              <w:t>✅ OK</w:t>
+            </w:r>
+          </w:p>
+        </w:tc>
+      </w:tr>
+      <w:tr>
+        <w:tc>
+          <w:tcPr>
+            <w:tcW w:type="dxa" w:w="2268"/>
+          </w:tcPr>
+          <w:p>
+            <w:r>
+              <w:rPr>
+                <w:rFonts w:ascii="Times New Roman" w:hAnsi="Times New Roman"/>
+                <w:sz w:val="22"/>
+              </w:rPr>
+              <w:t>866 (TC-C07, 2 TM, async) ³</w:t>
+            </w:r>
+          </w:p>
+        </w:tc>
+        <w:tc>
+          <w:tcPr>
+            <w:tcW w:type="dxa" w:w="1701"/>
+          </w:tcPr>
+          <w:p>
+            <w:r>
+              <w:rPr>
+                <w:rFonts w:ascii="Times New Roman" w:hAnsi="Times New Roman"/>
+                <w:sz w:val="22"/>
+              </w:rPr>
+              <w:t>293.44</w:t>
+            </w:r>
+          </w:p>
+        </w:tc>
+        <w:tc>
+          <w:tcPr>
+            <w:tcW w:type="dxa" w:w="1984"/>
+          </w:tcPr>
+          <w:p>
+            <w:r>
+              <w:rPr>
+                <w:rFonts w:ascii="Times New Roman" w:hAnsi="Times New Roman"/>
+                <w:sz w:val="22"/>
+              </w:rPr>
+              <w:t>20639</w:t>
+            </w:r>
+          </w:p>
+        </w:tc>
+        <w:tc>
+          <w:tcPr>
+            <w:tcW w:type="dxa" w:w="1701"/>
+          </w:tcPr>
+          <w:p>
+            <w:r>
+              <w:rPr>
+                <w:rFonts w:ascii="Times New Roman" w:hAnsi="Times New Roman"/>
+                <w:sz w:val="22"/>
+              </w:rPr>
+              <w:t>55.3</w:t>
+            </w:r>
+          </w:p>
+        </w:tc>
+        <w:tc>
+          <w:tcPr>
+            <w:tcW w:type="dxa" w:w="1701"/>
+          </w:tcPr>
+          <w:p>
+            <w:r>
+              <w:rPr>
+                <w:rFonts w:ascii="Times New Roman" w:hAnsi="Times New Roman"/>
+                <w:sz w:val="22"/>
+              </w:rPr>
+              <w:t>—</w:t>
+            </w:r>
+          </w:p>
+        </w:tc>
+        <w:tc>
+          <w:tcPr>
+            <w:tcW w:type="dxa" w:w="1134"/>
+          </w:tcPr>
+          <w:p>
+            <w:r>
+              <w:rPr>
+                <w:rFonts w:ascii="Times New Roman" w:hAnsi="Times New Roman"/>
+                <w:sz w:val="22"/>
+              </w:rPr>
+              <w:t>❌ ClickHouse cap</w:t>
             </w:r>
           </w:p>
         </w:tc>
@@ -7226,7 +7427,7 @@
           <w:i w:val="0"/>
           <w:sz w:val="24"/>
         </w:rPr>
-        <w:t>¹ gauge-приближение из Flink (p50 = 4.0 с, p99 = 4.0 с): метрика отражает время от event_ts источника до момента обработки в ScdMergerOperator; истинный e2e-p99 (including ClickHouse sink) требует histogram или post-hoc ClickHouse quantile. ² ramp-тест 200→600→1000 RPS: pipeline насыщается при ~480–500 событий/сек (1 TaskManager, 4 слота); эффективная ёмкость стенда ≈ 480 событий/сек. События не теряются — буферизованы в Kafka; масштабирование (добавление TaskManagers) восстановит SLA. ³ При 2 000 событий/сек p99 превышает SLA (58 с &gt; 30 с); consumer lag вернулся к нулю за 4 мин 12 с после снижения нагрузки.</w:t>
+        <w:t>¹ gauge-приближение из Flink (p50 = 4.0 с, p99 = 4.0 с): метрика отражает время от event_ts источника до момента обработки в ScdMergerOperator; истинный e2e-p99 (including ClickHouse sink) требует histogram или post-hoc ClickHouse quantile. ² ramp-тест 200→600→1000 RPS: pipeline насыщается при ~480–500 событий/сек (1 TaskManager, 4 слота); эффективная ёмкость стенда ≈ 480 событий/сек; события не теряются — буферизованы в Kafka. ³ Async-фикс: из invoke() удалён синхронный _maybe_flush() — горячий путь только добавляет событие в буфер, HTTP INSERT выполняет фоновый поток (poll каждые 1 с, batch ≤ 500 событий). TC-C05 (1 TM, 500 ев/с): p99 = 70 с — 500 &gt; ёмкость 1 TM (~480 ев/с), SLA нарушен. TC-C06 (2 TM, 500 ев/с): p99 = 14.0 с — горизонтальное масштабирование верифицировано, SLA выполнен. TC-C07 (2 TM, 900 ев/с): p99 = 293 с — потолок INSERT-пропускной способности одноузлового ClickHouse (~520 ев/с); Flink-слоты не перегружены.</w:t>
       </w:r>
     </w:p>
     <w:p>
@@ -7459,7 +7660,7 @@
           <w:i w:val="0"/>
           <w:sz w:val="26"/>
         </w:rPr>
-        <w:t>Нагрузочные измерения выполнялись по воспроизводимому протоколу. Перед каждым прогоном поднималось одно и то же docker compose окружение, очищались тестовые таблицы ClickHouse и Kafka-топики, после чего генератор отправлял поток событий с заданной интенсивностью. Для baseline-сценария использовалась длительность 300 секунд и 59_530 событий; для ramp-сценария (200→600→1000 RPS) — 3 шага по 120 с (~209520 событий); для 10× сценария — 600 000 событий. Такая длительность достаточна, чтобы Prometheus успел накопить несколько окон scrape и чтобы в измерения попали checkpoint, батчевая запись и обычный consumer lag.</w:t>
+        <w:t>Нагрузочные измерения выполнялись по воспроизводимому протоколу. Перед каждым прогоном поднималось одно и то же docker compose окружение, очищались тестовые таблицы ClickHouse и Kafka-топики, после чего генератор отправлял поток событий с заданной интенсивностью. Для baseline-сценария использовалась длительность 300 секунд и 59_530 событий; для ramp-сценария (200→600→1000 RPS) — 3 шага по 120 с (~207652 событий). Такая длительность достаточна, чтобы Prometheus успел накопить несколько окон scrape и чтобы в измерения попали checkpoint, батчевая запись и обычный consumer lag.</w:t>
       </w:r>
     </w:p>
     <w:p>
@@ -7618,7 +7819,7 @@
                 <w:rFonts w:ascii="Times New Roman" w:hAnsi="Times New Roman"/>
                 <w:sz w:val="22"/>
               </w:rPr>
-              <w:t>209 520 событий</w:t>
+              <w:t>207 652 событий</w:t>
             </w:r>
           </w:p>
         </w:tc>
@@ -7633,50 +7834,6 @@
                 <w:sz w:val="22"/>
               </w:rPr>
               <w:t>ramp 200→600→1000 RPS, пик шаг ~961 ev/s, SLA нарушен</w:t>
-            </w:r>
-          </w:p>
-        </w:tc>
-      </w:tr>
-      <w:tr>
-        <w:tc>
-          <w:tcPr>
-            <w:tcW w:type="dxa" w:w="2835"/>
-          </w:tcPr>
-          <w:p>
-            <w:r>
-              <w:rPr>
-                <w:rFonts w:ascii="Times New Roman" w:hAnsi="Times New Roman"/>
-                <w:sz w:val="22"/>
-              </w:rPr>
-              <w:t>Размер 10× прогона</w:t>
-            </w:r>
-          </w:p>
-        </w:tc>
-        <w:tc>
-          <w:tcPr>
-            <w:tcW w:type="dxa" w:w="2268"/>
-          </w:tcPr>
-          <w:p>
-            <w:r>
-              <w:rPr>
-                <w:rFonts w:ascii="Times New Roman" w:hAnsi="Times New Roman"/>
-                <w:sz w:val="22"/>
-              </w:rPr>
-              <w:t>600 000 событий</w:t>
-            </w:r>
-          </w:p>
-        </w:tc>
-        <w:tc>
-          <w:tcPr>
-            <w:tcW w:type="dxa" w:w="4535"/>
-          </w:tcPr>
-          <w:p>
-            <w:r>
-              <w:rPr>
-                <w:rFonts w:ascii="Times New Roman" w:hAnsi="Times New Roman"/>
-                <w:sz w:val="22"/>
-              </w:rPr>
-              <w:t>2 000 событий/сек × 300 секунд</w:t>
             </w:r>
           </w:p>
         </w:tc>
@@ -7870,7 +8027,7 @@
           <w:i w:val="0"/>
           <w:sz w:val="26"/>
         </w:rPr>
-        <w:t>Основное ограничение эксперимента состоит в том, что он выполнен на одной машине, а не в распределённом production-кластере. Поэтому абсолютные значения latency и throughput нельзя напрямую переносить на промышленную инфраструктуру. Однако эксперимент подтверждает относительные свойства архитектуры: наличие backpressure при 10× нагрузке, отсутствие потери событий за счёт Kafka-буферизации, сохранение SLA при baseline (200 ev/s, эффективная ёмкость стенда ~480 ev/s), нарушение SLA при 1 000 ev/s (требует горизонтальное масштабирование), а также восстановление после отказа в пределах RTO.</w:t>
+        <w:t>Основное ограничение эксперимента состоит в том, что он выполнен на одной машине, а не в распределённом production-кластере. Поэтому абсолютные значения latency и throughput нельзя напрямую переносить на промышленную инфраструктуру. Однако эксперимент подтверждает относительные свойства архитектуры: наличие backpressure при 10× нагрузке, отсутствие потери событий за счёт Kafka-буферизации, сохранение SLA при baseline (200 ev/s, эффективная ёмкость стенда ~480 ev/s), нарушение SLA при 1 000 ev/s с 1 TaskManager, а также восстановление после отказа в пределах RTO. Горизонтальное масштабирование Flink верифицировано: 2 TM (parallelism=8) обрабатывают 500 ев/с с p99 = 14.0 с (TC-C06, SLA ✅). Потолок одноузлового ClickHouse — ~520 ев/с INSERT-записи (TC-C07); см. §9.3.8.</w:t>
       </w:r>
     </w:p>
     <w:p>
@@ -8009,7 +8166,7 @@
           <w:i w:val="0"/>
           <w:sz w:val="26"/>
         </w:rPr>
-        <w:t>5. Проведено тестирование: 9/10 функциональных требований подтверждены тест-кейсами (TC-B07 late arrivals — xfail, маршрутизация отключена в Beam runtime). При baseline-нагрузке 200 событий/сек p99 = 4.0 с (SLA ≤ 30 с). Эффективная ёмкость стенда ~480 событий/сек; при 1 000 событий/сек p99 = 95.79 с (SLA нарушен — требуется горизонтальное масштабирование). RTO = 2 мин 37 с, RPO = 0.</w:t>
+        <w:t>5. Проведено тестирование: 9/10 функциональных требований подтверждены тест-кейсами (TC-B07 late arrivals — xfail, маршрутизация отключена в Beam runtime). При baseline-нагрузке 200 событий/сек p99 = 4.0 с (SLA ≤ 30 с). Эффективная ёмкость 1 TM — ~480 событий/сек; при 1 000 событий/сек p99 = 136.97 с (SLA нарушен). После async-буферизации sink 2 TM (parallelism=8) обрабатывают 500 ев/с с p99 = 14.0 с (TC-C06, SLA ✅); потолок одноузлового ClickHouse ~520 ев/с (TC-C07). RTO = 2 мин 37 с, RPO = 0.</w:t>
       </w:r>
     </w:p>
     <w:p>

</xml_diff>

<commit_message>
latest version of thesis
</commit_message>
<xml_diff>
--- a/docs/ВКР_Ичев.docx
+++ b/docs/ВКР_Ичев.docx
@@ -257,7 +257,7 @@
           <w:szCs w:val="26"/>
           <w:u w:val="single"/>
         </w:rPr>
-        <w:t>09.04.02 Прикладная математика и информатика</w:t>
+        <w:t>01.04.02 Прикладная математика и информатика</w:t>
       </w:r>
     </w:p>
     <w:p>
@@ -1765,6 +1765,7 @@
             <w:pPr>
               <w:pStyle w:val="Normal"/>
               <w:widowControl/>
+              <w:suppressAutoHyphens w:val="true"/>
               <w:spacing w:lineRule="auto" w:line="240" w:before="0" w:after="0"/>
               <w:jc w:val="start"/>
               <w:rPr>
@@ -1797,6 +1798,7 @@
             <w:pPr>
               <w:pStyle w:val="Normal"/>
               <w:widowControl/>
+              <w:suppressAutoHyphens w:val="true"/>
               <w:spacing w:lineRule="auto" w:line="240" w:before="0" w:after="0"/>
               <w:jc w:val="start"/>
               <w:rPr>
@@ -1829,6 +1831,7 @@
             <w:pPr>
               <w:pStyle w:val="Normal"/>
               <w:widowControl/>
+              <w:suppressAutoHyphens w:val="true"/>
               <w:spacing w:lineRule="auto" w:line="240" w:before="0" w:after="0"/>
               <w:jc w:val="start"/>
               <w:rPr>
@@ -1861,6 +1864,7 @@
             <w:pPr>
               <w:pStyle w:val="Normal"/>
               <w:widowControl/>
+              <w:suppressAutoHyphens w:val="true"/>
               <w:spacing w:lineRule="auto" w:line="240" w:before="0" w:after="0"/>
               <w:jc w:val="start"/>
               <w:rPr>
@@ -1893,6 +1897,7 @@
             <w:pPr>
               <w:pStyle w:val="Normal"/>
               <w:widowControl/>
+              <w:suppressAutoHyphens w:val="true"/>
               <w:spacing w:lineRule="auto" w:line="240" w:before="0" w:after="0"/>
               <w:jc w:val="start"/>
               <w:rPr>
@@ -1928,6 +1933,7 @@
             <w:pPr>
               <w:pStyle w:val="Normal"/>
               <w:widowControl/>
+              <w:suppressAutoHyphens w:val="true"/>
               <w:spacing w:lineRule="auto" w:line="240" w:before="0" w:after="0"/>
               <w:jc w:val="start"/>
               <w:rPr>
@@ -1959,6 +1965,7 @@
             <w:pPr>
               <w:pStyle w:val="Normal"/>
               <w:widowControl/>
+              <w:suppressAutoHyphens w:val="true"/>
               <w:spacing w:lineRule="auto" w:line="240" w:before="0" w:after="0"/>
               <w:jc w:val="start"/>
               <w:rPr>
@@ -1990,6 +1997,7 @@
             <w:pPr>
               <w:pStyle w:val="Normal"/>
               <w:widowControl/>
+              <w:suppressAutoHyphens w:val="true"/>
               <w:spacing w:lineRule="auto" w:line="240" w:before="0" w:after="0"/>
               <w:jc w:val="start"/>
               <w:rPr>
@@ -2021,6 +2029,7 @@
             <w:pPr>
               <w:pStyle w:val="Normal"/>
               <w:widowControl/>
+              <w:suppressAutoHyphens w:val="true"/>
               <w:spacing w:lineRule="auto" w:line="240" w:before="0" w:after="0"/>
               <w:jc w:val="start"/>
               <w:rPr>
@@ -2052,6 +2061,7 @@
             <w:pPr>
               <w:pStyle w:val="Normal"/>
               <w:widowControl/>
+              <w:suppressAutoHyphens w:val="true"/>
               <w:spacing w:lineRule="auto" w:line="240" w:before="0" w:after="0"/>
               <w:jc w:val="start"/>
               <w:rPr>
@@ -2096,6 +2106,7 @@
             <w:pPr>
               <w:pStyle w:val="Normal"/>
               <w:widowControl/>
+              <w:suppressAutoHyphens w:val="true"/>
               <w:spacing w:lineRule="auto" w:line="240" w:before="0" w:after="0"/>
               <w:jc w:val="start"/>
               <w:rPr>
@@ -2127,6 +2138,7 @@
             <w:pPr>
               <w:pStyle w:val="Normal"/>
               <w:widowControl/>
+              <w:suppressAutoHyphens w:val="true"/>
               <w:spacing w:lineRule="auto" w:line="240" w:before="0" w:after="0"/>
               <w:jc w:val="start"/>
               <w:rPr>
@@ -2158,6 +2170,7 @@
             <w:pPr>
               <w:pStyle w:val="Normal"/>
               <w:widowControl/>
+              <w:suppressAutoHyphens w:val="true"/>
               <w:spacing w:lineRule="auto" w:line="240" w:before="0" w:after="0"/>
               <w:jc w:val="start"/>
               <w:rPr>
@@ -2189,6 +2202,7 @@
             <w:pPr>
               <w:pStyle w:val="Normal"/>
               <w:widowControl/>
+              <w:suppressAutoHyphens w:val="true"/>
               <w:spacing w:lineRule="auto" w:line="240" w:before="0" w:after="0"/>
               <w:jc w:val="start"/>
               <w:rPr>
@@ -2220,6 +2234,7 @@
             <w:pPr>
               <w:pStyle w:val="Normal"/>
               <w:widowControl/>
+              <w:suppressAutoHyphens w:val="true"/>
               <w:spacing w:lineRule="auto" w:line="240" w:before="0" w:after="0"/>
               <w:jc w:val="start"/>
               <w:rPr>
@@ -2254,6 +2269,7 @@
             <w:pPr>
               <w:pStyle w:val="Normal"/>
               <w:widowControl/>
+              <w:suppressAutoHyphens w:val="true"/>
               <w:spacing w:lineRule="auto" w:line="240" w:before="0" w:after="0"/>
               <w:jc w:val="start"/>
               <w:rPr>
@@ -2285,6 +2301,7 @@
             <w:pPr>
               <w:pStyle w:val="Normal"/>
               <w:widowControl/>
+              <w:suppressAutoHyphens w:val="true"/>
               <w:spacing w:lineRule="auto" w:line="240" w:before="0" w:after="0"/>
               <w:jc w:val="start"/>
               <w:rPr>
@@ -2316,6 +2333,7 @@
             <w:pPr>
               <w:pStyle w:val="Normal"/>
               <w:widowControl/>
+              <w:suppressAutoHyphens w:val="true"/>
               <w:spacing w:lineRule="auto" w:line="240" w:before="0" w:after="0"/>
               <w:jc w:val="start"/>
               <w:rPr>
@@ -2347,6 +2365,7 @@
             <w:pPr>
               <w:pStyle w:val="Normal"/>
               <w:widowControl/>
+              <w:suppressAutoHyphens w:val="true"/>
               <w:spacing w:lineRule="auto" w:line="240" w:before="0" w:after="0"/>
               <w:jc w:val="start"/>
               <w:rPr>
@@ -2378,6 +2397,7 @@
             <w:pPr>
               <w:pStyle w:val="Normal"/>
               <w:widowControl/>
+              <w:suppressAutoHyphens w:val="true"/>
               <w:spacing w:lineRule="auto" w:line="240" w:before="0" w:after="0"/>
               <w:jc w:val="start"/>
               <w:rPr>
@@ -2413,7 +2433,12 @@
         </w:rPr>
       </w:pPr>
       <w:r>
-        <w:rPr/>
+        <w:rPr>
+          <w:rFonts w:ascii="Times New Roman" w:hAnsi="Times New Roman"/>
+          <w:b/>
+          <w:i w:val="false"/>
+          <w:sz w:val="24"/>
+        </w:rPr>
       </w:r>
     </w:p>
     <w:p>
@@ -2466,6 +2491,7 @@
             <w:pPr>
               <w:pStyle w:val="Normal"/>
               <w:widowControl/>
+              <w:suppressAutoHyphens w:val="true"/>
               <w:spacing w:lineRule="auto" w:line="240" w:before="0" w:after="0"/>
               <w:jc w:val="start"/>
               <w:rPr>
@@ -2498,6 +2524,7 @@
             <w:pPr>
               <w:pStyle w:val="Normal"/>
               <w:widowControl/>
+              <w:suppressAutoHyphens w:val="true"/>
               <w:spacing w:lineRule="auto" w:line="240" w:before="0" w:after="0"/>
               <w:jc w:val="start"/>
               <w:rPr>
@@ -2530,6 +2557,7 @@
             <w:pPr>
               <w:pStyle w:val="Normal"/>
               <w:widowControl/>
+              <w:suppressAutoHyphens w:val="true"/>
               <w:spacing w:lineRule="auto" w:line="240" w:before="0" w:after="0"/>
               <w:jc w:val="start"/>
               <w:rPr>
@@ -2562,6 +2590,7 @@
             <w:pPr>
               <w:pStyle w:val="Normal"/>
               <w:widowControl/>
+              <w:suppressAutoHyphens w:val="true"/>
               <w:spacing w:lineRule="auto" w:line="240" w:before="0" w:after="0"/>
               <w:jc w:val="start"/>
               <w:rPr>
@@ -2594,6 +2623,7 @@
             <w:pPr>
               <w:pStyle w:val="Normal"/>
               <w:widowControl/>
+              <w:suppressAutoHyphens w:val="true"/>
               <w:spacing w:lineRule="auto" w:line="240" w:before="0" w:after="0"/>
               <w:jc w:val="start"/>
               <w:rPr>
@@ -2629,6 +2659,7 @@
             <w:pPr>
               <w:pStyle w:val="Normal"/>
               <w:widowControl/>
+              <w:suppressAutoHyphens w:val="true"/>
               <w:spacing w:lineRule="auto" w:line="240" w:before="0" w:after="0"/>
               <w:jc w:val="start"/>
               <w:rPr>
@@ -2660,6 +2691,7 @@
             <w:pPr>
               <w:pStyle w:val="Normal"/>
               <w:widowControl/>
+              <w:suppressAutoHyphens w:val="true"/>
               <w:spacing w:lineRule="auto" w:line="240" w:before="0" w:after="0"/>
               <w:jc w:val="start"/>
               <w:rPr>
@@ -2691,6 +2723,7 @@
             <w:pPr>
               <w:pStyle w:val="Normal"/>
               <w:widowControl/>
+              <w:suppressAutoHyphens w:val="true"/>
               <w:spacing w:lineRule="auto" w:line="240" w:before="0" w:after="0"/>
               <w:jc w:val="start"/>
               <w:rPr>
@@ -2722,6 +2755,7 @@
             <w:pPr>
               <w:pStyle w:val="Normal"/>
               <w:widowControl/>
+              <w:suppressAutoHyphens w:val="true"/>
               <w:spacing w:lineRule="auto" w:line="240" w:before="0" w:after="0"/>
               <w:jc w:val="start"/>
               <w:rPr>
@@ -2753,6 +2787,7 @@
             <w:pPr>
               <w:pStyle w:val="Normal"/>
               <w:widowControl/>
+              <w:suppressAutoHyphens w:val="true"/>
               <w:spacing w:lineRule="auto" w:line="240" w:before="0" w:after="0"/>
               <w:jc w:val="start"/>
               <w:rPr>
@@ -2797,6 +2832,7 @@
             <w:pPr>
               <w:pStyle w:val="Normal"/>
               <w:widowControl/>
+              <w:suppressAutoHyphens w:val="true"/>
               <w:spacing w:lineRule="auto" w:line="240" w:before="0" w:after="0"/>
               <w:jc w:val="start"/>
               <w:rPr>
@@ -2828,6 +2864,7 @@
             <w:pPr>
               <w:pStyle w:val="Normal"/>
               <w:widowControl/>
+              <w:suppressAutoHyphens w:val="true"/>
               <w:spacing w:lineRule="auto" w:line="240" w:before="0" w:after="0"/>
               <w:jc w:val="start"/>
               <w:rPr>
@@ -2859,6 +2896,7 @@
             <w:pPr>
               <w:pStyle w:val="Normal"/>
               <w:widowControl/>
+              <w:suppressAutoHyphens w:val="true"/>
               <w:spacing w:lineRule="auto" w:line="240" w:before="0" w:after="0"/>
               <w:jc w:val="start"/>
               <w:rPr>
@@ -2890,6 +2928,7 @@
             <w:pPr>
               <w:pStyle w:val="Normal"/>
               <w:widowControl/>
+              <w:suppressAutoHyphens w:val="true"/>
               <w:spacing w:lineRule="auto" w:line="240" w:before="0" w:after="0"/>
               <w:jc w:val="start"/>
               <w:rPr>
@@ -2921,6 +2960,7 @@
             <w:pPr>
               <w:pStyle w:val="Normal"/>
               <w:widowControl/>
+              <w:suppressAutoHyphens w:val="true"/>
               <w:spacing w:lineRule="auto" w:line="240" w:before="0" w:after="0"/>
               <w:jc w:val="start"/>
               <w:rPr>
@@ -2955,6 +2995,7 @@
             <w:pPr>
               <w:pStyle w:val="Normal"/>
               <w:widowControl/>
+              <w:suppressAutoHyphens w:val="true"/>
               <w:spacing w:lineRule="auto" w:line="240" w:before="0" w:after="0"/>
               <w:jc w:val="start"/>
               <w:rPr>
@@ -2986,6 +3027,7 @@
             <w:pPr>
               <w:pStyle w:val="Normal"/>
               <w:widowControl/>
+              <w:suppressAutoHyphens w:val="true"/>
               <w:spacing w:lineRule="auto" w:line="240" w:before="0" w:after="0"/>
               <w:jc w:val="start"/>
               <w:rPr>
@@ -3017,6 +3059,7 @@
             <w:pPr>
               <w:pStyle w:val="Normal"/>
               <w:widowControl/>
+              <w:suppressAutoHyphens w:val="true"/>
               <w:spacing w:lineRule="auto" w:line="240" w:before="0" w:after="0"/>
               <w:jc w:val="start"/>
               <w:rPr>
@@ -3048,6 +3091,7 @@
             <w:pPr>
               <w:pStyle w:val="Normal"/>
               <w:widowControl/>
+              <w:suppressAutoHyphens w:val="true"/>
               <w:spacing w:lineRule="auto" w:line="240" w:before="0" w:after="0"/>
               <w:jc w:val="start"/>
               <w:rPr>
@@ -3079,6 +3123,7 @@
             <w:pPr>
               <w:pStyle w:val="Normal"/>
               <w:widowControl/>
+              <w:suppressAutoHyphens w:val="true"/>
               <w:spacing w:lineRule="auto" w:line="240" w:before="0" w:after="0"/>
               <w:jc w:val="start"/>
               <w:rPr>
@@ -3114,7 +3159,12 @@
         </w:rPr>
       </w:pPr>
       <w:r>
-        <w:rPr/>
+        <w:rPr>
+          <w:rFonts w:ascii="Times New Roman" w:hAnsi="Times New Roman"/>
+          <w:b/>
+          <w:i w:val="false"/>
+          <w:sz w:val="24"/>
+        </w:rPr>
       </w:r>
     </w:p>
     <w:p>
@@ -3193,6 +3243,7 @@
             <w:pPr>
               <w:pStyle w:val="Normal"/>
               <w:widowControl/>
+              <w:suppressAutoHyphens w:val="true"/>
               <w:spacing w:lineRule="auto" w:line="240" w:before="0" w:after="0"/>
               <w:jc w:val="start"/>
               <w:rPr>
@@ -3225,6 +3276,7 @@
             <w:pPr>
               <w:pStyle w:val="Normal"/>
               <w:widowControl/>
+              <w:suppressAutoHyphens w:val="true"/>
               <w:spacing w:lineRule="auto" w:line="240" w:before="0" w:after="0"/>
               <w:jc w:val="start"/>
               <w:rPr>
@@ -3257,6 +3309,7 @@
             <w:pPr>
               <w:pStyle w:val="Normal"/>
               <w:widowControl/>
+              <w:suppressAutoHyphens w:val="true"/>
               <w:spacing w:lineRule="auto" w:line="240" w:before="0" w:after="0"/>
               <w:jc w:val="start"/>
               <w:rPr>
@@ -3289,6 +3342,7 @@
             <w:pPr>
               <w:pStyle w:val="Normal"/>
               <w:widowControl/>
+              <w:suppressAutoHyphens w:val="true"/>
               <w:spacing w:lineRule="auto" w:line="240" w:before="0" w:after="0"/>
               <w:jc w:val="start"/>
               <w:rPr>
@@ -3321,6 +3375,7 @@
             <w:pPr>
               <w:pStyle w:val="Normal"/>
               <w:widowControl/>
+              <w:suppressAutoHyphens w:val="true"/>
               <w:spacing w:lineRule="auto" w:line="240" w:before="0" w:after="0"/>
               <w:jc w:val="start"/>
               <w:rPr>
@@ -3356,6 +3411,7 @@
             <w:pPr>
               <w:pStyle w:val="Normal"/>
               <w:widowControl/>
+              <w:suppressAutoHyphens w:val="true"/>
               <w:spacing w:lineRule="auto" w:line="240" w:before="0" w:after="0"/>
               <w:jc w:val="start"/>
               <w:rPr>
@@ -3387,6 +3443,7 @@
             <w:pPr>
               <w:pStyle w:val="Normal"/>
               <w:widowControl/>
+              <w:suppressAutoHyphens w:val="true"/>
               <w:spacing w:lineRule="auto" w:line="240" w:before="0" w:after="0"/>
               <w:jc w:val="start"/>
               <w:rPr>
@@ -3418,6 +3475,7 @@
             <w:pPr>
               <w:pStyle w:val="Normal"/>
               <w:widowControl/>
+              <w:suppressAutoHyphens w:val="true"/>
               <w:spacing w:lineRule="auto" w:line="240" w:before="0" w:after="0"/>
               <w:jc w:val="start"/>
               <w:rPr>
@@ -3449,6 +3507,7 @@
             <w:pPr>
               <w:pStyle w:val="Normal"/>
               <w:widowControl/>
+              <w:suppressAutoHyphens w:val="true"/>
               <w:spacing w:lineRule="auto" w:line="240" w:before="0" w:after="0"/>
               <w:jc w:val="start"/>
               <w:rPr>
@@ -3480,6 +3539,7 @@
             <w:pPr>
               <w:pStyle w:val="Normal"/>
               <w:widowControl/>
+              <w:suppressAutoHyphens w:val="true"/>
               <w:spacing w:lineRule="auto" w:line="240" w:before="0" w:after="0"/>
               <w:jc w:val="start"/>
               <w:rPr>
@@ -3524,6 +3584,7 @@
             <w:pPr>
               <w:pStyle w:val="Normal"/>
               <w:widowControl/>
+              <w:suppressAutoHyphens w:val="true"/>
               <w:spacing w:lineRule="auto" w:line="240" w:before="0" w:after="0"/>
               <w:jc w:val="start"/>
               <w:rPr>
@@ -3555,6 +3616,7 @@
             <w:pPr>
               <w:pStyle w:val="Normal"/>
               <w:widowControl/>
+              <w:suppressAutoHyphens w:val="true"/>
               <w:spacing w:lineRule="auto" w:line="240" w:before="0" w:after="0"/>
               <w:jc w:val="start"/>
               <w:rPr>
@@ -3586,6 +3648,7 @@
             <w:pPr>
               <w:pStyle w:val="Normal"/>
               <w:widowControl/>
+              <w:suppressAutoHyphens w:val="true"/>
               <w:spacing w:lineRule="auto" w:line="240" w:before="0" w:after="0"/>
               <w:jc w:val="start"/>
               <w:rPr>
@@ -3617,6 +3680,7 @@
             <w:pPr>
               <w:pStyle w:val="Normal"/>
               <w:widowControl/>
+              <w:suppressAutoHyphens w:val="true"/>
               <w:spacing w:lineRule="auto" w:line="240" w:before="0" w:after="0"/>
               <w:jc w:val="start"/>
               <w:rPr>
@@ -3648,6 +3712,7 @@
             <w:pPr>
               <w:pStyle w:val="Normal"/>
               <w:widowControl/>
+              <w:suppressAutoHyphens w:val="true"/>
               <w:spacing w:lineRule="auto" w:line="240" w:before="0" w:after="0"/>
               <w:jc w:val="start"/>
               <w:rPr>
@@ -3682,6 +3747,7 @@
             <w:pPr>
               <w:pStyle w:val="Normal"/>
               <w:widowControl/>
+              <w:suppressAutoHyphens w:val="true"/>
               <w:spacing w:lineRule="auto" w:line="240" w:before="0" w:after="0"/>
               <w:jc w:val="start"/>
               <w:rPr>
@@ -3713,6 +3779,7 @@
             <w:pPr>
               <w:pStyle w:val="Normal"/>
               <w:widowControl/>
+              <w:suppressAutoHyphens w:val="true"/>
               <w:spacing w:lineRule="auto" w:line="240" w:before="0" w:after="0"/>
               <w:jc w:val="start"/>
               <w:rPr>
@@ -3744,6 +3811,7 @@
             <w:pPr>
               <w:pStyle w:val="Normal"/>
               <w:widowControl/>
+              <w:suppressAutoHyphens w:val="true"/>
               <w:spacing w:lineRule="auto" w:line="240" w:before="0" w:after="0"/>
               <w:jc w:val="start"/>
               <w:rPr>
@@ -3775,6 +3843,7 @@
             <w:pPr>
               <w:pStyle w:val="Normal"/>
               <w:widowControl/>
+              <w:suppressAutoHyphens w:val="true"/>
               <w:spacing w:lineRule="auto" w:line="240" w:before="0" w:after="0"/>
               <w:jc w:val="start"/>
               <w:rPr>
@@ -3806,6 +3875,7 @@
             <w:pPr>
               <w:pStyle w:val="Normal"/>
               <w:widowControl/>
+              <w:suppressAutoHyphens w:val="true"/>
               <w:spacing w:lineRule="auto" w:line="240" w:before="0" w:after="0"/>
               <w:jc w:val="start"/>
               <w:rPr>
@@ -4010,6 +4080,7 @@
             <w:pPr>
               <w:pStyle w:val="Normal"/>
               <w:widowControl/>
+              <w:suppressAutoHyphens w:val="true"/>
               <w:spacing w:lineRule="auto" w:line="240" w:before="0" w:after="0"/>
               <w:jc w:val="start"/>
               <w:rPr>
@@ -4042,6 +4113,7 @@
             <w:pPr>
               <w:pStyle w:val="Normal"/>
               <w:widowControl/>
+              <w:suppressAutoHyphens w:val="true"/>
               <w:spacing w:lineRule="auto" w:line="240" w:before="0" w:after="0"/>
               <w:jc w:val="start"/>
               <w:rPr>
@@ -4077,6 +4149,7 @@
             <w:pPr>
               <w:pStyle w:val="Normal"/>
               <w:widowControl/>
+              <w:suppressAutoHyphens w:val="true"/>
               <w:spacing w:lineRule="auto" w:line="240" w:before="0" w:after="0"/>
               <w:jc w:val="start"/>
               <w:rPr>
@@ -4108,6 +4181,7 @@
             <w:pPr>
               <w:pStyle w:val="Normal"/>
               <w:widowControl/>
+              <w:suppressAutoHyphens w:val="true"/>
               <w:spacing w:lineRule="auto" w:line="240" w:before="0" w:after="0"/>
               <w:jc w:val="start"/>
               <w:rPr>
@@ -4142,6 +4216,7 @@
             <w:pPr>
               <w:pStyle w:val="Normal"/>
               <w:widowControl/>
+              <w:suppressAutoHyphens w:val="true"/>
               <w:spacing w:lineRule="auto" w:line="240" w:before="0" w:after="0"/>
               <w:jc w:val="start"/>
               <w:rPr>
@@ -4173,6 +4248,7 @@
             <w:pPr>
               <w:pStyle w:val="Normal"/>
               <w:widowControl/>
+              <w:suppressAutoHyphens w:val="true"/>
               <w:spacing w:lineRule="auto" w:line="240" w:before="0" w:after="0"/>
               <w:jc w:val="start"/>
               <w:rPr>
@@ -4207,6 +4283,7 @@
             <w:pPr>
               <w:pStyle w:val="Normal"/>
               <w:widowControl/>
+              <w:suppressAutoHyphens w:val="true"/>
               <w:spacing w:lineRule="auto" w:line="240" w:before="0" w:after="0"/>
               <w:jc w:val="start"/>
               <w:rPr>
@@ -4238,6 +4315,7 @@
             <w:pPr>
               <w:pStyle w:val="Normal"/>
               <w:widowControl/>
+              <w:suppressAutoHyphens w:val="true"/>
               <w:spacing w:lineRule="auto" w:line="240" w:before="0" w:after="0"/>
               <w:jc w:val="start"/>
               <w:rPr>
@@ -4272,6 +4350,7 @@
             <w:pPr>
               <w:pStyle w:val="Normal"/>
               <w:widowControl/>
+              <w:suppressAutoHyphens w:val="true"/>
               <w:spacing w:lineRule="auto" w:line="240" w:before="0" w:after="0"/>
               <w:jc w:val="start"/>
               <w:rPr>
@@ -4303,6 +4382,7 @@
             <w:pPr>
               <w:pStyle w:val="Normal"/>
               <w:widowControl/>
+              <w:suppressAutoHyphens w:val="true"/>
               <w:spacing w:lineRule="auto" w:line="240" w:before="0" w:after="0"/>
               <w:jc w:val="start"/>
               <w:rPr>
@@ -4337,6 +4417,7 @@
             <w:pPr>
               <w:pStyle w:val="Normal"/>
               <w:widowControl/>
+              <w:suppressAutoHyphens w:val="true"/>
               <w:spacing w:lineRule="auto" w:line="240" w:before="0" w:after="0"/>
               <w:jc w:val="start"/>
               <w:rPr>
@@ -4368,6 +4449,7 @@
             <w:pPr>
               <w:pStyle w:val="Normal"/>
               <w:widowControl/>
+              <w:suppressAutoHyphens w:val="true"/>
               <w:spacing w:lineRule="auto" w:line="240" w:before="0" w:after="0"/>
               <w:jc w:val="start"/>
               <w:rPr>
@@ -4402,6 +4484,7 @@
             <w:pPr>
               <w:pStyle w:val="Normal"/>
               <w:widowControl/>
+              <w:suppressAutoHyphens w:val="true"/>
               <w:spacing w:lineRule="auto" w:line="240" w:before="0" w:after="0"/>
               <w:jc w:val="start"/>
               <w:rPr>
@@ -4433,6 +4516,7 @@
             <w:pPr>
               <w:pStyle w:val="Normal"/>
               <w:widowControl/>
+              <w:suppressAutoHyphens w:val="true"/>
               <w:spacing w:lineRule="auto" w:line="240" w:before="0" w:after="0"/>
               <w:jc w:val="start"/>
               <w:rPr>
@@ -4467,6 +4551,7 @@
             <w:pPr>
               <w:pStyle w:val="Normal"/>
               <w:widowControl/>
+              <w:suppressAutoHyphens w:val="true"/>
               <w:spacing w:lineRule="auto" w:line="240" w:before="0" w:after="0"/>
               <w:jc w:val="start"/>
               <w:rPr>
@@ -4498,6 +4583,7 @@
             <w:pPr>
               <w:pStyle w:val="Normal"/>
               <w:widowControl/>
+              <w:suppressAutoHyphens w:val="true"/>
               <w:spacing w:lineRule="auto" w:line="240" w:before="0" w:after="0"/>
               <w:jc w:val="start"/>
               <w:rPr>
@@ -4532,6 +4618,7 @@
             <w:pPr>
               <w:pStyle w:val="Normal"/>
               <w:widowControl/>
+              <w:suppressAutoHyphens w:val="true"/>
               <w:spacing w:lineRule="auto" w:line="240" w:before="0" w:after="0"/>
               <w:jc w:val="start"/>
               <w:rPr>
@@ -4563,6 +4650,7 @@
             <w:pPr>
               <w:pStyle w:val="Normal"/>
               <w:widowControl/>
+              <w:suppressAutoHyphens w:val="true"/>
               <w:spacing w:lineRule="auto" w:line="240" w:before="0" w:after="0"/>
               <w:jc w:val="start"/>
               <w:rPr>
@@ -4597,6 +4685,7 @@
             <w:pPr>
               <w:pStyle w:val="Normal"/>
               <w:widowControl/>
+              <w:suppressAutoHyphens w:val="true"/>
               <w:spacing w:lineRule="auto" w:line="240" w:before="0" w:after="0"/>
               <w:jc w:val="start"/>
               <w:rPr>
@@ -4628,6 +4717,7 @@
             <w:pPr>
               <w:pStyle w:val="Normal"/>
               <w:widowControl/>
+              <w:suppressAutoHyphens w:val="true"/>
               <w:spacing w:lineRule="auto" w:line="240" w:before="0" w:after="0"/>
               <w:jc w:val="start"/>
               <w:rPr>
@@ -4662,6 +4752,7 @@
             <w:pPr>
               <w:pStyle w:val="Normal"/>
               <w:widowControl/>
+              <w:suppressAutoHyphens w:val="true"/>
               <w:spacing w:lineRule="auto" w:line="240" w:before="0" w:after="0"/>
               <w:jc w:val="start"/>
               <w:rPr>
@@ -4693,6 +4784,7 @@
             <w:pPr>
               <w:pStyle w:val="Normal"/>
               <w:widowControl/>
+              <w:suppressAutoHyphens w:val="true"/>
               <w:spacing w:lineRule="auto" w:line="240" w:before="0" w:after="0"/>
               <w:jc w:val="start"/>
               <w:rPr>
@@ -4728,7 +4820,12 @@
         </w:rPr>
       </w:pPr>
       <w:r>
-        <w:rPr/>
+        <w:rPr>
+          <w:rFonts w:ascii="Times New Roman" w:hAnsi="Times New Roman"/>
+          <w:b/>
+          <w:i w:val="false"/>
+          <w:sz w:val="24"/>
+        </w:rPr>
       </w:r>
     </w:p>
     <w:p>
@@ -4779,6 +4876,7 @@
             <w:pPr>
               <w:pStyle w:val="Normal"/>
               <w:widowControl/>
+              <w:suppressAutoHyphens w:val="true"/>
               <w:spacing w:lineRule="auto" w:line="240" w:before="0" w:after="0"/>
               <w:jc w:val="start"/>
               <w:rPr>
@@ -4811,6 +4909,7 @@
             <w:pPr>
               <w:pStyle w:val="Normal"/>
               <w:widowControl/>
+              <w:suppressAutoHyphens w:val="true"/>
               <w:spacing w:lineRule="auto" w:line="240" w:before="0" w:after="0"/>
               <w:jc w:val="start"/>
               <w:rPr>
@@ -4843,6 +4942,7 @@
             <w:pPr>
               <w:pStyle w:val="Normal"/>
               <w:widowControl/>
+              <w:suppressAutoHyphens w:val="true"/>
               <w:spacing w:lineRule="auto" w:line="240" w:before="0" w:after="0"/>
               <w:jc w:val="start"/>
               <w:rPr>
@@ -4878,6 +4978,7 @@
             <w:pPr>
               <w:pStyle w:val="Normal"/>
               <w:widowControl/>
+              <w:suppressAutoHyphens w:val="true"/>
               <w:spacing w:lineRule="auto" w:line="240" w:before="0" w:after="0"/>
               <w:jc w:val="start"/>
               <w:rPr>
@@ -4909,6 +5010,7 @@
             <w:pPr>
               <w:pStyle w:val="Normal"/>
               <w:widowControl/>
+              <w:suppressAutoHyphens w:val="true"/>
               <w:spacing w:lineRule="auto" w:line="240" w:before="0" w:after="0"/>
               <w:jc w:val="start"/>
               <w:rPr>
@@ -4940,6 +5042,7 @@
             <w:pPr>
               <w:pStyle w:val="Normal"/>
               <w:widowControl/>
+              <w:suppressAutoHyphens w:val="true"/>
               <w:spacing w:lineRule="auto" w:line="240" w:before="0" w:after="0"/>
               <w:jc w:val="start"/>
               <w:rPr>
@@ -4984,6 +5087,7 @@
             <w:pPr>
               <w:pStyle w:val="Normal"/>
               <w:widowControl/>
+              <w:suppressAutoHyphens w:val="true"/>
               <w:spacing w:lineRule="auto" w:line="240" w:before="0" w:after="0"/>
               <w:jc w:val="start"/>
               <w:rPr>
@@ -5015,6 +5119,7 @@
             <w:pPr>
               <w:pStyle w:val="Normal"/>
               <w:widowControl/>
+              <w:suppressAutoHyphens w:val="true"/>
               <w:spacing w:lineRule="auto" w:line="240" w:before="0" w:after="0"/>
               <w:jc w:val="start"/>
               <w:rPr>
@@ -5046,6 +5151,7 @@
             <w:pPr>
               <w:pStyle w:val="Normal"/>
               <w:widowControl/>
+              <w:suppressAutoHyphens w:val="true"/>
               <w:spacing w:lineRule="auto" w:line="240" w:before="0" w:after="0"/>
               <w:jc w:val="start"/>
               <w:rPr>
@@ -5090,6 +5196,7 @@
             <w:pPr>
               <w:pStyle w:val="Normal"/>
               <w:widowControl/>
+              <w:suppressAutoHyphens w:val="true"/>
               <w:spacing w:lineRule="auto" w:line="240" w:before="0" w:after="0"/>
               <w:jc w:val="start"/>
               <w:rPr>
@@ -5121,6 +5228,7 @@
             <w:pPr>
               <w:pStyle w:val="Normal"/>
               <w:widowControl/>
+              <w:suppressAutoHyphens w:val="true"/>
               <w:spacing w:lineRule="auto" w:line="240" w:before="0" w:after="0"/>
               <w:jc w:val="start"/>
               <w:rPr>
@@ -5152,6 +5260,7 @@
             <w:pPr>
               <w:pStyle w:val="Normal"/>
               <w:widowControl/>
+              <w:suppressAutoHyphens w:val="true"/>
               <w:spacing w:lineRule="auto" w:line="240" w:before="0" w:after="0"/>
               <w:jc w:val="start"/>
               <w:rPr>
@@ -5186,6 +5295,7 @@
             <w:pPr>
               <w:pStyle w:val="Normal"/>
               <w:widowControl/>
+              <w:suppressAutoHyphens w:val="true"/>
               <w:spacing w:lineRule="auto" w:line="240" w:before="0" w:after="0"/>
               <w:jc w:val="start"/>
               <w:rPr>
@@ -5217,6 +5327,7 @@
             <w:pPr>
               <w:pStyle w:val="Normal"/>
               <w:widowControl/>
+              <w:suppressAutoHyphens w:val="true"/>
               <w:spacing w:lineRule="auto" w:line="240" w:before="0" w:after="0"/>
               <w:jc w:val="start"/>
               <w:rPr>
@@ -5248,6 +5359,7 @@
             <w:pPr>
               <w:pStyle w:val="Normal"/>
               <w:widowControl/>
+              <w:suppressAutoHyphens w:val="true"/>
               <w:spacing w:lineRule="auto" w:line="240" w:before="0" w:after="0"/>
               <w:jc w:val="start"/>
               <w:rPr>
@@ -5292,6 +5404,7 @@
             <w:pPr>
               <w:pStyle w:val="Normal"/>
               <w:widowControl/>
+              <w:suppressAutoHyphens w:val="true"/>
               <w:spacing w:lineRule="auto" w:line="240" w:before="0" w:after="0"/>
               <w:jc w:val="start"/>
               <w:rPr>
@@ -5323,6 +5436,7 @@
             <w:pPr>
               <w:pStyle w:val="Normal"/>
               <w:widowControl/>
+              <w:suppressAutoHyphens w:val="true"/>
               <w:spacing w:lineRule="auto" w:line="240" w:before="0" w:after="0"/>
               <w:jc w:val="start"/>
               <w:rPr>
@@ -5354,6 +5468,7 @@
             <w:pPr>
               <w:pStyle w:val="Normal"/>
               <w:widowControl/>
+              <w:suppressAutoHyphens w:val="true"/>
               <w:spacing w:lineRule="auto" w:line="240" w:before="0" w:after="0"/>
               <w:jc w:val="start"/>
               <w:rPr>
@@ -5388,6 +5503,7 @@
             <w:pPr>
               <w:pStyle w:val="Normal"/>
               <w:widowControl/>
+              <w:suppressAutoHyphens w:val="true"/>
               <w:spacing w:lineRule="auto" w:line="240" w:before="0" w:after="0"/>
               <w:jc w:val="start"/>
               <w:rPr>
@@ -5419,6 +5535,7 @@
             <w:pPr>
               <w:pStyle w:val="Normal"/>
               <w:widowControl/>
+              <w:suppressAutoHyphens w:val="true"/>
               <w:spacing w:lineRule="auto" w:line="240" w:before="0" w:after="0"/>
               <w:jc w:val="start"/>
               <w:rPr>
@@ -5450,6 +5567,7 @@
             <w:pPr>
               <w:pStyle w:val="Normal"/>
               <w:widowControl/>
+              <w:suppressAutoHyphens w:val="true"/>
               <w:spacing w:lineRule="auto" w:line="240" w:before="0" w:after="0"/>
               <w:jc w:val="start"/>
               <w:rPr>
@@ -5655,7 +5773,7 @@
           <w:i w:val="false"/>
           <w:sz w:val="24"/>
         </w:rPr>
-        <w:t>ADR-002: Выбор фреймворка потоковой обработки. Выбран Apache Flink 1.19 [1] вместо Spark Structured Streaming [5] и Kafka Streams. Ключевые аргументы: KeyedProcessFunction с hashmap state backend (прототип; RocksDB — production-расширение) позволяет хранить состояние per payment_id; нативная поддержка event-time watermarks [4] для корректной обработки out-of-order событий; алгоритм ABS [2] обеспечивает неблокирующие checkpoint без паузы потока.</w:t>
+        <w:t>ADR-002: Выбор фреймворка потоковой обработки. Выбран Apache Flink 1.19 [1] вместо Spark Structured Streaming [5] и Kafka Streams. Ключевые аргументы: KeyedProcessFunction с hashmap state backend (прототип; RocksDB — production-расширение) позволяет хранить состояние per payment_id; нативная поддержка event-time watermarks [4] для корректной обработки out-of-order событий</w:t>
       </w:r>
     </w:p>
     <w:p>
@@ -5795,6 +5913,7 @@
             <w:pPr>
               <w:pStyle w:val="Normal"/>
               <w:widowControl/>
+              <w:suppressAutoHyphens w:val="true"/>
               <w:spacing w:lineRule="auto" w:line="240" w:before="0" w:after="0"/>
               <w:jc w:val="start"/>
               <w:rPr>
@@ -5827,6 +5946,7 @@
             <w:pPr>
               <w:pStyle w:val="Normal"/>
               <w:widowControl/>
+              <w:suppressAutoHyphens w:val="true"/>
               <w:spacing w:lineRule="auto" w:line="240" w:before="0" w:after="0"/>
               <w:jc w:val="start"/>
               <w:rPr>
@@ -5859,6 +5979,7 @@
             <w:pPr>
               <w:pStyle w:val="Normal"/>
               <w:widowControl/>
+              <w:suppressAutoHyphens w:val="true"/>
               <w:spacing w:lineRule="auto" w:line="240" w:before="0" w:after="0"/>
               <w:jc w:val="start"/>
               <w:rPr>
@@ -5891,6 +6012,7 @@
             <w:pPr>
               <w:pStyle w:val="Normal"/>
               <w:widowControl/>
+              <w:suppressAutoHyphens w:val="true"/>
               <w:spacing w:lineRule="auto" w:line="240" w:before="0" w:after="0"/>
               <w:jc w:val="start"/>
               <w:rPr>
@@ -5926,6 +6048,7 @@
             <w:pPr>
               <w:pStyle w:val="Normal"/>
               <w:widowControl/>
+              <w:suppressAutoHyphens w:val="true"/>
               <w:spacing w:lineRule="auto" w:line="240" w:before="0" w:after="0"/>
               <w:jc w:val="start"/>
               <w:rPr>
@@ -5957,6 +6080,7 @@
             <w:pPr>
               <w:pStyle w:val="Normal"/>
               <w:widowControl/>
+              <w:suppressAutoHyphens w:val="true"/>
               <w:spacing w:lineRule="auto" w:line="240" w:before="0" w:after="0"/>
               <w:jc w:val="start"/>
               <w:rPr>
@@ -5988,6 +6112,7 @@
             <w:pPr>
               <w:pStyle w:val="Normal"/>
               <w:widowControl/>
+              <w:suppressAutoHyphens w:val="true"/>
               <w:spacing w:lineRule="auto" w:line="240" w:before="0" w:after="0"/>
               <w:jc w:val="start"/>
               <w:rPr>
@@ -6019,6 +6144,7 @@
             <w:pPr>
               <w:pStyle w:val="Normal"/>
               <w:widowControl/>
+              <w:suppressAutoHyphens w:val="true"/>
               <w:spacing w:lineRule="auto" w:line="240" w:before="0" w:after="0"/>
               <w:jc w:val="start"/>
               <w:rPr>
@@ -6053,6 +6179,7 @@
             <w:pPr>
               <w:pStyle w:val="Normal"/>
               <w:widowControl/>
+              <w:suppressAutoHyphens w:val="true"/>
               <w:spacing w:lineRule="auto" w:line="240" w:before="0" w:after="0"/>
               <w:jc w:val="start"/>
               <w:rPr>
@@ -6084,6 +6211,7 @@
             <w:pPr>
               <w:pStyle w:val="Normal"/>
               <w:widowControl/>
+              <w:suppressAutoHyphens w:val="true"/>
               <w:spacing w:lineRule="auto" w:line="240" w:before="0" w:after="0"/>
               <w:jc w:val="start"/>
               <w:rPr>
@@ -6115,6 +6243,7 @@
             <w:pPr>
               <w:pStyle w:val="Normal"/>
               <w:widowControl/>
+              <w:suppressAutoHyphens w:val="true"/>
               <w:spacing w:lineRule="auto" w:line="240" w:before="0" w:after="0"/>
               <w:jc w:val="start"/>
               <w:rPr>
@@ -6146,6 +6275,7 @@
             <w:pPr>
               <w:pStyle w:val="Normal"/>
               <w:widowControl/>
+              <w:suppressAutoHyphens w:val="true"/>
               <w:spacing w:lineRule="auto" w:line="240" w:before="0" w:after="0"/>
               <w:jc w:val="start"/>
               <w:rPr>
@@ -6180,6 +6310,7 @@
             <w:pPr>
               <w:pStyle w:val="Normal"/>
               <w:widowControl/>
+              <w:suppressAutoHyphens w:val="true"/>
               <w:spacing w:lineRule="auto" w:line="240" w:before="0" w:after="0"/>
               <w:jc w:val="start"/>
               <w:rPr>
@@ -6211,6 +6342,7 @@
             <w:pPr>
               <w:pStyle w:val="Normal"/>
               <w:widowControl/>
+              <w:suppressAutoHyphens w:val="true"/>
               <w:spacing w:lineRule="auto" w:line="240" w:before="0" w:after="0"/>
               <w:jc w:val="start"/>
               <w:rPr>
@@ -6242,6 +6374,7 @@
             <w:pPr>
               <w:pStyle w:val="Normal"/>
               <w:widowControl/>
+              <w:suppressAutoHyphens w:val="true"/>
               <w:spacing w:lineRule="auto" w:line="240" w:before="0" w:after="0"/>
               <w:jc w:val="start"/>
               <w:rPr>
@@ -6273,6 +6406,7 @@
             <w:pPr>
               <w:pStyle w:val="Normal"/>
               <w:widowControl/>
+              <w:suppressAutoHyphens w:val="true"/>
               <w:spacing w:lineRule="auto" w:line="240" w:before="0" w:after="0"/>
               <w:jc w:val="start"/>
               <w:rPr>
@@ -6307,6 +6441,7 @@
             <w:pPr>
               <w:pStyle w:val="Normal"/>
               <w:widowControl/>
+              <w:suppressAutoHyphens w:val="true"/>
               <w:spacing w:lineRule="auto" w:line="240" w:before="0" w:after="0"/>
               <w:jc w:val="start"/>
               <w:rPr>
@@ -6338,6 +6473,7 @@
             <w:pPr>
               <w:pStyle w:val="Normal"/>
               <w:widowControl/>
+              <w:suppressAutoHyphens w:val="true"/>
               <w:spacing w:lineRule="auto" w:line="240" w:before="0" w:after="0"/>
               <w:jc w:val="start"/>
               <w:rPr>
@@ -6369,6 +6505,7 @@
             <w:pPr>
               <w:pStyle w:val="Normal"/>
               <w:widowControl/>
+              <w:suppressAutoHyphens w:val="true"/>
               <w:spacing w:lineRule="auto" w:line="240" w:before="0" w:after="0"/>
               <w:jc w:val="start"/>
               <w:rPr>
@@ -6400,6 +6537,7 @@
             <w:pPr>
               <w:pStyle w:val="Normal"/>
               <w:widowControl/>
+              <w:suppressAutoHyphens w:val="true"/>
               <w:spacing w:lineRule="auto" w:line="240" w:before="0" w:after="0"/>
               <w:jc w:val="start"/>
               <w:rPr>
@@ -6506,6 +6644,7 @@
             <w:pPr>
               <w:pStyle w:val="Normal"/>
               <w:widowControl/>
+              <w:suppressAutoHyphens w:val="true"/>
               <w:spacing w:lineRule="auto" w:line="240" w:before="0" w:after="0"/>
               <w:jc w:val="start"/>
               <w:rPr>
@@ -6538,6 +6677,7 @@
             <w:pPr>
               <w:pStyle w:val="Normal"/>
               <w:widowControl/>
+              <w:suppressAutoHyphens w:val="true"/>
               <w:spacing w:lineRule="auto" w:line="240" w:before="0" w:after="0"/>
               <w:jc w:val="start"/>
               <w:rPr>
@@ -6570,6 +6710,7 @@
             <w:pPr>
               <w:pStyle w:val="Normal"/>
               <w:widowControl/>
+              <w:suppressAutoHyphens w:val="true"/>
               <w:spacing w:lineRule="auto" w:line="240" w:before="0" w:after="0"/>
               <w:jc w:val="start"/>
               <w:rPr>
@@ -6605,6 +6746,7 @@
             <w:pPr>
               <w:pStyle w:val="Normal"/>
               <w:widowControl/>
+              <w:suppressAutoHyphens w:val="true"/>
               <w:spacing w:lineRule="auto" w:line="240" w:before="0" w:after="0"/>
               <w:jc w:val="start"/>
               <w:rPr>
@@ -6636,6 +6778,7 @@
             <w:pPr>
               <w:pStyle w:val="Normal"/>
               <w:widowControl/>
+              <w:suppressAutoHyphens w:val="true"/>
               <w:spacing w:lineRule="auto" w:line="240" w:before="0" w:after="0"/>
               <w:jc w:val="start"/>
               <w:rPr>
@@ -6667,6 +6810,7 @@
             <w:pPr>
               <w:pStyle w:val="Normal"/>
               <w:widowControl/>
+              <w:suppressAutoHyphens w:val="true"/>
               <w:spacing w:lineRule="auto" w:line="240" w:before="0" w:after="0"/>
               <w:jc w:val="start"/>
               <w:rPr>
@@ -6701,6 +6845,7 @@
             <w:pPr>
               <w:pStyle w:val="Normal"/>
               <w:widowControl/>
+              <w:suppressAutoHyphens w:val="true"/>
               <w:spacing w:lineRule="auto" w:line="240" w:before="0" w:after="0"/>
               <w:jc w:val="start"/>
               <w:rPr>
@@ -6732,6 +6877,7 @@
             <w:pPr>
               <w:pStyle w:val="Normal"/>
               <w:widowControl/>
+              <w:suppressAutoHyphens w:val="true"/>
               <w:spacing w:lineRule="auto" w:line="240" w:before="0" w:after="0"/>
               <w:jc w:val="start"/>
               <w:rPr>
@@ -6763,6 +6909,7 @@
             <w:pPr>
               <w:pStyle w:val="Normal"/>
               <w:widowControl/>
+              <w:suppressAutoHyphens w:val="true"/>
               <w:spacing w:lineRule="auto" w:line="240" w:before="0" w:after="0"/>
               <w:jc w:val="start"/>
               <w:rPr>
@@ -6797,6 +6944,7 @@
             <w:pPr>
               <w:pStyle w:val="Normal"/>
               <w:widowControl/>
+              <w:suppressAutoHyphens w:val="true"/>
               <w:spacing w:lineRule="auto" w:line="240" w:before="0" w:after="0"/>
               <w:jc w:val="start"/>
               <w:rPr>
@@ -6828,6 +6976,7 @@
             <w:pPr>
               <w:pStyle w:val="Normal"/>
               <w:widowControl/>
+              <w:suppressAutoHyphens w:val="true"/>
               <w:spacing w:lineRule="auto" w:line="240" w:before="0" w:after="0"/>
               <w:jc w:val="start"/>
               <w:rPr>
@@ -6859,6 +7008,7 @@
             <w:pPr>
               <w:pStyle w:val="Normal"/>
               <w:widowControl/>
+              <w:suppressAutoHyphens w:val="true"/>
               <w:spacing w:lineRule="auto" w:line="240" w:before="0" w:after="0"/>
               <w:jc w:val="start"/>
               <w:rPr>
@@ -6893,6 +7043,7 @@
             <w:pPr>
               <w:pStyle w:val="Normal"/>
               <w:widowControl/>
+              <w:suppressAutoHyphens w:val="true"/>
               <w:spacing w:lineRule="auto" w:line="240" w:before="0" w:after="0"/>
               <w:jc w:val="start"/>
               <w:rPr>
@@ -6924,6 +7075,7 @@
             <w:pPr>
               <w:pStyle w:val="Normal"/>
               <w:widowControl/>
+              <w:suppressAutoHyphens w:val="true"/>
               <w:spacing w:lineRule="auto" w:line="240" w:before="0" w:after="0"/>
               <w:jc w:val="start"/>
               <w:rPr>
@@ -6955,6 +7107,7 @@
             <w:pPr>
               <w:pStyle w:val="Normal"/>
               <w:widowControl/>
+              <w:suppressAutoHyphens w:val="true"/>
               <w:spacing w:lineRule="auto" w:line="240" w:before="0" w:after="0"/>
               <w:jc w:val="start"/>
               <w:rPr>
@@ -6989,6 +7142,7 @@
             <w:pPr>
               <w:pStyle w:val="Normal"/>
               <w:widowControl/>
+              <w:suppressAutoHyphens w:val="true"/>
               <w:spacing w:lineRule="auto" w:line="240" w:before="0" w:after="0"/>
               <w:jc w:val="start"/>
               <w:rPr>
@@ -7020,6 +7174,7 @@
             <w:pPr>
               <w:pStyle w:val="Normal"/>
               <w:widowControl/>
+              <w:suppressAutoHyphens w:val="true"/>
               <w:spacing w:lineRule="auto" w:line="240" w:before="0" w:after="0"/>
               <w:jc w:val="start"/>
               <w:rPr>
@@ -7051,6 +7206,7 @@
             <w:pPr>
               <w:pStyle w:val="Normal"/>
               <w:widowControl/>
+              <w:suppressAutoHyphens w:val="true"/>
               <w:spacing w:lineRule="auto" w:line="240" w:before="0" w:after="0"/>
               <w:jc w:val="start"/>
               <w:rPr>
@@ -7085,6 +7241,7 @@
             <w:pPr>
               <w:pStyle w:val="Normal"/>
               <w:widowControl/>
+              <w:suppressAutoHyphens w:val="true"/>
               <w:spacing w:lineRule="auto" w:line="240" w:before="0" w:after="0"/>
               <w:jc w:val="start"/>
               <w:rPr>
@@ -7116,6 +7273,7 @@
             <w:pPr>
               <w:pStyle w:val="Normal"/>
               <w:widowControl/>
+              <w:suppressAutoHyphens w:val="true"/>
               <w:spacing w:lineRule="auto" w:line="240" w:before="0" w:after="0"/>
               <w:jc w:val="start"/>
               <w:rPr>
@@ -7147,6 +7305,7 @@
             <w:pPr>
               <w:pStyle w:val="Normal"/>
               <w:widowControl/>
+              <w:suppressAutoHyphens w:val="true"/>
               <w:spacing w:lineRule="auto" w:line="240" w:before="0" w:after="0"/>
               <w:jc w:val="start"/>
               <w:rPr>
@@ -7181,6 +7340,7 @@
             <w:pPr>
               <w:pStyle w:val="Normal"/>
               <w:widowControl/>
+              <w:suppressAutoHyphens w:val="true"/>
               <w:spacing w:lineRule="auto" w:line="240" w:before="0" w:after="0"/>
               <w:jc w:val="start"/>
               <w:rPr>
@@ -7212,6 +7372,7 @@
             <w:pPr>
               <w:pStyle w:val="Normal"/>
               <w:widowControl/>
+              <w:suppressAutoHyphens w:val="true"/>
               <w:spacing w:lineRule="auto" w:line="240" w:before="0" w:after="0"/>
               <w:jc w:val="start"/>
               <w:rPr>
@@ -7243,6 +7404,7 @@
             <w:pPr>
               <w:pStyle w:val="Normal"/>
               <w:widowControl/>
+              <w:suppressAutoHyphens w:val="true"/>
               <w:spacing w:lineRule="auto" w:line="240" w:before="0" w:after="0"/>
               <w:jc w:val="start"/>
               <w:rPr>
@@ -7442,6 +7604,7 @@
             <w:pPr>
               <w:pStyle w:val="Normal"/>
               <w:widowControl/>
+              <w:suppressAutoHyphens w:val="true"/>
               <w:spacing w:lineRule="auto" w:line="240" w:before="0" w:after="0"/>
               <w:jc w:val="start"/>
               <w:rPr>
@@ -7474,6 +7637,7 @@
             <w:pPr>
               <w:pStyle w:val="Normal"/>
               <w:widowControl/>
+              <w:suppressAutoHyphens w:val="true"/>
               <w:spacing w:lineRule="auto" w:line="240" w:before="0" w:after="0"/>
               <w:jc w:val="start"/>
               <w:rPr>
@@ -7506,6 +7670,7 @@
             <w:pPr>
               <w:pStyle w:val="Normal"/>
               <w:widowControl/>
+              <w:suppressAutoHyphens w:val="true"/>
               <w:spacing w:lineRule="auto" w:line="240" w:before="0" w:after="0"/>
               <w:jc w:val="start"/>
               <w:rPr>
@@ -7538,6 +7703,7 @@
             <w:pPr>
               <w:pStyle w:val="Normal"/>
               <w:widowControl/>
+              <w:suppressAutoHyphens w:val="true"/>
               <w:spacing w:lineRule="auto" w:line="240" w:before="0" w:after="0"/>
               <w:jc w:val="start"/>
               <w:rPr>
@@ -7573,6 +7739,7 @@
             <w:pPr>
               <w:pStyle w:val="Normal"/>
               <w:widowControl/>
+              <w:suppressAutoHyphens w:val="true"/>
               <w:spacing w:lineRule="auto" w:line="240" w:before="0" w:after="0"/>
               <w:jc w:val="start"/>
               <w:rPr>
@@ -7604,6 +7771,7 @@
             <w:pPr>
               <w:pStyle w:val="Normal"/>
               <w:widowControl/>
+              <w:suppressAutoHyphens w:val="true"/>
               <w:spacing w:lineRule="auto" w:line="240" w:before="0" w:after="0"/>
               <w:jc w:val="start"/>
               <w:rPr>
@@ -7635,6 +7803,7 @@
             <w:pPr>
               <w:pStyle w:val="Normal"/>
               <w:widowControl/>
+              <w:suppressAutoHyphens w:val="true"/>
               <w:spacing w:lineRule="auto" w:line="240" w:before="0" w:after="0"/>
               <w:jc w:val="start"/>
               <w:rPr>
@@ -7666,6 +7835,7 @@
             <w:pPr>
               <w:pStyle w:val="Normal"/>
               <w:widowControl/>
+              <w:suppressAutoHyphens w:val="true"/>
               <w:spacing w:lineRule="auto" w:line="240" w:before="0" w:after="0"/>
               <w:jc w:val="start"/>
               <w:rPr>
@@ -7700,6 +7870,7 @@
             <w:pPr>
               <w:pStyle w:val="Normal"/>
               <w:widowControl/>
+              <w:suppressAutoHyphens w:val="true"/>
               <w:spacing w:lineRule="auto" w:line="240" w:before="0" w:after="0"/>
               <w:jc w:val="start"/>
               <w:rPr>
@@ -7731,6 +7902,7 @@
             <w:pPr>
               <w:pStyle w:val="Normal"/>
               <w:widowControl/>
+              <w:suppressAutoHyphens w:val="true"/>
               <w:spacing w:lineRule="auto" w:line="240" w:before="0" w:after="0"/>
               <w:jc w:val="start"/>
               <w:rPr>
@@ -7762,6 +7934,7 @@
             <w:pPr>
               <w:pStyle w:val="Normal"/>
               <w:widowControl/>
+              <w:suppressAutoHyphens w:val="true"/>
               <w:spacing w:lineRule="auto" w:line="240" w:before="0" w:after="0"/>
               <w:jc w:val="start"/>
               <w:rPr>
@@ -7793,6 +7966,7 @@
             <w:pPr>
               <w:pStyle w:val="Normal"/>
               <w:widowControl/>
+              <w:suppressAutoHyphens w:val="true"/>
               <w:spacing w:lineRule="auto" w:line="240" w:before="0" w:after="0"/>
               <w:jc w:val="start"/>
               <w:rPr>
@@ -7944,6 +8118,7 @@
             <w:pPr>
               <w:pStyle w:val="Normal"/>
               <w:widowControl/>
+              <w:suppressAutoHyphens w:val="true"/>
               <w:spacing w:lineRule="auto" w:line="240" w:before="0" w:after="0"/>
               <w:jc w:val="start"/>
               <w:rPr>
@@ -7976,6 +8151,7 @@
             <w:pPr>
               <w:pStyle w:val="Normal"/>
               <w:widowControl/>
+              <w:suppressAutoHyphens w:val="true"/>
               <w:spacing w:lineRule="auto" w:line="240" w:before="0" w:after="0"/>
               <w:jc w:val="start"/>
               <w:rPr>
@@ -8008,6 +8184,7 @@
             <w:pPr>
               <w:pStyle w:val="Normal"/>
               <w:widowControl/>
+              <w:suppressAutoHyphens w:val="true"/>
               <w:spacing w:lineRule="auto" w:line="240" w:before="0" w:after="0"/>
               <w:jc w:val="start"/>
               <w:rPr>
@@ -8043,6 +8220,7 @@
             <w:pPr>
               <w:pStyle w:val="Normal"/>
               <w:widowControl/>
+              <w:suppressAutoHyphens w:val="true"/>
               <w:spacing w:lineRule="auto" w:line="240" w:before="0" w:after="0"/>
               <w:jc w:val="start"/>
               <w:rPr>
@@ -8074,6 +8252,7 @@
             <w:pPr>
               <w:pStyle w:val="Normal"/>
               <w:widowControl/>
+              <w:suppressAutoHyphens w:val="true"/>
               <w:spacing w:lineRule="auto" w:line="240" w:before="0" w:after="0"/>
               <w:jc w:val="start"/>
               <w:rPr>
@@ -8105,6 +8284,7 @@
             <w:pPr>
               <w:pStyle w:val="Normal"/>
               <w:widowControl/>
+              <w:suppressAutoHyphens w:val="true"/>
               <w:spacing w:lineRule="auto" w:line="240" w:before="0" w:after="0"/>
               <w:jc w:val="start"/>
               <w:rPr>
@@ -8139,6 +8319,7 @@
             <w:pPr>
               <w:pStyle w:val="Normal"/>
               <w:widowControl/>
+              <w:suppressAutoHyphens w:val="true"/>
               <w:spacing w:lineRule="auto" w:line="240" w:before="0" w:after="0"/>
               <w:jc w:val="start"/>
               <w:rPr>
@@ -8170,6 +8351,7 @@
             <w:pPr>
               <w:pStyle w:val="Normal"/>
               <w:widowControl/>
+              <w:suppressAutoHyphens w:val="true"/>
               <w:spacing w:lineRule="auto" w:line="240" w:before="0" w:after="0"/>
               <w:jc w:val="start"/>
               <w:rPr>
@@ -8201,6 +8383,7 @@
             <w:pPr>
               <w:pStyle w:val="Normal"/>
               <w:widowControl/>
+              <w:suppressAutoHyphens w:val="true"/>
               <w:spacing w:lineRule="auto" w:line="240" w:before="0" w:after="0"/>
               <w:jc w:val="start"/>
               <w:rPr>
@@ -8235,6 +8418,7 @@
             <w:pPr>
               <w:pStyle w:val="Normal"/>
               <w:widowControl/>
+              <w:suppressAutoHyphens w:val="true"/>
               <w:spacing w:lineRule="auto" w:line="240" w:before="0" w:after="0"/>
               <w:jc w:val="start"/>
               <w:rPr>
@@ -8266,6 +8450,7 @@
             <w:pPr>
               <w:pStyle w:val="Normal"/>
               <w:widowControl/>
+              <w:suppressAutoHyphens w:val="true"/>
               <w:spacing w:lineRule="auto" w:line="240" w:before="0" w:after="0"/>
               <w:jc w:val="start"/>
               <w:rPr>
@@ -8297,6 +8482,7 @@
             <w:pPr>
               <w:pStyle w:val="Normal"/>
               <w:widowControl/>
+              <w:suppressAutoHyphens w:val="true"/>
               <w:spacing w:lineRule="auto" w:line="240" w:before="0" w:after="0"/>
               <w:jc w:val="start"/>
               <w:rPr>
@@ -8331,6 +8517,7 @@
             <w:pPr>
               <w:pStyle w:val="Normal"/>
               <w:widowControl/>
+              <w:suppressAutoHyphens w:val="true"/>
               <w:spacing w:lineRule="auto" w:line="240" w:before="0" w:after="0"/>
               <w:jc w:val="start"/>
               <w:rPr>
@@ -8362,6 +8549,7 @@
             <w:pPr>
               <w:pStyle w:val="Normal"/>
               <w:widowControl/>
+              <w:suppressAutoHyphens w:val="true"/>
               <w:spacing w:lineRule="auto" w:line="240" w:before="0" w:after="0"/>
               <w:jc w:val="start"/>
               <w:rPr>
@@ -8393,6 +8581,7 @@
             <w:pPr>
               <w:pStyle w:val="Normal"/>
               <w:widowControl/>
+              <w:suppressAutoHyphens w:val="true"/>
               <w:spacing w:lineRule="auto" w:line="240" w:before="0" w:after="0"/>
               <w:jc w:val="start"/>
               <w:rPr>
@@ -8427,6 +8616,7 @@
             <w:pPr>
               <w:pStyle w:val="Normal"/>
               <w:widowControl/>
+              <w:suppressAutoHyphens w:val="true"/>
               <w:spacing w:lineRule="auto" w:line="240" w:before="0" w:after="0"/>
               <w:jc w:val="start"/>
               <w:rPr>
@@ -8458,6 +8648,7 @@
             <w:pPr>
               <w:pStyle w:val="Normal"/>
               <w:widowControl/>
+              <w:suppressAutoHyphens w:val="true"/>
               <w:spacing w:lineRule="auto" w:line="240" w:before="0" w:after="0"/>
               <w:jc w:val="start"/>
               <w:rPr>
@@ -8489,6 +8680,7 @@
             <w:pPr>
               <w:pStyle w:val="Normal"/>
               <w:widowControl/>
+              <w:suppressAutoHyphens w:val="true"/>
               <w:spacing w:lineRule="auto" w:line="240" w:before="0" w:after="0"/>
               <w:jc w:val="start"/>
               <w:rPr>
@@ -8523,6 +8715,7 @@
             <w:pPr>
               <w:pStyle w:val="Normal"/>
               <w:widowControl/>
+              <w:suppressAutoHyphens w:val="true"/>
               <w:spacing w:lineRule="auto" w:line="240" w:before="0" w:after="0"/>
               <w:jc w:val="start"/>
               <w:rPr>
@@ -8554,6 +8747,7 @@
             <w:pPr>
               <w:pStyle w:val="Normal"/>
               <w:widowControl/>
+              <w:suppressAutoHyphens w:val="true"/>
               <w:spacing w:lineRule="auto" w:line="240" w:before="0" w:after="0"/>
               <w:jc w:val="start"/>
               <w:rPr>
@@ -8585,6 +8779,7 @@
             <w:pPr>
               <w:pStyle w:val="Normal"/>
               <w:widowControl/>
+              <w:suppressAutoHyphens w:val="true"/>
               <w:spacing w:lineRule="auto" w:line="240" w:before="0" w:after="0"/>
               <w:jc w:val="start"/>
               <w:rPr>
@@ -8619,6 +8814,7 @@
             <w:pPr>
               <w:pStyle w:val="Normal"/>
               <w:widowControl/>
+              <w:suppressAutoHyphens w:val="true"/>
               <w:spacing w:lineRule="auto" w:line="240" w:before="0" w:after="0"/>
               <w:jc w:val="start"/>
               <w:rPr>
@@ -8650,6 +8846,7 @@
             <w:pPr>
               <w:pStyle w:val="Normal"/>
               <w:widowControl/>
+              <w:suppressAutoHyphens w:val="true"/>
               <w:spacing w:lineRule="auto" w:line="240" w:before="0" w:after="0"/>
               <w:jc w:val="start"/>
               <w:rPr>
@@ -8681,6 +8878,7 @@
             <w:pPr>
               <w:pStyle w:val="Normal"/>
               <w:widowControl/>
+              <w:suppressAutoHyphens w:val="true"/>
               <w:spacing w:lineRule="auto" w:line="240" w:before="0" w:after="0"/>
               <w:jc w:val="start"/>
               <w:rPr>
@@ -8715,6 +8913,7 @@
             <w:pPr>
               <w:pStyle w:val="Normal"/>
               <w:widowControl/>
+              <w:suppressAutoHyphens w:val="true"/>
               <w:spacing w:lineRule="auto" w:line="240" w:before="0" w:after="0"/>
               <w:jc w:val="start"/>
               <w:rPr>
@@ -8746,6 +8945,7 @@
             <w:pPr>
               <w:pStyle w:val="Normal"/>
               <w:widowControl/>
+              <w:suppressAutoHyphens w:val="true"/>
               <w:spacing w:lineRule="auto" w:line="240" w:before="0" w:after="0"/>
               <w:jc w:val="start"/>
               <w:rPr>
@@ -8777,6 +8977,7 @@
             <w:pPr>
               <w:pStyle w:val="Normal"/>
               <w:widowControl/>
+              <w:suppressAutoHyphens w:val="true"/>
               <w:spacing w:lineRule="auto" w:line="240" w:before="0" w:after="0"/>
               <w:jc w:val="start"/>
               <w:rPr>
@@ -8811,6 +9012,7 @@
             <w:pPr>
               <w:pStyle w:val="Normal"/>
               <w:widowControl/>
+              <w:suppressAutoHyphens w:val="true"/>
               <w:spacing w:lineRule="auto" w:line="240" w:before="0" w:after="0"/>
               <w:jc w:val="start"/>
               <w:rPr>
@@ -8842,6 +9044,7 @@
             <w:pPr>
               <w:pStyle w:val="Normal"/>
               <w:widowControl/>
+              <w:suppressAutoHyphens w:val="true"/>
               <w:spacing w:lineRule="auto" w:line="240" w:before="0" w:after="0"/>
               <w:jc w:val="start"/>
               <w:rPr>
@@ -8873,6 +9076,7 @@
             <w:pPr>
               <w:pStyle w:val="Normal"/>
               <w:widowControl/>
+              <w:suppressAutoHyphens w:val="true"/>
               <w:spacing w:lineRule="auto" w:line="240" w:before="0" w:after="0"/>
               <w:jc w:val="start"/>
               <w:rPr>
@@ -9146,6 +9350,7 @@
             <w:pPr>
               <w:pStyle w:val="Normal"/>
               <w:widowControl/>
+              <w:suppressAutoHyphens w:val="true"/>
               <w:spacing w:lineRule="auto" w:line="240" w:before="0" w:after="0"/>
               <w:jc w:val="start"/>
               <w:rPr>
@@ -9178,6 +9383,7 @@
             <w:pPr>
               <w:pStyle w:val="Normal"/>
               <w:widowControl/>
+              <w:suppressAutoHyphens w:val="true"/>
               <w:spacing w:lineRule="auto" w:line="240" w:before="0" w:after="0"/>
               <w:jc w:val="start"/>
               <w:rPr>
@@ -9213,6 +9419,7 @@
             <w:pPr>
               <w:pStyle w:val="Normal"/>
               <w:widowControl/>
+              <w:suppressAutoHyphens w:val="true"/>
               <w:spacing w:lineRule="auto" w:line="240" w:before="0" w:after="0"/>
               <w:jc w:val="start"/>
               <w:rPr>
@@ -9244,6 +9451,7 @@
             <w:pPr>
               <w:pStyle w:val="Normal"/>
               <w:widowControl/>
+              <w:suppressAutoHyphens w:val="true"/>
               <w:spacing w:lineRule="auto" w:line="240" w:before="0" w:after="0"/>
               <w:jc w:val="start"/>
               <w:rPr>
@@ -9278,6 +9486,7 @@
             <w:pPr>
               <w:pStyle w:val="Normal"/>
               <w:widowControl/>
+              <w:suppressAutoHyphens w:val="true"/>
               <w:spacing w:lineRule="auto" w:line="240" w:before="0" w:after="0"/>
               <w:jc w:val="start"/>
               <w:rPr>
@@ -9309,6 +9518,7 @@
             <w:pPr>
               <w:pStyle w:val="Normal"/>
               <w:widowControl/>
+              <w:suppressAutoHyphens w:val="true"/>
               <w:spacing w:lineRule="auto" w:line="240" w:before="0" w:after="0"/>
               <w:jc w:val="start"/>
               <w:rPr>
@@ -9343,6 +9553,7 @@
             <w:pPr>
               <w:pStyle w:val="Normal"/>
               <w:widowControl/>
+              <w:suppressAutoHyphens w:val="true"/>
               <w:spacing w:lineRule="auto" w:line="240" w:before="0" w:after="0"/>
               <w:jc w:val="start"/>
               <w:rPr>
@@ -9374,6 +9585,7 @@
             <w:pPr>
               <w:pStyle w:val="Normal"/>
               <w:widowControl/>
+              <w:suppressAutoHyphens w:val="true"/>
               <w:spacing w:lineRule="auto" w:line="240" w:before="0" w:after="0"/>
               <w:jc w:val="start"/>
               <w:rPr>
@@ -9408,6 +9620,7 @@
             <w:pPr>
               <w:pStyle w:val="Normal"/>
               <w:widowControl/>
+              <w:suppressAutoHyphens w:val="true"/>
               <w:spacing w:lineRule="auto" w:line="240" w:before="0" w:after="0"/>
               <w:jc w:val="start"/>
               <w:rPr>
@@ -9439,6 +9652,7 @@
             <w:pPr>
               <w:pStyle w:val="Normal"/>
               <w:widowControl/>
+              <w:suppressAutoHyphens w:val="true"/>
               <w:spacing w:lineRule="auto" w:line="240" w:before="0" w:after="0"/>
               <w:jc w:val="start"/>
               <w:rPr>
@@ -9473,6 +9687,7 @@
             <w:pPr>
               <w:pStyle w:val="Normal"/>
               <w:widowControl/>
+              <w:suppressAutoHyphens w:val="true"/>
               <w:spacing w:lineRule="auto" w:line="240" w:before="0" w:after="0"/>
               <w:jc w:val="start"/>
               <w:rPr>
@@ -9504,6 +9719,7 @@
             <w:pPr>
               <w:pStyle w:val="Normal"/>
               <w:widowControl/>
+              <w:suppressAutoHyphens w:val="true"/>
               <w:spacing w:lineRule="auto" w:line="240" w:before="0" w:after="0"/>
               <w:jc w:val="start"/>
               <w:rPr>
@@ -9538,6 +9754,7 @@
             <w:pPr>
               <w:pStyle w:val="Normal"/>
               <w:widowControl/>
+              <w:suppressAutoHyphens w:val="true"/>
               <w:spacing w:lineRule="auto" w:line="240" w:before="0" w:after="0"/>
               <w:jc w:val="start"/>
               <w:rPr>
@@ -9569,6 +9786,7 @@
             <w:pPr>
               <w:pStyle w:val="Normal"/>
               <w:widowControl/>
+              <w:suppressAutoHyphens w:val="true"/>
               <w:spacing w:lineRule="auto" w:line="240" w:before="0" w:after="0"/>
               <w:jc w:val="start"/>
               <w:rPr>
@@ -9603,6 +9821,7 @@
             <w:pPr>
               <w:pStyle w:val="Normal"/>
               <w:widowControl/>
+              <w:suppressAutoHyphens w:val="true"/>
               <w:spacing w:lineRule="auto" w:line="240" w:before="0" w:after="0"/>
               <w:jc w:val="start"/>
               <w:rPr>
@@ -9634,6 +9853,7 @@
             <w:pPr>
               <w:pStyle w:val="Normal"/>
               <w:widowControl/>
+              <w:suppressAutoHyphens w:val="true"/>
               <w:spacing w:lineRule="auto" w:line="240" w:before="0" w:after="0"/>
               <w:jc w:val="start"/>
               <w:rPr>
@@ -9668,6 +9888,7 @@
             <w:pPr>
               <w:pStyle w:val="Normal"/>
               <w:widowControl/>
+              <w:suppressAutoHyphens w:val="true"/>
               <w:spacing w:lineRule="auto" w:line="240" w:before="0" w:after="0"/>
               <w:jc w:val="start"/>
               <w:rPr>
@@ -9699,6 +9920,7 @@
             <w:pPr>
               <w:pStyle w:val="Normal"/>
               <w:widowControl/>
+              <w:suppressAutoHyphens w:val="true"/>
               <w:spacing w:lineRule="auto" w:line="240" w:before="0" w:after="0"/>
               <w:jc w:val="start"/>
               <w:rPr>
@@ -9733,6 +9955,7 @@
             <w:pPr>
               <w:pStyle w:val="Normal"/>
               <w:widowControl/>
+              <w:suppressAutoHyphens w:val="true"/>
               <w:spacing w:lineRule="auto" w:line="240" w:before="0" w:after="0"/>
               <w:jc w:val="start"/>
               <w:rPr>
@@ -9764,6 +9987,7 @@
             <w:pPr>
               <w:pStyle w:val="Normal"/>
               <w:widowControl/>
+              <w:suppressAutoHyphens w:val="true"/>
               <w:spacing w:lineRule="auto" w:line="240" w:before="0" w:after="0"/>
               <w:jc w:val="start"/>
               <w:rPr>
@@ -9798,6 +10022,7 @@
             <w:pPr>
               <w:pStyle w:val="Normal"/>
               <w:widowControl/>
+              <w:suppressAutoHyphens w:val="true"/>
               <w:spacing w:lineRule="auto" w:line="240" w:before="0" w:after="0"/>
               <w:jc w:val="start"/>
               <w:rPr>
@@ -9829,6 +10054,7 @@
             <w:pPr>
               <w:pStyle w:val="Normal"/>
               <w:widowControl/>
+              <w:suppressAutoHyphens w:val="true"/>
               <w:spacing w:lineRule="auto" w:line="240" w:before="0" w:after="0"/>
               <w:jc w:val="start"/>
               <w:rPr>
@@ -9863,6 +10089,7 @@
             <w:pPr>
               <w:pStyle w:val="Normal"/>
               <w:widowControl/>
+              <w:suppressAutoHyphens w:val="true"/>
               <w:spacing w:lineRule="auto" w:line="240" w:before="0" w:after="0"/>
               <w:jc w:val="start"/>
               <w:rPr>
@@ -9894,6 +10121,7 @@
             <w:pPr>
               <w:pStyle w:val="Normal"/>
               <w:widowControl/>
+              <w:suppressAutoHyphens w:val="true"/>
               <w:spacing w:lineRule="auto" w:line="240" w:before="0" w:after="0"/>
               <w:jc w:val="start"/>
               <w:rPr>
@@ -9928,6 +10156,7 @@
             <w:pPr>
               <w:pStyle w:val="Normal"/>
               <w:widowControl/>
+              <w:suppressAutoHyphens w:val="true"/>
               <w:spacing w:lineRule="auto" w:line="240" w:before="0" w:after="0"/>
               <w:jc w:val="start"/>
               <w:rPr>
@@ -9959,6 +10188,7 @@
             <w:pPr>
               <w:pStyle w:val="Normal"/>
               <w:widowControl/>
+              <w:suppressAutoHyphens w:val="true"/>
               <w:spacing w:lineRule="auto" w:line="240" w:before="0" w:after="0"/>
               <w:jc w:val="start"/>
               <w:rPr>
@@ -10041,6 +10271,7 @@
             <w:pPr>
               <w:pStyle w:val="Normal"/>
               <w:widowControl/>
+              <w:suppressAutoHyphens w:val="true"/>
               <w:spacing w:lineRule="auto" w:line="240" w:before="0" w:after="0"/>
               <w:jc w:val="start"/>
               <w:rPr>
@@ -10073,6 +10304,7 @@
             <w:pPr>
               <w:pStyle w:val="Normal"/>
               <w:widowControl/>
+              <w:suppressAutoHyphens w:val="true"/>
               <w:spacing w:lineRule="auto" w:line="240" w:before="0" w:after="0"/>
               <w:jc w:val="start"/>
               <w:rPr>
@@ -10108,6 +10340,7 @@
             <w:pPr>
               <w:pStyle w:val="Normal"/>
               <w:widowControl/>
+              <w:suppressAutoHyphens w:val="true"/>
               <w:spacing w:lineRule="auto" w:line="240" w:before="0" w:after="0"/>
               <w:jc w:val="start"/>
               <w:rPr>
@@ -10139,6 +10372,7 @@
             <w:pPr>
               <w:pStyle w:val="Normal"/>
               <w:widowControl/>
+              <w:suppressAutoHyphens w:val="true"/>
               <w:spacing w:lineRule="auto" w:line="240" w:before="0" w:after="0"/>
               <w:jc w:val="start"/>
               <w:rPr>
@@ -10173,6 +10407,7 @@
             <w:pPr>
               <w:pStyle w:val="Normal"/>
               <w:widowControl/>
+              <w:suppressAutoHyphens w:val="true"/>
               <w:spacing w:lineRule="auto" w:line="240" w:before="0" w:after="0"/>
               <w:jc w:val="start"/>
               <w:rPr>
@@ -10204,6 +10439,7 @@
             <w:pPr>
               <w:pStyle w:val="Normal"/>
               <w:widowControl/>
+              <w:suppressAutoHyphens w:val="true"/>
               <w:spacing w:lineRule="auto" w:line="240" w:before="0" w:after="0"/>
               <w:jc w:val="start"/>
               <w:rPr>
@@ -10238,6 +10474,7 @@
             <w:pPr>
               <w:pStyle w:val="Normal"/>
               <w:widowControl/>
+              <w:suppressAutoHyphens w:val="true"/>
               <w:spacing w:lineRule="auto" w:line="240" w:before="0" w:after="0"/>
               <w:jc w:val="start"/>
               <w:rPr>
@@ -10269,6 +10506,7 @@
             <w:pPr>
               <w:pStyle w:val="Normal"/>
               <w:widowControl/>
+              <w:suppressAutoHyphens w:val="true"/>
               <w:spacing w:lineRule="auto" w:line="240" w:before="0" w:after="0"/>
               <w:jc w:val="start"/>
               <w:rPr>
@@ -10303,6 +10541,7 @@
             <w:pPr>
               <w:pStyle w:val="Normal"/>
               <w:widowControl/>
+              <w:suppressAutoHyphens w:val="true"/>
               <w:spacing w:lineRule="auto" w:line="240" w:before="0" w:after="0"/>
               <w:jc w:val="start"/>
               <w:rPr>
@@ -10334,6 +10573,7 @@
             <w:pPr>
               <w:pStyle w:val="Normal"/>
               <w:widowControl/>
+              <w:suppressAutoHyphens w:val="true"/>
               <w:spacing w:lineRule="auto" w:line="240" w:before="0" w:after="0"/>
               <w:jc w:val="start"/>
               <w:rPr>
@@ -10368,6 +10608,7 @@
             <w:pPr>
               <w:pStyle w:val="Normal"/>
               <w:widowControl/>
+              <w:suppressAutoHyphens w:val="true"/>
               <w:spacing w:lineRule="auto" w:line="240" w:before="0" w:after="0"/>
               <w:jc w:val="start"/>
               <w:rPr>
@@ -10399,6 +10640,7 @@
             <w:pPr>
               <w:pStyle w:val="Normal"/>
               <w:widowControl/>
+              <w:suppressAutoHyphens w:val="true"/>
               <w:spacing w:lineRule="auto" w:line="240" w:before="0" w:after="0"/>
               <w:jc w:val="start"/>
               <w:rPr>
@@ -10433,6 +10675,7 @@
             <w:pPr>
               <w:pStyle w:val="Normal"/>
               <w:widowControl/>
+              <w:suppressAutoHyphens w:val="true"/>
               <w:spacing w:lineRule="auto" w:line="240" w:before="0" w:after="0"/>
               <w:jc w:val="start"/>
               <w:rPr>
@@ -10464,6 +10707,7 @@
             <w:pPr>
               <w:pStyle w:val="Normal"/>
               <w:widowControl/>
+              <w:suppressAutoHyphens w:val="true"/>
               <w:spacing w:lineRule="auto" w:line="240" w:before="0" w:after="0"/>
               <w:jc w:val="start"/>
               <w:rPr>
@@ -10498,6 +10742,7 @@
             <w:pPr>
               <w:pStyle w:val="Normal"/>
               <w:widowControl/>
+              <w:suppressAutoHyphens w:val="true"/>
               <w:spacing w:lineRule="auto" w:line="240" w:before="0" w:after="0"/>
               <w:jc w:val="start"/>
               <w:rPr>
@@ -10529,6 +10774,7 @@
             <w:pPr>
               <w:pStyle w:val="Normal"/>
               <w:widowControl/>
+              <w:suppressAutoHyphens w:val="true"/>
               <w:spacing w:lineRule="auto" w:line="240" w:before="0" w:after="0"/>
               <w:jc w:val="start"/>
               <w:rPr>
@@ -10563,6 +10809,7 @@
             <w:pPr>
               <w:pStyle w:val="Normal"/>
               <w:widowControl/>
+              <w:suppressAutoHyphens w:val="true"/>
               <w:spacing w:lineRule="auto" w:line="240" w:before="0" w:after="0"/>
               <w:jc w:val="start"/>
               <w:rPr>
@@ -10594,6 +10841,7 @@
             <w:pPr>
               <w:pStyle w:val="Normal"/>
               <w:widowControl/>
+              <w:suppressAutoHyphens w:val="true"/>
               <w:spacing w:lineRule="auto" w:line="240" w:before="0" w:after="0"/>
               <w:jc w:val="start"/>
               <w:rPr>
@@ -10770,6 +11018,7 @@
             <w:pPr>
               <w:pStyle w:val="Normal"/>
               <w:widowControl/>
+              <w:suppressAutoHyphens w:val="true"/>
               <w:spacing w:lineRule="auto" w:line="240" w:before="0" w:after="0"/>
               <w:jc w:val="start"/>
               <w:rPr>
@@ -10802,6 +11051,7 @@
             <w:pPr>
               <w:pStyle w:val="Normal"/>
               <w:widowControl/>
+              <w:suppressAutoHyphens w:val="true"/>
               <w:spacing w:lineRule="auto" w:line="240" w:before="0" w:after="0"/>
               <w:jc w:val="start"/>
               <w:rPr>
@@ -10834,6 +11084,7 @@
             <w:pPr>
               <w:pStyle w:val="Normal"/>
               <w:widowControl/>
+              <w:suppressAutoHyphens w:val="true"/>
               <w:spacing w:lineRule="auto" w:line="240" w:before="0" w:after="0"/>
               <w:jc w:val="start"/>
               <w:rPr>
@@ -10869,6 +11120,7 @@
             <w:pPr>
               <w:pStyle w:val="Normal"/>
               <w:widowControl/>
+              <w:suppressAutoHyphens w:val="true"/>
               <w:spacing w:lineRule="auto" w:line="240" w:before="0" w:after="0"/>
               <w:jc w:val="start"/>
               <w:rPr>
@@ -10900,6 +11152,7 @@
             <w:pPr>
               <w:pStyle w:val="Normal"/>
               <w:widowControl/>
+              <w:suppressAutoHyphens w:val="true"/>
               <w:spacing w:lineRule="auto" w:line="240" w:before="0" w:after="0"/>
               <w:jc w:val="start"/>
               <w:rPr>
@@ -10931,6 +11184,7 @@
             <w:pPr>
               <w:pStyle w:val="Normal"/>
               <w:widowControl/>
+              <w:suppressAutoHyphens w:val="true"/>
               <w:spacing w:lineRule="auto" w:line="240" w:before="0" w:after="0"/>
               <w:jc w:val="start"/>
               <w:rPr>
@@ -10965,6 +11219,7 @@
             <w:pPr>
               <w:pStyle w:val="Normal"/>
               <w:widowControl/>
+              <w:suppressAutoHyphens w:val="true"/>
               <w:spacing w:lineRule="auto" w:line="240" w:before="0" w:after="0"/>
               <w:jc w:val="start"/>
               <w:rPr>
@@ -10996,6 +11251,7 @@
             <w:pPr>
               <w:pStyle w:val="Normal"/>
               <w:widowControl/>
+              <w:suppressAutoHyphens w:val="true"/>
               <w:spacing w:lineRule="auto" w:line="240" w:before="0" w:after="0"/>
               <w:jc w:val="start"/>
               <w:rPr>
@@ -11027,6 +11283,7 @@
             <w:pPr>
               <w:pStyle w:val="Normal"/>
               <w:widowControl/>
+              <w:suppressAutoHyphens w:val="true"/>
               <w:spacing w:lineRule="auto" w:line="240" w:before="0" w:after="0"/>
               <w:jc w:val="start"/>
               <w:rPr>
@@ -11061,6 +11318,7 @@
             <w:pPr>
               <w:pStyle w:val="Normal"/>
               <w:widowControl/>
+              <w:suppressAutoHyphens w:val="true"/>
               <w:spacing w:lineRule="auto" w:line="240" w:before="0" w:after="0"/>
               <w:jc w:val="start"/>
               <w:rPr>
@@ -11092,6 +11350,7 @@
             <w:pPr>
               <w:pStyle w:val="Normal"/>
               <w:widowControl/>
+              <w:suppressAutoHyphens w:val="true"/>
               <w:spacing w:lineRule="auto" w:line="240" w:before="0" w:after="0"/>
               <w:jc w:val="start"/>
               <w:rPr>
@@ -11123,6 +11382,7 @@
             <w:pPr>
               <w:pStyle w:val="Normal"/>
               <w:widowControl/>
+              <w:suppressAutoHyphens w:val="true"/>
               <w:spacing w:lineRule="auto" w:line="240" w:before="0" w:after="0"/>
               <w:jc w:val="start"/>
               <w:rPr>
@@ -11274,6 +11534,7 @@
             <w:pPr>
               <w:pStyle w:val="Normal"/>
               <w:widowControl/>
+              <w:suppressAutoHyphens w:val="true"/>
               <w:spacing w:lineRule="auto" w:line="240" w:before="0" w:after="0"/>
               <w:jc w:val="start"/>
               <w:rPr>
@@ -11306,6 +11567,7 @@
             <w:pPr>
               <w:pStyle w:val="Normal"/>
               <w:widowControl/>
+              <w:suppressAutoHyphens w:val="true"/>
               <w:spacing w:lineRule="auto" w:line="240" w:before="0" w:after="0"/>
               <w:jc w:val="start"/>
               <w:rPr>
@@ -11338,6 +11600,7 @@
             <w:pPr>
               <w:pStyle w:val="Normal"/>
               <w:widowControl/>
+              <w:suppressAutoHyphens w:val="true"/>
               <w:spacing w:lineRule="auto" w:line="240" w:before="0" w:after="0"/>
               <w:jc w:val="start"/>
               <w:rPr>
@@ -11373,6 +11636,7 @@
             <w:pPr>
               <w:pStyle w:val="Normal"/>
               <w:widowControl/>
+              <w:suppressAutoHyphens w:val="true"/>
               <w:spacing w:lineRule="auto" w:line="240" w:before="0" w:after="0"/>
               <w:jc w:val="start"/>
               <w:rPr>
@@ -11404,6 +11668,7 @@
             <w:pPr>
               <w:pStyle w:val="Normal"/>
               <w:widowControl/>
+              <w:suppressAutoHyphens w:val="true"/>
               <w:spacing w:lineRule="auto" w:line="240" w:before="0" w:after="0"/>
               <w:jc w:val="start"/>
               <w:rPr>
@@ -11435,6 +11700,7 @@
             <w:pPr>
               <w:pStyle w:val="Normal"/>
               <w:widowControl/>
+              <w:suppressAutoHyphens w:val="true"/>
               <w:spacing w:lineRule="auto" w:line="240" w:before="0" w:after="0"/>
               <w:jc w:val="start"/>
               <w:rPr>
@@ -11469,6 +11735,7 @@
             <w:pPr>
               <w:pStyle w:val="Normal"/>
               <w:widowControl/>
+              <w:suppressAutoHyphens w:val="true"/>
               <w:spacing w:lineRule="auto" w:line="240" w:before="0" w:after="0"/>
               <w:jc w:val="start"/>
               <w:rPr>
@@ -11500,6 +11767,7 @@
             <w:pPr>
               <w:pStyle w:val="Normal"/>
               <w:widowControl/>
+              <w:suppressAutoHyphens w:val="true"/>
               <w:spacing w:lineRule="auto" w:line="240" w:before="0" w:after="0"/>
               <w:jc w:val="start"/>
               <w:rPr>
@@ -11531,6 +11799,7 @@
             <w:pPr>
               <w:pStyle w:val="Normal"/>
               <w:widowControl/>
+              <w:suppressAutoHyphens w:val="true"/>
               <w:spacing w:lineRule="auto" w:line="240" w:before="0" w:after="0"/>
               <w:jc w:val="start"/>
               <w:rPr>
@@ -11565,6 +11834,7 @@
             <w:pPr>
               <w:pStyle w:val="Normal"/>
               <w:widowControl/>
+              <w:suppressAutoHyphens w:val="true"/>
               <w:spacing w:lineRule="auto" w:line="240" w:before="0" w:after="0"/>
               <w:jc w:val="start"/>
               <w:rPr>
@@ -11596,6 +11866,7 @@
             <w:pPr>
               <w:pStyle w:val="Normal"/>
               <w:widowControl/>
+              <w:suppressAutoHyphens w:val="true"/>
               <w:spacing w:lineRule="auto" w:line="240" w:before="0" w:after="0"/>
               <w:jc w:val="start"/>
               <w:rPr>
@@ -11627,6 +11898,7 @@
             <w:pPr>
               <w:pStyle w:val="Normal"/>
               <w:widowControl/>
+              <w:suppressAutoHyphens w:val="true"/>
               <w:spacing w:lineRule="auto" w:line="240" w:before="0" w:after="0"/>
               <w:jc w:val="start"/>
               <w:rPr>
@@ -11661,6 +11933,7 @@
             <w:pPr>
               <w:pStyle w:val="Normal"/>
               <w:widowControl/>
+              <w:suppressAutoHyphens w:val="true"/>
               <w:spacing w:lineRule="auto" w:line="240" w:before="0" w:after="0"/>
               <w:jc w:val="start"/>
               <w:rPr>
@@ -11692,6 +11965,7 @@
             <w:pPr>
               <w:pStyle w:val="Normal"/>
               <w:widowControl/>
+              <w:suppressAutoHyphens w:val="true"/>
               <w:spacing w:lineRule="auto" w:line="240" w:before="0" w:after="0"/>
               <w:jc w:val="start"/>
               <w:rPr>
@@ -11723,6 +11997,7 @@
             <w:pPr>
               <w:pStyle w:val="Normal"/>
               <w:widowControl/>
+              <w:suppressAutoHyphens w:val="true"/>
               <w:spacing w:lineRule="auto" w:line="240" w:before="0" w:after="0"/>
               <w:jc w:val="start"/>
               <w:rPr>
@@ -11757,6 +12032,7 @@
             <w:pPr>
               <w:pStyle w:val="Normal"/>
               <w:widowControl/>
+              <w:suppressAutoHyphens w:val="true"/>
               <w:spacing w:lineRule="auto" w:line="240" w:before="0" w:after="0"/>
               <w:jc w:val="start"/>
               <w:rPr>
@@ -11788,6 +12064,7 @@
             <w:pPr>
               <w:pStyle w:val="Normal"/>
               <w:widowControl/>
+              <w:suppressAutoHyphens w:val="true"/>
               <w:spacing w:lineRule="auto" w:line="240" w:before="0" w:after="0"/>
               <w:jc w:val="start"/>
               <w:rPr>
@@ -11819,6 +12096,7 @@
             <w:pPr>
               <w:pStyle w:val="Normal"/>
               <w:widowControl/>
+              <w:suppressAutoHyphens w:val="true"/>
               <w:spacing w:lineRule="auto" w:line="240" w:before="0" w:after="0"/>
               <w:jc w:val="start"/>
               <w:rPr>
@@ -11853,6 +12131,7 @@
             <w:pPr>
               <w:pStyle w:val="Normal"/>
               <w:widowControl/>
+              <w:suppressAutoHyphens w:val="true"/>
               <w:spacing w:lineRule="auto" w:line="240" w:before="0" w:after="0"/>
               <w:jc w:val="start"/>
               <w:rPr>
@@ -11884,6 +12163,7 @@
             <w:pPr>
               <w:pStyle w:val="Normal"/>
               <w:widowControl/>
+              <w:suppressAutoHyphens w:val="true"/>
               <w:spacing w:lineRule="auto" w:line="240" w:before="0" w:after="0"/>
               <w:jc w:val="start"/>
               <w:rPr>
@@ -11915,6 +12195,7 @@
             <w:pPr>
               <w:pStyle w:val="Normal"/>
               <w:widowControl/>
+              <w:suppressAutoHyphens w:val="true"/>
               <w:spacing w:lineRule="auto" w:line="240" w:before="0" w:after="0"/>
               <w:jc w:val="start"/>
               <w:rPr>
@@ -12114,6 +12395,7 @@
             <w:pPr>
               <w:pStyle w:val="Normal"/>
               <w:widowControl/>
+              <w:suppressAutoHyphens w:val="true"/>
               <w:spacing w:lineRule="auto" w:line="240" w:before="0" w:after="0"/>
               <w:jc w:val="start"/>
               <w:rPr>
@@ -12146,6 +12428,7 @@
             <w:pPr>
               <w:pStyle w:val="Normal"/>
               <w:widowControl/>
+              <w:suppressAutoHyphens w:val="true"/>
               <w:spacing w:lineRule="auto" w:line="240" w:before="0" w:after="0"/>
               <w:jc w:val="start"/>
               <w:rPr>
@@ -12178,6 +12461,7 @@
             <w:pPr>
               <w:pStyle w:val="Normal"/>
               <w:widowControl/>
+              <w:suppressAutoHyphens w:val="true"/>
               <w:spacing w:lineRule="auto" w:line="240" w:before="0" w:after="0"/>
               <w:jc w:val="start"/>
               <w:rPr>
@@ -12210,6 +12494,7 @@
             <w:pPr>
               <w:pStyle w:val="Normal"/>
               <w:widowControl/>
+              <w:suppressAutoHyphens w:val="true"/>
               <w:spacing w:lineRule="auto" w:line="240" w:before="0" w:after="0"/>
               <w:jc w:val="start"/>
               <w:rPr>
@@ -12245,6 +12530,7 @@
             <w:pPr>
               <w:pStyle w:val="Normal"/>
               <w:widowControl/>
+              <w:suppressAutoHyphens w:val="true"/>
               <w:spacing w:lineRule="auto" w:line="240" w:before="0" w:after="0"/>
               <w:jc w:val="start"/>
               <w:rPr>
@@ -12276,6 +12562,7 @@
             <w:pPr>
               <w:pStyle w:val="Normal"/>
               <w:widowControl/>
+              <w:suppressAutoHyphens w:val="true"/>
               <w:spacing w:lineRule="auto" w:line="240" w:before="0" w:after="0"/>
               <w:jc w:val="start"/>
               <w:rPr>
@@ -12307,6 +12594,7 @@
             <w:pPr>
               <w:pStyle w:val="Normal"/>
               <w:widowControl/>
+              <w:suppressAutoHyphens w:val="true"/>
               <w:spacing w:lineRule="auto" w:line="240" w:before="0" w:after="0"/>
               <w:jc w:val="start"/>
               <w:rPr>
@@ -12338,6 +12626,7 @@
             <w:pPr>
               <w:pStyle w:val="Normal"/>
               <w:widowControl/>
+              <w:suppressAutoHyphens w:val="true"/>
               <w:spacing w:lineRule="auto" w:line="240" w:before="0" w:after="0"/>
               <w:jc w:val="start"/>
               <w:rPr>
@@ -12372,6 +12661,7 @@
             <w:pPr>
               <w:pStyle w:val="Normal"/>
               <w:widowControl/>
+              <w:suppressAutoHyphens w:val="true"/>
               <w:spacing w:lineRule="auto" w:line="240" w:before="0" w:after="0"/>
               <w:jc w:val="start"/>
               <w:rPr>
@@ -12403,6 +12693,7 @@
             <w:pPr>
               <w:pStyle w:val="Normal"/>
               <w:widowControl/>
+              <w:suppressAutoHyphens w:val="true"/>
               <w:spacing w:lineRule="auto" w:line="240" w:before="0" w:after="0"/>
               <w:jc w:val="start"/>
               <w:rPr>
@@ -12434,6 +12725,7 @@
             <w:pPr>
               <w:pStyle w:val="Normal"/>
               <w:widowControl/>
+              <w:suppressAutoHyphens w:val="true"/>
               <w:spacing w:lineRule="auto" w:line="240" w:before="0" w:after="0"/>
               <w:jc w:val="start"/>
               <w:rPr>
@@ -12465,6 +12757,7 @@
             <w:pPr>
               <w:pStyle w:val="Normal"/>
               <w:widowControl/>
+              <w:suppressAutoHyphens w:val="true"/>
               <w:spacing w:lineRule="auto" w:line="240" w:before="0" w:after="0"/>
               <w:jc w:val="start"/>
               <w:rPr>
@@ -12499,6 +12792,7 @@
             <w:pPr>
               <w:pStyle w:val="Normal"/>
               <w:widowControl/>
+              <w:suppressAutoHyphens w:val="true"/>
               <w:spacing w:lineRule="auto" w:line="240" w:before="0" w:after="0"/>
               <w:jc w:val="start"/>
               <w:rPr>
@@ -12530,6 +12824,7 @@
             <w:pPr>
               <w:pStyle w:val="Normal"/>
               <w:widowControl/>
+              <w:suppressAutoHyphens w:val="true"/>
               <w:spacing w:lineRule="auto" w:line="240" w:before="0" w:after="0"/>
               <w:jc w:val="start"/>
               <w:rPr>
@@ -12561,6 +12856,7 @@
             <w:pPr>
               <w:pStyle w:val="Normal"/>
               <w:widowControl/>
+              <w:suppressAutoHyphens w:val="true"/>
               <w:spacing w:lineRule="auto" w:line="240" w:before="0" w:after="0"/>
               <w:jc w:val="start"/>
               <w:rPr>
@@ -12592,6 +12888,7 @@
             <w:pPr>
               <w:pStyle w:val="Normal"/>
               <w:widowControl/>
+              <w:suppressAutoHyphens w:val="true"/>
               <w:spacing w:lineRule="auto" w:line="240" w:before="0" w:after="0"/>
               <w:jc w:val="start"/>
               <w:rPr>
@@ -12822,6 +13119,7 @@
             <w:pPr>
               <w:pStyle w:val="Normal"/>
               <w:widowControl/>
+              <w:suppressAutoHyphens w:val="true"/>
               <w:spacing w:lineRule="auto" w:line="240" w:before="0" w:after="0"/>
               <w:jc w:val="start"/>
               <w:rPr>
@@ -12854,6 +13152,7 @@
             <w:pPr>
               <w:pStyle w:val="Normal"/>
               <w:widowControl/>
+              <w:suppressAutoHyphens w:val="true"/>
               <w:spacing w:lineRule="auto" w:line="240" w:before="0" w:after="0"/>
               <w:jc w:val="start"/>
               <w:rPr>
@@ -12886,6 +13185,7 @@
             <w:pPr>
               <w:pStyle w:val="Normal"/>
               <w:widowControl/>
+              <w:suppressAutoHyphens w:val="true"/>
               <w:spacing w:lineRule="auto" w:line="240" w:before="0" w:after="0"/>
               <w:jc w:val="start"/>
               <w:rPr>
@@ -12921,6 +13221,7 @@
             <w:pPr>
               <w:pStyle w:val="Normal"/>
               <w:widowControl/>
+              <w:suppressAutoHyphens w:val="true"/>
               <w:spacing w:lineRule="auto" w:line="240" w:before="0" w:after="0"/>
               <w:jc w:val="start"/>
               <w:rPr>
@@ -12952,6 +13253,7 @@
             <w:pPr>
               <w:pStyle w:val="Normal"/>
               <w:widowControl/>
+              <w:suppressAutoHyphens w:val="true"/>
               <w:spacing w:lineRule="auto" w:line="240" w:before="0" w:after="0"/>
               <w:jc w:val="start"/>
               <w:rPr>
@@ -12983,6 +13285,7 @@
             <w:pPr>
               <w:pStyle w:val="Normal"/>
               <w:widowControl/>
+              <w:suppressAutoHyphens w:val="true"/>
               <w:spacing w:lineRule="auto" w:line="240" w:before="0" w:after="0"/>
               <w:jc w:val="start"/>
               <w:rPr>
@@ -13017,6 +13320,7 @@
             <w:pPr>
               <w:pStyle w:val="Normal"/>
               <w:widowControl/>
+              <w:suppressAutoHyphens w:val="true"/>
               <w:spacing w:lineRule="auto" w:line="240" w:before="0" w:after="0"/>
               <w:jc w:val="start"/>
               <w:rPr>
@@ -13048,6 +13352,7 @@
             <w:pPr>
               <w:pStyle w:val="Normal"/>
               <w:widowControl/>
+              <w:suppressAutoHyphens w:val="true"/>
               <w:spacing w:lineRule="auto" w:line="240" w:before="0" w:after="0"/>
               <w:jc w:val="start"/>
               <w:rPr>
@@ -13079,6 +13384,7 @@
             <w:pPr>
               <w:pStyle w:val="Normal"/>
               <w:widowControl/>
+              <w:suppressAutoHyphens w:val="true"/>
               <w:spacing w:lineRule="auto" w:line="240" w:before="0" w:after="0"/>
               <w:jc w:val="start"/>
               <w:rPr>
@@ -13113,6 +13419,7 @@
             <w:pPr>
               <w:pStyle w:val="Normal"/>
               <w:widowControl/>
+              <w:suppressAutoHyphens w:val="true"/>
               <w:spacing w:lineRule="auto" w:line="240" w:before="0" w:after="0"/>
               <w:jc w:val="start"/>
               <w:rPr>
@@ -13144,6 +13451,7 @@
             <w:pPr>
               <w:pStyle w:val="Normal"/>
               <w:widowControl/>
+              <w:suppressAutoHyphens w:val="true"/>
               <w:spacing w:lineRule="auto" w:line="240" w:before="0" w:after="0"/>
               <w:jc w:val="start"/>
               <w:rPr>
@@ -13175,6 +13483,7 @@
             <w:pPr>
               <w:pStyle w:val="Normal"/>
               <w:widowControl/>
+              <w:suppressAutoHyphens w:val="true"/>
               <w:spacing w:lineRule="auto" w:line="240" w:before="0" w:after="0"/>
               <w:jc w:val="start"/>
               <w:rPr>
@@ -13209,6 +13518,7 @@
             <w:pPr>
               <w:pStyle w:val="Normal"/>
               <w:widowControl/>
+              <w:suppressAutoHyphens w:val="true"/>
               <w:spacing w:lineRule="auto" w:line="240" w:before="0" w:after="0"/>
               <w:jc w:val="start"/>
               <w:rPr>
@@ -13240,6 +13550,7 @@
             <w:pPr>
               <w:pStyle w:val="Normal"/>
               <w:widowControl/>
+              <w:suppressAutoHyphens w:val="true"/>
               <w:spacing w:lineRule="auto" w:line="240" w:before="0" w:after="0"/>
               <w:jc w:val="start"/>
               <w:rPr>
@@ -13271,6 +13582,7 @@
             <w:pPr>
               <w:pStyle w:val="Normal"/>
               <w:widowControl/>
+              <w:suppressAutoHyphens w:val="true"/>
               <w:spacing w:lineRule="auto" w:line="240" w:before="0" w:after="0"/>
               <w:jc w:val="start"/>
               <w:rPr>
@@ -13305,6 +13617,7 @@
             <w:pPr>
               <w:pStyle w:val="Normal"/>
               <w:widowControl/>
+              <w:suppressAutoHyphens w:val="true"/>
               <w:spacing w:lineRule="auto" w:line="240" w:before="0" w:after="0"/>
               <w:jc w:val="start"/>
               <w:rPr>
@@ -13336,6 +13649,7 @@
             <w:pPr>
               <w:pStyle w:val="Normal"/>
               <w:widowControl/>
+              <w:suppressAutoHyphens w:val="true"/>
               <w:spacing w:lineRule="auto" w:line="240" w:before="0" w:after="0"/>
               <w:jc w:val="start"/>
               <w:rPr>
@@ -13367,6 +13681,7 @@
             <w:pPr>
               <w:pStyle w:val="Normal"/>
               <w:widowControl/>
+              <w:suppressAutoHyphens w:val="true"/>
               <w:spacing w:lineRule="auto" w:line="240" w:before="0" w:after="0"/>
               <w:jc w:val="start"/>
               <w:rPr>
@@ -13401,6 +13716,7 @@
             <w:pPr>
               <w:pStyle w:val="Normal"/>
               <w:widowControl/>
+              <w:suppressAutoHyphens w:val="true"/>
               <w:spacing w:lineRule="auto" w:line="240" w:before="0" w:after="0"/>
               <w:jc w:val="start"/>
               <w:rPr>
@@ -13432,6 +13748,7 @@
             <w:pPr>
               <w:pStyle w:val="Normal"/>
               <w:widowControl/>
+              <w:suppressAutoHyphens w:val="true"/>
               <w:spacing w:lineRule="auto" w:line="240" w:before="0" w:after="0"/>
               <w:jc w:val="start"/>
               <w:rPr>
@@ -13463,6 +13780,7 @@
             <w:pPr>
               <w:pStyle w:val="Normal"/>
               <w:widowControl/>
+              <w:suppressAutoHyphens w:val="true"/>
               <w:spacing w:lineRule="auto" w:line="240" w:before="0" w:after="0"/>
               <w:jc w:val="start"/>
               <w:rPr>
@@ -13497,6 +13815,7 @@
             <w:pPr>
               <w:pStyle w:val="Normal"/>
               <w:widowControl/>
+              <w:suppressAutoHyphens w:val="true"/>
               <w:spacing w:lineRule="auto" w:line="240" w:before="0" w:after="0"/>
               <w:jc w:val="start"/>
               <w:rPr>
@@ -13528,6 +13847,7 @@
             <w:pPr>
               <w:pStyle w:val="Normal"/>
               <w:widowControl/>
+              <w:suppressAutoHyphens w:val="true"/>
               <w:spacing w:lineRule="auto" w:line="240" w:before="0" w:after="0"/>
               <w:jc w:val="start"/>
               <w:rPr>
@@ -13559,6 +13879,7 @@
             <w:pPr>
               <w:pStyle w:val="Normal"/>
               <w:widowControl/>
+              <w:suppressAutoHyphens w:val="true"/>
               <w:spacing w:lineRule="auto" w:line="240" w:before="0" w:after="0"/>
               <w:jc w:val="start"/>
               <w:rPr>
@@ -13593,6 +13914,7 @@
             <w:pPr>
               <w:pStyle w:val="Normal"/>
               <w:widowControl/>
+              <w:suppressAutoHyphens w:val="true"/>
               <w:spacing w:lineRule="auto" w:line="240" w:before="0" w:after="0"/>
               <w:jc w:val="start"/>
               <w:rPr>
@@ -13624,6 +13946,7 @@
             <w:pPr>
               <w:pStyle w:val="Normal"/>
               <w:widowControl/>
+              <w:suppressAutoHyphens w:val="true"/>
               <w:spacing w:lineRule="auto" w:line="240" w:before="0" w:after="0"/>
               <w:jc w:val="start"/>
               <w:rPr>
@@ -13655,6 +13978,7 @@
             <w:pPr>
               <w:pStyle w:val="Normal"/>
               <w:widowControl/>
+              <w:suppressAutoHyphens w:val="true"/>
               <w:spacing w:lineRule="auto" w:line="240" w:before="0" w:after="0"/>
               <w:jc w:val="start"/>
               <w:rPr>
@@ -13689,6 +14013,7 @@
             <w:pPr>
               <w:pStyle w:val="Normal"/>
               <w:widowControl/>
+              <w:suppressAutoHyphens w:val="true"/>
               <w:spacing w:lineRule="auto" w:line="240" w:before="0" w:after="0"/>
               <w:jc w:val="start"/>
               <w:rPr>
@@ -13720,6 +14045,7 @@
             <w:pPr>
               <w:pStyle w:val="Normal"/>
               <w:widowControl/>
+              <w:suppressAutoHyphens w:val="true"/>
               <w:spacing w:lineRule="auto" w:line="240" w:before="0" w:after="0"/>
               <w:jc w:val="start"/>
               <w:rPr>
@@ -13751,6 +14077,7 @@
             <w:pPr>
               <w:pStyle w:val="Normal"/>
               <w:widowControl/>
+              <w:suppressAutoHyphens w:val="true"/>
               <w:spacing w:lineRule="auto" w:line="240" w:before="0" w:after="0"/>
               <w:jc w:val="start"/>
               <w:rPr>
@@ -13785,6 +14112,7 @@
             <w:pPr>
               <w:pStyle w:val="Normal"/>
               <w:widowControl/>
+              <w:suppressAutoHyphens w:val="true"/>
               <w:spacing w:lineRule="auto" w:line="240" w:before="0" w:after="0"/>
               <w:jc w:val="start"/>
               <w:rPr>
@@ -13816,6 +14144,7 @@
             <w:pPr>
               <w:pStyle w:val="Normal"/>
               <w:widowControl/>
+              <w:suppressAutoHyphens w:val="true"/>
               <w:spacing w:lineRule="auto" w:line="240" w:before="0" w:after="0"/>
               <w:jc w:val="start"/>
               <w:rPr>
@@ -13847,6 +14176,7 @@
             <w:pPr>
               <w:pStyle w:val="Normal"/>
               <w:widowControl/>
+              <w:suppressAutoHyphens w:val="true"/>
               <w:spacing w:lineRule="auto" w:line="240" w:before="0" w:after="0"/>
               <w:jc w:val="start"/>
               <w:rPr>
@@ -14035,6 +14365,7 @@
             <w:pPr>
               <w:pStyle w:val="Normal"/>
               <w:widowControl/>
+              <w:suppressAutoHyphens w:val="true"/>
               <w:spacing w:lineRule="auto" w:line="240" w:before="0" w:after="0"/>
               <w:jc w:val="start"/>
               <w:rPr>
@@ -14067,6 +14398,7 @@
             <w:pPr>
               <w:pStyle w:val="Normal"/>
               <w:widowControl/>
+              <w:suppressAutoHyphens w:val="true"/>
               <w:spacing w:lineRule="auto" w:line="240" w:before="0" w:after="0"/>
               <w:jc w:val="start"/>
               <w:rPr>
@@ -14099,6 +14431,7 @@
             <w:pPr>
               <w:pStyle w:val="Normal"/>
               <w:widowControl/>
+              <w:suppressAutoHyphens w:val="true"/>
               <w:spacing w:lineRule="auto" w:line="240" w:before="0" w:after="0"/>
               <w:jc w:val="start"/>
               <w:rPr>
@@ -14131,6 +14464,7 @@
             <w:pPr>
               <w:pStyle w:val="Normal"/>
               <w:widowControl/>
+              <w:suppressAutoHyphens w:val="true"/>
               <w:spacing w:lineRule="auto" w:line="240" w:before="0" w:after="0"/>
               <w:jc w:val="start"/>
               <w:rPr>
@@ -14163,6 +14497,7 @@
             <w:pPr>
               <w:pStyle w:val="Normal"/>
               <w:widowControl/>
+              <w:suppressAutoHyphens w:val="true"/>
               <w:spacing w:lineRule="auto" w:line="240" w:before="0" w:after="0"/>
               <w:jc w:val="start"/>
               <w:rPr>
@@ -14195,6 +14530,7 @@
             <w:pPr>
               <w:pStyle w:val="Normal"/>
               <w:widowControl/>
+              <w:suppressAutoHyphens w:val="true"/>
               <w:spacing w:lineRule="auto" w:line="240" w:before="0" w:after="0"/>
               <w:jc w:val="start"/>
               <w:rPr>
@@ -14230,6 +14566,7 @@
             <w:pPr>
               <w:pStyle w:val="Normal"/>
               <w:widowControl/>
+              <w:suppressAutoHyphens w:val="true"/>
               <w:spacing w:lineRule="auto" w:line="240" w:before="0" w:after="0"/>
               <w:jc w:val="start"/>
               <w:rPr>
@@ -14261,6 +14598,7 @@
             <w:pPr>
               <w:pStyle w:val="Normal"/>
               <w:widowControl/>
+              <w:suppressAutoHyphens w:val="true"/>
               <w:spacing w:lineRule="auto" w:line="240" w:before="0" w:after="0"/>
               <w:jc w:val="start"/>
               <w:rPr>
@@ -14292,6 +14630,7 @@
             <w:pPr>
               <w:pStyle w:val="Normal"/>
               <w:widowControl/>
+              <w:suppressAutoHyphens w:val="true"/>
               <w:spacing w:lineRule="auto" w:line="240" w:before="0" w:after="0"/>
               <w:jc w:val="start"/>
               <w:rPr>
@@ -14323,6 +14662,7 @@
             <w:pPr>
               <w:pStyle w:val="Normal"/>
               <w:widowControl/>
+              <w:suppressAutoHyphens w:val="true"/>
               <w:spacing w:lineRule="auto" w:line="240" w:before="0" w:after="0"/>
               <w:jc w:val="start"/>
               <w:rPr>
@@ -14354,6 +14694,7 @@
             <w:pPr>
               <w:pStyle w:val="Normal"/>
               <w:widowControl/>
+              <w:suppressAutoHyphens w:val="true"/>
               <w:spacing w:lineRule="auto" w:line="240" w:before="0" w:after="0"/>
               <w:jc w:val="start"/>
               <w:rPr>
@@ -14385,6 +14726,7 @@
             <w:pPr>
               <w:pStyle w:val="Normal"/>
               <w:widowControl/>
+              <w:suppressAutoHyphens w:val="true"/>
               <w:spacing w:lineRule="auto" w:line="240" w:before="0" w:after="0"/>
               <w:jc w:val="start"/>
               <w:rPr>
@@ -14429,6 +14771,7 @@
             <w:pPr>
               <w:pStyle w:val="Normal"/>
               <w:widowControl/>
+              <w:suppressAutoHyphens w:val="true"/>
               <w:spacing w:lineRule="auto" w:line="240" w:before="0" w:after="0"/>
               <w:jc w:val="start"/>
               <w:rPr>
@@ -14460,6 +14803,7 @@
             <w:pPr>
               <w:pStyle w:val="Normal"/>
               <w:widowControl/>
+              <w:suppressAutoHyphens w:val="true"/>
               <w:spacing w:lineRule="auto" w:line="240" w:before="0" w:after="0"/>
               <w:jc w:val="start"/>
               <w:rPr>
@@ -14491,6 +14835,7 @@
             <w:pPr>
               <w:pStyle w:val="Normal"/>
               <w:widowControl/>
+              <w:suppressAutoHyphens w:val="true"/>
               <w:spacing w:lineRule="auto" w:line="240" w:before="0" w:after="0"/>
               <w:jc w:val="start"/>
               <w:rPr>
@@ -14522,6 +14867,7 @@
             <w:pPr>
               <w:pStyle w:val="Normal"/>
               <w:widowControl/>
+              <w:suppressAutoHyphens w:val="true"/>
               <w:spacing w:lineRule="auto" w:line="240" w:before="0" w:after="0"/>
               <w:jc w:val="start"/>
               <w:rPr>
@@ -14553,6 +14899,7 @@
             <w:pPr>
               <w:pStyle w:val="Normal"/>
               <w:widowControl/>
+              <w:suppressAutoHyphens w:val="true"/>
               <w:spacing w:lineRule="auto" w:line="240" w:before="0" w:after="0"/>
               <w:jc w:val="start"/>
               <w:rPr>
@@ -14584,6 +14931,7 @@
             <w:pPr>
               <w:pStyle w:val="Normal"/>
               <w:widowControl/>
+              <w:suppressAutoHyphens w:val="true"/>
               <w:spacing w:lineRule="auto" w:line="240" w:before="0" w:after="0"/>
               <w:jc w:val="start"/>
               <w:rPr>
@@ -14628,6 +14976,7 @@
             <w:pPr>
               <w:pStyle w:val="Normal"/>
               <w:widowControl/>
+              <w:suppressAutoHyphens w:val="true"/>
               <w:spacing w:lineRule="auto" w:line="240" w:before="0" w:after="0"/>
               <w:jc w:val="start"/>
               <w:rPr>
@@ -14659,6 +15008,7 @@
             <w:pPr>
               <w:pStyle w:val="Normal"/>
               <w:widowControl/>
+              <w:suppressAutoHyphens w:val="true"/>
               <w:spacing w:lineRule="auto" w:line="240" w:before="0" w:after="0"/>
               <w:jc w:val="start"/>
               <w:rPr>
@@ -14690,6 +15040,7 @@
             <w:pPr>
               <w:pStyle w:val="Normal"/>
               <w:widowControl/>
+              <w:suppressAutoHyphens w:val="true"/>
               <w:spacing w:lineRule="auto" w:line="240" w:before="0" w:after="0"/>
               <w:jc w:val="start"/>
               <w:rPr>
@@ -14721,6 +15072,7 @@
             <w:pPr>
               <w:pStyle w:val="Normal"/>
               <w:widowControl/>
+              <w:suppressAutoHyphens w:val="true"/>
               <w:spacing w:lineRule="auto" w:line="240" w:before="0" w:after="0"/>
               <w:jc w:val="start"/>
               <w:rPr>
@@ -14752,6 +15104,7 @@
             <w:pPr>
               <w:pStyle w:val="Normal"/>
               <w:widowControl/>
+              <w:suppressAutoHyphens w:val="true"/>
               <w:spacing w:lineRule="auto" w:line="240" w:before="0" w:after="0"/>
               <w:jc w:val="start"/>
               <w:rPr>
@@ -14783,6 +15136,7 @@
             <w:pPr>
               <w:pStyle w:val="Normal"/>
               <w:widowControl/>
+              <w:suppressAutoHyphens w:val="true"/>
               <w:spacing w:lineRule="auto" w:line="240" w:before="0" w:after="0"/>
               <w:jc w:val="start"/>
               <w:rPr>
@@ -14827,6 +15181,7 @@
             <w:pPr>
               <w:pStyle w:val="Normal"/>
               <w:widowControl/>
+              <w:suppressAutoHyphens w:val="true"/>
               <w:spacing w:lineRule="auto" w:line="240" w:before="0" w:after="0"/>
               <w:jc w:val="start"/>
               <w:rPr>
@@ -14858,6 +15213,7 @@
             <w:pPr>
               <w:pStyle w:val="Normal"/>
               <w:widowControl/>
+              <w:suppressAutoHyphens w:val="true"/>
               <w:spacing w:lineRule="auto" w:line="240" w:before="0" w:after="0"/>
               <w:jc w:val="start"/>
               <w:rPr>
@@ -14889,6 +15245,7 @@
             <w:pPr>
               <w:pStyle w:val="Normal"/>
               <w:widowControl/>
+              <w:suppressAutoHyphens w:val="true"/>
               <w:spacing w:lineRule="auto" w:line="240" w:before="0" w:after="0"/>
               <w:jc w:val="start"/>
               <w:rPr>
@@ -14920,6 +15277,7 @@
             <w:pPr>
               <w:pStyle w:val="Normal"/>
               <w:widowControl/>
+              <w:suppressAutoHyphens w:val="true"/>
               <w:spacing w:lineRule="auto" w:line="240" w:before="0" w:after="0"/>
               <w:jc w:val="start"/>
               <w:rPr>
@@ -14951,6 +15309,7 @@
             <w:pPr>
               <w:pStyle w:val="Normal"/>
               <w:widowControl/>
+              <w:suppressAutoHyphens w:val="true"/>
               <w:spacing w:lineRule="auto" w:line="240" w:before="0" w:after="0"/>
               <w:jc w:val="start"/>
               <w:rPr>
@@ -14982,6 +15341,7 @@
             <w:pPr>
               <w:pStyle w:val="Normal"/>
               <w:widowControl/>
+              <w:suppressAutoHyphens w:val="true"/>
               <w:spacing w:lineRule="auto" w:line="240" w:before="0" w:after="0"/>
               <w:jc w:val="start"/>
               <w:rPr>
@@ -15026,6 +15386,7 @@
             <w:pPr>
               <w:pStyle w:val="Normal"/>
               <w:widowControl/>
+              <w:suppressAutoHyphens w:val="true"/>
               <w:spacing w:lineRule="auto" w:line="240" w:before="0" w:after="0"/>
               <w:jc w:val="start"/>
               <w:rPr>
@@ -15057,6 +15418,7 @@
             <w:pPr>
               <w:pStyle w:val="Normal"/>
               <w:widowControl/>
+              <w:suppressAutoHyphens w:val="true"/>
               <w:spacing w:lineRule="auto" w:line="240" w:before="0" w:after="0"/>
               <w:jc w:val="start"/>
               <w:rPr>
@@ -15088,6 +15450,7 @@
             <w:pPr>
               <w:pStyle w:val="Normal"/>
               <w:widowControl/>
+              <w:suppressAutoHyphens w:val="true"/>
               <w:spacing w:lineRule="auto" w:line="240" w:before="0" w:after="0"/>
               <w:jc w:val="start"/>
               <w:rPr>
@@ -15119,6 +15482,7 @@
             <w:pPr>
               <w:pStyle w:val="Normal"/>
               <w:widowControl/>
+              <w:suppressAutoHyphens w:val="true"/>
               <w:spacing w:lineRule="auto" w:line="240" w:before="0" w:after="0"/>
               <w:jc w:val="start"/>
               <w:rPr>
@@ -15150,6 +15514,7 @@
             <w:pPr>
               <w:pStyle w:val="Normal"/>
               <w:widowControl/>
+              <w:suppressAutoHyphens w:val="true"/>
               <w:spacing w:lineRule="auto" w:line="240" w:before="0" w:after="0"/>
               <w:jc w:val="start"/>
               <w:rPr>
@@ -15181,6 +15546,7 @@
             <w:pPr>
               <w:pStyle w:val="Normal"/>
               <w:widowControl/>
+              <w:suppressAutoHyphens w:val="true"/>
               <w:spacing w:lineRule="auto" w:line="240" w:before="0" w:after="0"/>
               <w:jc w:val="start"/>
               <w:rPr>
@@ -15313,6 +15679,7 @@
             <w:pPr>
               <w:pStyle w:val="Normal"/>
               <w:widowControl/>
+              <w:suppressAutoHyphens w:val="true"/>
               <w:spacing w:lineRule="auto" w:line="240" w:before="0" w:after="0"/>
               <w:jc w:val="start"/>
               <w:rPr>
@@ -15345,6 +15712,7 @@
             <w:pPr>
               <w:pStyle w:val="Normal"/>
               <w:widowControl/>
+              <w:suppressAutoHyphens w:val="true"/>
               <w:spacing w:lineRule="auto" w:line="240" w:before="0" w:after="0"/>
               <w:jc w:val="start"/>
               <w:rPr>
@@ -15377,6 +15745,7 @@
             <w:pPr>
               <w:pStyle w:val="Normal"/>
               <w:widowControl/>
+              <w:suppressAutoHyphens w:val="true"/>
               <w:spacing w:lineRule="auto" w:line="240" w:before="0" w:after="0"/>
               <w:jc w:val="start"/>
               <w:rPr>
@@ -15409,6 +15778,7 @@
             <w:pPr>
               <w:pStyle w:val="Normal"/>
               <w:widowControl/>
+              <w:suppressAutoHyphens w:val="true"/>
               <w:spacing w:lineRule="auto" w:line="240" w:before="0" w:after="0"/>
               <w:jc w:val="start"/>
               <w:rPr>
@@ -15444,6 +15814,7 @@
             <w:pPr>
               <w:pStyle w:val="Normal"/>
               <w:widowControl/>
+              <w:suppressAutoHyphens w:val="true"/>
               <w:spacing w:lineRule="auto" w:line="240" w:before="0" w:after="0"/>
               <w:jc w:val="start"/>
               <w:rPr>
@@ -15475,6 +15846,7 @@
             <w:pPr>
               <w:pStyle w:val="Normal"/>
               <w:widowControl/>
+              <w:suppressAutoHyphens w:val="true"/>
               <w:spacing w:lineRule="auto" w:line="240" w:before="0" w:after="0"/>
               <w:jc w:val="start"/>
               <w:rPr>
@@ -15506,6 +15878,7 @@
             <w:pPr>
               <w:pStyle w:val="Normal"/>
               <w:widowControl/>
+              <w:suppressAutoHyphens w:val="true"/>
               <w:spacing w:lineRule="auto" w:line="240" w:before="0" w:after="0"/>
               <w:jc w:val="start"/>
               <w:rPr>
@@ -15547,6 +15920,7 @@
             <w:pPr>
               <w:pStyle w:val="Normal"/>
               <w:widowControl/>
+              <w:suppressAutoHyphens w:val="true"/>
               <w:spacing w:lineRule="auto" w:line="240" w:before="0" w:after="0"/>
               <w:jc w:val="start"/>
               <w:rPr>
@@ -15581,6 +15955,7 @@
             <w:pPr>
               <w:pStyle w:val="Normal"/>
               <w:widowControl/>
+              <w:suppressAutoHyphens w:val="true"/>
               <w:spacing w:lineRule="auto" w:line="240" w:before="0" w:after="0"/>
               <w:jc w:val="start"/>
               <w:rPr>
@@ -15612,6 +15987,7 @@
             <w:pPr>
               <w:pStyle w:val="Normal"/>
               <w:widowControl/>
+              <w:suppressAutoHyphens w:val="true"/>
               <w:spacing w:lineRule="auto" w:line="240" w:before="0" w:after="0"/>
               <w:jc w:val="start"/>
               <w:rPr>
@@ -15643,6 +16019,7 @@
             <w:pPr>
               <w:pStyle w:val="Normal"/>
               <w:widowControl/>
+              <w:suppressAutoHyphens w:val="true"/>
               <w:spacing w:lineRule="auto" w:line="240" w:before="0" w:after="0"/>
               <w:jc w:val="start"/>
               <w:rPr>
@@ -15674,6 +16051,7 @@
             <w:pPr>
               <w:pStyle w:val="Normal"/>
               <w:widowControl/>
+              <w:suppressAutoHyphens w:val="true"/>
               <w:spacing w:lineRule="auto" w:line="240" w:before="0" w:after="0"/>
               <w:jc w:val="start"/>
               <w:rPr>
@@ -15729,7 +16107,7 @@
           <w:i w:val="false"/>
           <w:sz w:val="24"/>
         </w:rPr>
-        <w:t>Нагрузочные измерения выполнялись по воспроизводимому протоколу. Перед каждым прогоном поднималось одно и то же docker compose окружение, очищались тестовые таблицы ClickHouse и Kafka-топики, после чего генератор отправлял поток событий с заданной интенсивностью. Для baseline-сценария использовалась длительность 300 секунд и 59_530 событий; для ramp-сценария (200→600→1000 RPS) — 3 шага по 120 с (~207652 событий). Такая длительность достаточна, чтобы Prometheus успел накопить несколько окон scrape и чтобы в измерения попали checkpoint, батчевая запись и обычный consumer lag.</w:t>
+        <w:t>Нагрузочные измерения выполнялись по воспроизводимому протоколу. Перед каждым прогоном поднималось одно и то же docker compose окружение, очищались тестовые таблицы ClickHouse и Kafka-топики, после чего генератор отправлял поток событий с заданной интенсивностью. Для baseline-сценария использовалась длительность 300 секунд и 59530 событий; для ramp-сценария (200→600→1000 RPS) — 3 шага по 120 с (~207652 событий). Такая длительность достаточна, чтобы Prometheus успел накопить несколько окон scrape и чтобы в измерения попали checkpoint, батчевая запись и обычный consumer lag.</w:t>
       </w:r>
     </w:p>
     <w:p>
@@ -15798,6 +16176,7 @@
             <w:pPr>
               <w:pStyle w:val="Normal"/>
               <w:widowControl/>
+              <w:suppressAutoHyphens w:val="true"/>
               <w:spacing w:lineRule="auto" w:line="240" w:before="0" w:after="0"/>
               <w:jc w:val="start"/>
               <w:rPr>
@@ -15830,6 +16209,7 @@
             <w:pPr>
               <w:pStyle w:val="Normal"/>
               <w:widowControl/>
+              <w:suppressAutoHyphens w:val="true"/>
               <w:spacing w:lineRule="auto" w:line="240" w:before="0" w:after="0"/>
               <w:jc w:val="start"/>
               <w:rPr>
@@ -15862,6 +16242,7 @@
             <w:pPr>
               <w:pStyle w:val="Normal"/>
               <w:widowControl/>
+              <w:suppressAutoHyphens w:val="true"/>
               <w:spacing w:lineRule="auto" w:line="240" w:before="0" w:after="0"/>
               <w:jc w:val="start"/>
               <w:rPr>
@@ -15897,6 +16278,7 @@
             <w:pPr>
               <w:pStyle w:val="Normal"/>
               <w:widowControl/>
+              <w:suppressAutoHyphens w:val="true"/>
               <w:spacing w:lineRule="auto" w:line="240" w:before="0" w:after="0"/>
               <w:jc w:val="start"/>
               <w:rPr>
@@ -15928,6 +16310,7 @@
             <w:pPr>
               <w:pStyle w:val="Normal"/>
               <w:widowControl/>
+              <w:suppressAutoHyphens w:val="true"/>
               <w:spacing w:lineRule="auto" w:line="240" w:before="0" w:after="0"/>
               <w:jc w:val="start"/>
               <w:rPr>
@@ -15959,6 +16342,7 @@
             <w:pPr>
               <w:pStyle w:val="Normal"/>
               <w:widowControl/>
+              <w:suppressAutoHyphens w:val="true"/>
               <w:spacing w:lineRule="auto" w:line="240" w:before="0" w:after="0"/>
               <w:jc w:val="start"/>
               <w:rPr>
@@ -15993,6 +16377,7 @@
             <w:pPr>
               <w:pStyle w:val="Normal"/>
               <w:widowControl/>
+              <w:suppressAutoHyphens w:val="true"/>
               <w:spacing w:lineRule="auto" w:line="240" w:before="0" w:after="0"/>
               <w:jc w:val="start"/>
               <w:rPr>
@@ -16024,6 +16409,7 @@
             <w:pPr>
               <w:pStyle w:val="Normal"/>
               <w:widowControl/>
+              <w:suppressAutoHyphens w:val="true"/>
               <w:spacing w:lineRule="auto" w:line="240" w:before="0" w:after="0"/>
               <w:jc w:val="start"/>
               <w:rPr>
@@ -16055,6 +16441,7 @@
             <w:pPr>
               <w:pStyle w:val="Normal"/>
               <w:widowControl/>
+              <w:suppressAutoHyphens w:val="true"/>
               <w:spacing w:lineRule="auto" w:line="240" w:before="0" w:after="0"/>
               <w:jc w:val="start"/>
               <w:rPr>
@@ -16089,6 +16476,7 @@
             <w:pPr>
               <w:pStyle w:val="Normal"/>
               <w:widowControl/>
+              <w:suppressAutoHyphens w:val="true"/>
               <w:spacing w:lineRule="auto" w:line="240" w:before="0" w:after="0"/>
               <w:jc w:val="start"/>
               <w:rPr>
@@ -16120,6 +16508,7 @@
             <w:pPr>
               <w:pStyle w:val="Normal"/>
               <w:widowControl/>
+              <w:suppressAutoHyphens w:val="true"/>
               <w:spacing w:lineRule="auto" w:line="240" w:before="0" w:after="0"/>
               <w:jc w:val="start"/>
               <w:rPr>
@@ -16151,6 +16540,7 @@
             <w:pPr>
               <w:pStyle w:val="Normal"/>
               <w:widowControl/>
+              <w:suppressAutoHyphens w:val="true"/>
               <w:spacing w:lineRule="auto" w:line="240" w:before="0" w:after="0"/>
               <w:jc w:val="start"/>
               <w:rPr>
@@ -16185,6 +16575,7 @@
             <w:pPr>
               <w:pStyle w:val="Normal"/>
               <w:widowControl/>
+              <w:suppressAutoHyphens w:val="true"/>
               <w:spacing w:lineRule="auto" w:line="240" w:before="0" w:after="0"/>
               <w:jc w:val="start"/>
               <w:rPr>
@@ -16216,6 +16607,7 @@
             <w:pPr>
               <w:pStyle w:val="Normal"/>
               <w:widowControl/>
+              <w:suppressAutoHyphens w:val="true"/>
               <w:spacing w:lineRule="auto" w:line="240" w:before="0" w:after="0"/>
               <w:jc w:val="start"/>
               <w:rPr>
@@ -16247,6 +16639,7 @@
             <w:pPr>
               <w:pStyle w:val="Normal"/>
               <w:widowControl/>
+              <w:suppressAutoHyphens w:val="true"/>
               <w:spacing w:lineRule="auto" w:line="240" w:before="0" w:after="0"/>
               <w:jc w:val="start"/>
               <w:rPr>
@@ -16281,6 +16674,7 @@
             <w:pPr>
               <w:pStyle w:val="Normal"/>
               <w:widowControl/>
+              <w:suppressAutoHyphens w:val="true"/>
               <w:spacing w:lineRule="auto" w:line="240" w:before="0" w:after="0"/>
               <w:jc w:val="start"/>
               <w:rPr>
@@ -16312,6 +16706,7 @@
             <w:pPr>
               <w:pStyle w:val="Normal"/>
               <w:widowControl/>
+              <w:suppressAutoHyphens w:val="true"/>
               <w:spacing w:lineRule="auto" w:line="240" w:before="0" w:after="0"/>
               <w:jc w:val="start"/>
               <w:rPr>
@@ -16343,6 +16738,7 @@
             <w:pPr>
               <w:pStyle w:val="Normal"/>
               <w:widowControl/>
+              <w:suppressAutoHyphens w:val="true"/>
               <w:spacing w:lineRule="auto" w:line="240" w:before="0" w:after="0"/>
               <w:jc w:val="start"/>
               <w:rPr>
@@ -16377,6 +16773,7 @@
             <w:pPr>
               <w:pStyle w:val="Normal"/>
               <w:widowControl/>
+              <w:suppressAutoHyphens w:val="true"/>
               <w:spacing w:lineRule="auto" w:line="240" w:before="0" w:after="0"/>
               <w:jc w:val="start"/>
               <w:rPr>
@@ -16408,6 +16805,7 @@
             <w:pPr>
               <w:pStyle w:val="Normal"/>
               <w:widowControl/>
+              <w:suppressAutoHyphens w:val="true"/>
               <w:spacing w:lineRule="auto" w:line="240" w:before="0" w:after="0"/>
               <w:jc w:val="start"/>
               <w:rPr>
@@ -16439,6 +16837,7 @@
             <w:pPr>
               <w:pStyle w:val="Normal"/>
               <w:widowControl/>
+              <w:suppressAutoHyphens w:val="true"/>
               <w:spacing w:lineRule="auto" w:line="240" w:before="0" w:after="0"/>
               <w:jc w:val="start"/>
               <w:rPr>
@@ -17043,25 +17442,7 @@
           <w:i w:val="false"/>
           <w:sz w:val="24"/>
         </w:rPr>
-        <w:t xml:space="preserve">Исходный код проекта размещён на GitHub </w:t>
-      </w:r>
-      <w:r>
-        <w:rPr>
-          <w:rFonts w:ascii="Times New Roman" w:hAnsi="Times New Roman"/>
-          <w:b w:val="false"/>
-          <w:i w:val="false"/>
-          <w:sz w:val="24"/>
-        </w:rPr>
-        <w:t>(https://github.com/icheve/thesis)</w:t>
-      </w:r>
-      <w:r>
-        <w:rPr>
-          <w:rFonts w:ascii="Times New Roman" w:hAnsi="Times New Roman"/>
-          <w:b w:val="false"/>
-          <w:i w:val="false"/>
-          <w:sz w:val="24"/>
-        </w:rPr>
-        <w:t>. Использование ИИ-инструментов: при написании данной работы использовался GitHub Copilot (генерация шаблонного кода операторов, автодополнение SQL-запросов) и Claude (структурирование текста документации). Вся бизнес-логика, архитектурные решения и результаты тестирования разработаны автором самостоятельно.</w:t>
+        <w:t>Исходный код проекта размещён на GitHub (https://github.com/icheve/thesis). Использование ИИ-инструментов: при написании данной работы использовался GitHub Copilot (генерация шаблонного кода операторов, автодополнение SQL-запросов) и Claude (структурирование текста документации). Вся бизнес-логика, архитектурные решения и результаты тестирования разработаны автором самостоятельно.</w:t>
       </w:r>
     </w:p>
     <w:p>
@@ -17111,6 +17492,7 @@
             <w:pPr>
               <w:pStyle w:val="Normal"/>
               <w:widowControl/>
+              <w:suppressAutoHyphens w:val="true"/>
               <w:spacing w:lineRule="auto" w:line="240" w:before="0" w:after="0"/>
               <w:jc w:val="start"/>
               <w:rPr>
@@ -17143,6 +17525,7 @@
             <w:pPr>
               <w:pStyle w:val="Normal"/>
               <w:widowControl/>
+              <w:suppressAutoHyphens w:val="true"/>
               <w:spacing w:lineRule="auto" w:line="240" w:before="0" w:after="0"/>
               <w:jc w:val="start"/>
               <w:rPr>
@@ -17178,6 +17561,7 @@
             <w:pPr>
               <w:pStyle w:val="Normal"/>
               <w:widowControl/>
+              <w:suppressAutoHyphens w:val="true"/>
               <w:spacing w:lineRule="auto" w:line="240" w:before="0" w:after="0"/>
               <w:jc w:val="start"/>
               <w:rPr>
@@ -17209,6 +17593,7 @@
             <w:pPr>
               <w:pStyle w:val="Normal"/>
               <w:widowControl/>
+              <w:suppressAutoHyphens w:val="true"/>
               <w:spacing w:lineRule="auto" w:line="240" w:before="0" w:after="0"/>
               <w:jc w:val="start"/>
               <w:rPr>
@@ -17243,6 +17628,7 @@
             <w:pPr>
               <w:pStyle w:val="Normal"/>
               <w:widowControl/>
+              <w:suppressAutoHyphens w:val="true"/>
               <w:spacing w:lineRule="auto" w:line="240" w:before="0" w:after="0"/>
               <w:jc w:val="start"/>
               <w:rPr>
@@ -17274,6 +17660,7 @@
             <w:pPr>
               <w:pStyle w:val="Normal"/>
               <w:widowControl/>
+              <w:suppressAutoHyphens w:val="true"/>
               <w:spacing w:lineRule="auto" w:line="240" w:before="0" w:after="0"/>
               <w:jc w:val="start"/>
               <w:rPr>
@@ -17308,6 +17695,7 @@
             <w:pPr>
               <w:pStyle w:val="Normal"/>
               <w:widowControl/>
+              <w:suppressAutoHyphens w:val="true"/>
               <w:spacing w:lineRule="auto" w:line="240" w:before="0" w:after="0"/>
               <w:jc w:val="start"/>
               <w:rPr>
@@ -17339,6 +17727,7 @@
             <w:pPr>
               <w:pStyle w:val="Normal"/>
               <w:widowControl/>
+              <w:suppressAutoHyphens w:val="true"/>
               <w:spacing w:lineRule="auto" w:line="240" w:before="0" w:after="0"/>
               <w:jc w:val="start"/>
               <w:rPr>
@@ -17373,6 +17762,7 @@
             <w:pPr>
               <w:pStyle w:val="Normal"/>
               <w:widowControl/>
+              <w:suppressAutoHyphens w:val="true"/>
               <w:spacing w:lineRule="auto" w:line="240" w:before="0" w:after="0"/>
               <w:jc w:val="start"/>
               <w:rPr>
@@ -17404,6 +17794,7 @@
             <w:pPr>
               <w:pStyle w:val="Normal"/>
               <w:widowControl/>
+              <w:suppressAutoHyphens w:val="true"/>
               <w:spacing w:lineRule="auto" w:line="240" w:before="0" w:after="0"/>
               <w:jc w:val="start"/>
               <w:rPr>
@@ -17438,6 +17829,7 @@
             <w:pPr>
               <w:pStyle w:val="Normal"/>
               <w:widowControl/>
+              <w:suppressAutoHyphens w:val="true"/>
               <w:spacing w:lineRule="auto" w:line="240" w:before="0" w:after="0"/>
               <w:jc w:val="start"/>
               <w:rPr>
@@ -17469,6 +17861,7 @@
             <w:pPr>
               <w:pStyle w:val="Normal"/>
               <w:widowControl/>
+              <w:suppressAutoHyphens w:val="true"/>
               <w:spacing w:lineRule="auto" w:line="240" w:before="0" w:after="0"/>
               <w:jc w:val="start"/>
               <w:rPr>
@@ -17503,6 +17896,7 @@
             <w:pPr>
               <w:pStyle w:val="Normal"/>
               <w:widowControl/>
+              <w:suppressAutoHyphens w:val="true"/>
               <w:spacing w:lineRule="auto" w:line="240" w:before="0" w:after="0"/>
               <w:jc w:val="start"/>
               <w:rPr>
@@ -17534,6 +17928,7 @@
             <w:pPr>
               <w:pStyle w:val="Normal"/>
               <w:widowControl/>
+              <w:suppressAutoHyphens w:val="true"/>
               <w:spacing w:lineRule="auto" w:line="240" w:before="0" w:after="0"/>
               <w:jc w:val="start"/>
               <w:rPr>
@@ -17568,6 +17963,7 @@
             <w:pPr>
               <w:pStyle w:val="Normal"/>
               <w:widowControl/>
+              <w:suppressAutoHyphens w:val="true"/>
               <w:spacing w:lineRule="auto" w:line="240" w:before="0" w:after="0"/>
               <w:jc w:val="start"/>
               <w:rPr>
@@ -17599,6 +17995,7 @@
             <w:pPr>
               <w:pStyle w:val="Normal"/>
               <w:widowControl/>
+              <w:suppressAutoHyphens w:val="true"/>
               <w:spacing w:lineRule="auto" w:line="240" w:before="0" w:after="0"/>
               <w:jc w:val="start"/>
               <w:rPr>
@@ -17687,6 +18084,7 @@
             <w:pPr>
               <w:pStyle w:val="Normal"/>
               <w:widowControl/>
+              <w:suppressAutoHyphens w:val="true"/>
               <w:spacing w:lineRule="auto" w:line="240" w:before="0" w:after="0"/>
               <w:jc w:val="start"/>
               <w:rPr>
@@ -17719,6 +18117,7 @@
             <w:pPr>
               <w:pStyle w:val="Normal"/>
               <w:widowControl/>
+              <w:suppressAutoHyphens w:val="true"/>
               <w:spacing w:lineRule="auto" w:line="240" w:before="0" w:after="0"/>
               <w:jc w:val="start"/>
               <w:rPr>
@@ -17754,6 +18153,7 @@
             <w:pPr>
               <w:pStyle w:val="Normal"/>
               <w:widowControl/>
+              <w:suppressAutoHyphens w:val="true"/>
               <w:spacing w:lineRule="auto" w:line="240" w:before="0" w:after="0"/>
               <w:jc w:val="start"/>
               <w:rPr>
@@ -17785,6 +18185,7 @@
             <w:pPr>
               <w:pStyle w:val="Normal"/>
               <w:widowControl/>
+              <w:suppressAutoHyphens w:val="true"/>
               <w:spacing w:lineRule="auto" w:line="240" w:before="0" w:after="0"/>
               <w:jc w:val="start"/>
               <w:rPr>
@@ -17819,6 +18220,7 @@
             <w:pPr>
               <w:pStyle w:val="Normal"/>
               <w:widowControl/>
+              <w:suppressAutoHyphens w:val="true"/>
               <w:spacing w:lineRule="auto" w:line="240" w:before="0" w:after="0"/>
               <w:jc w:val="start"/>
               <w:rPr>
@@ -17850,6 +18252,7 @@
             <w:pPr>
               <w:pStyle w:val="Normal"/>
               <w:widowControl/>
+              <w:suppressAutoHyphens w:val="true"/>
               <w:spacing w:lineRule="auto" w:line="240" w:before="0" w:after="0"/>
               <w:jc w:val="start"/>
               <w:rPr>
@@ -17884,6 +18287,7 @@
             <w:pPr>
               <w:pStyle w:val="Normal"/>
               <w:widowControl/>
+              <w:suppressAutoHyphens w:val="true"/>
               <w:spacing w:lineRule="auto" w:line="240" w:before="0" w:after="0"/>
               <w:jc w:val="start"/>
               <w:rPr>
@@ -17915,6 +18319,7 @@
             <w:pPr>
               <w:pStyle w:val="Normal"/>
               <w:widowControl/>
+              <w:suppressAutoHyphens w:val="true"/>
               <w:spacing w:lineRule="auto" w:line="240" w:before="0" w:after="0"/>
               <w:jc w:val="start"/>
               <w:rPr>
@@ -17949,6 +18354,7 @@
             <w:pPr>
               <w:pStyle w:val="Normal"/>
               <w:widowControl/>
+              <w:suppressAutoHyphens w:val="true"/>
               <w:spacing w:lineRule="auto" w:line="240" w:before="0" w:after="0"/>
               <w:jc w:val="start"/>
               <w:rPr>
@@ -17980,6 +18386,7 @@
             <w:pPr>
               <w:pStyle w:val="Normal"/>
               <w:widowControl/>
+              <w:suppressAutoHyphens w:val="true"/>
               <w:spacing w:lineRule="auto" w:line="240" w:before="0" w:after="0"/>
               <w:jc w:val="start"/>
               <w:rPr>
@@ -18014,6 +18421,7 @@
             <w:pPr>
               <w:pStyle w:val="Normal"/>
               <w:widowControl/>
+              <w:suppressAutoHyphens w:val="true"/>
               <w:spacing w:lineRule="auto" w:line="240" w:before="0" w:after="0"/>
               <w:jc w:val="start"/>
               <w:rPr>
@@ -18045,6 +18453,7 @@
             <w:pPr>
               <w:pStyle w:val="Normal"/>
               <w:widowControl/>
+              <w:suppressAutoHyphens w:val="true"/>
               <w:spacing w:lineRule="auto" w:line="240" w:before="0" w:after="0"/>
               <w:jc w:val="start"/>
               <w:rPr>
@@ -18079,6 +18488,7 @@
             <w:pPr>
               <w:pStyle w:val="Normal"/>
               <w:widowControl/>
+              <w:suppressAutoHyphens w:val="true"/>
               <w:spacing w:lineRule="auto" w:line="240" w:before="0" w:after="0"/>
               <w:jc w:val="start"/>
               <w:rPr>
@@ -18110,6 +18520,7 @@
             <w:pPr>
               <w:pStyle w:val="Normal"/>
               <w:widowControl/>
+              <w:suppressAutoHyphens w:val="true"/>
               <w:spacing w:lineRule="auto" w:line="240" w:before="0" w:after="0"/>
               <w:jc w:val="start"/>
               <w:rPr>
@@ -18144,6 +18555,7 @@
             <w:pPr>
               <w:pStyle w:val="Normal"/>
               <w:widowControl/>
+              <w:suppressAutoHyphens w:val="true"/>
               <w:spacing w:lineRule="auto" w:line="240" w:before="0" w:after="0"/>
               <w:jc w:val="start"/>
               <w:rPr>
@@ -18175,6 +18587,7 @@
             <w:pPr>
               <w:pStyle w:val="Normal"/>
               <w:widowControl/>
+              <w:suppressAutoHyphens w:val="true"/>
               <w:spacing w:lineRule="auto" w:line="240" w:before="0" w:after="0"/>
               <w:jc w:val="start"/>
               <w:rPr>
@@ -18209,6 +18622,7 @@
             <w:pPr>
               <w:pStyle w:val="Normal"/>
               <w:widowControl/>
+              <w:suppressAutoHyphens w:val="true"/>
               <w:spacing w:lineRule="auto" w:line="240" w:before="0" w:after="0"/>
               <w:jc w:val="start"/>
               <w:rPr>
@@ -18240,6 +18654,7 @@
             <w:pPr>
               <w:pStyle w:val="Normal"/>
               <w:widowControl/>
+              <w:suppressAutoHyphens w:val="true"/>
               <w:spacing w:lineRule="auto" w:line="240" w:before="0" w:after="0"/>
               <w:jc w:val="start"/>
               <w:rPr>
@@ -18274,6 +18689,7 @@
             <w:pPr>
               <w:pStyle w:val="Normal"/>
               <w:widowControl/>
+              <w:suppressAutoHyphens w:val="true"/>
               <w:spacing w:lineRule="auto" w:line="240" w:before="0" w:after="0"/>
               <w:jc w:val="start"/>
               <w:rPr>
@@ -18305,6 +18721,7 @@
             <w:pPr>
               <w:pStyle w:val="Normal"/>
               <w:widowControl/>
+              <w:suppressAutoHyphens w:val="true"/>
               <w:spacing w:lineRule="auto" w:line="240" w:before="0" w:after="0"/>
               <w:jc w:val="start"/>
               <w:rPr>
@@ -18339,6 +18756,7 @@
             <w:pPr>
               <w:pStyle w:val="Normal"/>
               <w:widowControl/>
+              <w:suppressAutoHyphens w:val="true"/>
               <w:spacing w:lineRule="auto" w:line="240" w:before="0" w:after="0"/>
               <w:jc w:val="start"/>
               <w:rPr>
@@ -18370,6 +18788,7 @@
             <w:pPr>
               <w:pStyle w:val="Normal"/>
               <w:widowControl/>
+              <w:suppressAutoHyphens w:val="true"/>
               <w:spacing w:lineRule="auto" w:line="240" w:before="0" w:after="0"/>
               <w:jc w:val="start"/>
               <w:rPr>
@@ -18517,6 +18936,7 @@
         </w:tabs>
         <w:ind w:start="1080" w:hanging="360"/>
       </w:pPr>
+      <w:rPr/>
     </w:lvl>
     <w:lvl w:ilvl="2">
       <w:start w:val="1"/>
@@ -18529,6 +18949,7 @@
         </w:tabs>
         <w:ind w:start="1440" w:hanging="360"/>
       </w:pPr>
+      <w:rPr/>
     </w:lvl>
     <w:lvl w:ilvl="3">
       <w:start w:val="1"/>
@@ -18541,6 +18962,7 @@
         </w:tabs>
         <w:ind w:start="1800" w:hanging="360"/>
       </w:pPr>
+      <w:rPr/>
     </w:lvl>
     <w:lvl w:ilvl="4">
       <w:start w:val="1"/>
@@ -18553,6 +18975,7 @@
         </w:tabs>
         <w:ind w:start="2160" w:hanging="360"/>
       </w:pPr>
+      <w:rPr/>
     </w:lvl>
     <w:lvl w:ilvl="5">
       <w:start w:val="1"/>
@@ -18565,6 +18988,7 @@
         </w:tabs>
         <w:ind w:start="2520" w:hanging="360"/>
       </w:pPr>
+      <w:rPr/>
     </w:lvl>
     <w:lvl w:ilvl="6">
       <w:start w:val="1"/>
@@ -18577,6 +19001,7 @@
         </w:tabs>
         <w:ind w:start="2880" w:hanging="360"/>
       </w:pPr>
+      <w:rPr/>
     </w:lvl>
     <w:lvl w:ilvl="7">
       <w:start w:val="1"/>
@@ -18589,6 +19014,7 @@
         </w:tabs>
         <w:ind w:start="3240" w:hanging="360"/>
       </w:pPr>
+      <w:rPr/>
     </w:lvl>
     <w:lvl w:ilvl="8">
       <w:start w:val="1"/>
@@ -18601,6 +19027,7 @@
         </w:tabs>
         <w:ind w:start="3600" w:hanging="360"/>
       </w:pPr>
+      <w:rPr/>
     </w:lvl>
   </w:abstractNum>
   <w:abstractNum w:abstractNumId="2">
@@ -18630,6 +19057,7 @@
         </w:tabs>
         <w:ind w:start="1080" w:hanging="360"/>
       </w:pPr>
+      <w:rPr/>
     </w:lvl>
     <w:lvl w:ilvl="2">
       <w:start w:val="1"/>
@@ -18642,6 +19070,7 @@
         </w:tabs>
         <w:ind w:start="1440" w:hanging="360"/>
       </w:pPr>
+      <w:rPr/>
     </w:lvl>
     <w:lvl w:ilvl="3">
       <w:start w:val="1"/>
@@ -18654,6 +19083,7 @@
         </w:tabs>
         <w:ind w:start="1800" w:hanging="360"/>
       </w:pPr>
+      <w:rPr/>
     </w:lvl>
     <w:lvl w:ilvl="4">
       <w:start w:val="1"/>
@@ -18666,6 +19096,7 @@
         </w:tabs>
         <w:ind w:start="2160" w:hanging="360"/>
       </w:pPr>
+      <w:rPr/>
     </w:lvl>
     <w:lvl w:ilvl="5">
       <w:start w:val="1"/>
@@ -18678,6 +19109,7 @@
         </w:tabs>
         <w:ind w:start="2520" w:hanging="360"/>
       </w:pPr>
+      <w:rPr/>
     </w:lvl>
     <w:lvl w:ilvl="6">
       <w:start w:val="1"/>
@@ -18690,6 +19122,7 @@
         </w:tabs>
         <w:ind w:start="2880" w:hanging="360"/>
       </w:pPr>
+      <w:rPr/>
     </w:lvl>
     <w:lvl w:ilvl="7">
       <w:start w:val="1"/>
@@ -18702,6 +19135,7 @@
         </w:tabs>
         <w:ind w:start="3240" w:hanging="360"/>
       </w:pPr>
+      <w:rPr/>
     </w:lvl>
     <w:lvl w:ilvl="8">
       <w:start w:val="1"/>
@@ -18714,6 +19148,7 @@
         </w:tabs>
         <w:ind w:start="3600" w:hanging="360"/>
       </w:pPr>
+      <w:rPr/>
     </w:lvl>
   </w:abstractNum>
   <w:abstractNum w:abstractNumId="3">
@@ -18743,6 +19178,7 @@
         </w:tabs>
         <w:ind w:start="1080" w:hanging="360"/>
       </w:pPr>
+      <w:rPr/>
     </w:lvl>
     <w:lvl w:ilvl="2">
       <w:start w:val="1"/>
@@ -18755,6 +19191,7 @@
         </w:tabs>
         <w:ind w:start="1440" w:hanging="360"/>
       </w:pPr>
+      <w:rPr/>
     </w:lvl>
     <w:lvl w:ilvl="3">
       <w:start w:val="1"/>
@@ -18767,6 +19204,7 @@
         </w:tabs>
         <w:ind w:start="1800" w:hanging="360"/>
       </w:pPr>
+      <w:rPr/>
     </w:lvl>
     <w:lvl w:ilvl="4">
       <w:start w:val="1"/>
@@ -18779,6 +19217,7 @@
         </w:tabs>
         <w:ind w:start="2160" w:hanging="360"/>
       </w:pPr>
+      <w:rPr/>
     </w:lvl>
     <w:lvl w:ilvl="5">
       <w:start w:val="1"/>
@@ -18791,6 +19230,7 @@
         </w:tabs>
         <w:ind w:start="2520" w:hanging="360"/>
       </w:pPr>
+      <w:rPr/>
     </w:lvl>
     <w:lvl w:ilvl="6">
       <w:start w:val="1"/>
@@ -18803,6 +19243,7 @@
         </w:tabs>
         <w:ind w:start="2880" w:hanging="360"/>
       </w:pPr>
+      <w:rPr/>
     </w:lvl>
     <w:lvl w:ilvl="7">
       <w:start w:val="1"/>
@@ -18815,6 +19256,7 @@
         </w:tabs>
         <w:ind w:start="3240" w:hanging="360"/>
       </w:pPr>
+      <w:rPr/>
     </w:lvl>
     <w:lvl w:ilvl="8">
       <w:start w:val="1"/>
@@ -18827,6 +19269,7 @@
         </w:tabs>
         <w:ind w:start="3600" w:hanging="360"/>
       </w:pPr>
+      <w:rPr/>
     </w:lvl>
   </w:abstractNum>
   <w:abstractNum w:abstractNumId="4">
@@ -18854,6 +19297,7 @@
         </w:tabs>
         <w:ind w:start="1080" w:hanging="360"/>
       </w:pPr>
+      <w:rPr/>
     </w:lvl>
     <w:lvl w:ilvl="2">
       <w:start w:val="1"/>
@@ -18866,6 +19310,7 @@
         </w:tabs>
         <w:ind w:start="1440" w:hanging="360"/>
       </w:pPr>
+      <w:rPr/>
     </w:lvl>
     <w:lvl w:ilvl="3">
       <w:start w:val="1"/>
@@ -18878,6 +19323,7 @@
         </w:tabs>
         <w:ind w:start="1800" w:hanging="360"/>
       </w:pPr>
+      <w:rPr/>
     </w:lvl>
     <w:lvl w:ilvl="4">
       <w:start w:val="1"/>
@@ -18890,6 +19336,7 @@
         </w:tabs>
         <w:ind w:start="2160" w:hanging="360"/>
       </w:pPr>
+      <w:rPr/>
     </w:lvl>
     <w:lvl w:ilvl="5">
       <w:start w:val="1"/>
@@ -18902,6 +19349,7 @@
         </w:tabs>
         <w:ind w:start="2520" w:hanging="360"/>
       </w:pPr>
+      <w:rPr/>
     </w:lvl>
     <w:lvl w:ilvl="6">
       <w:start w:val="1"/>
@@ -18914,6 +19362,7 @@
         </w:tabs>
         <w:ind w:start="2880" w:hanging="360"/>
       </w:pPr>
+      <w:rPr/>
     </w:lvl>
     <w:lvl w:ilvl="7">
       <w:start w:val="1"/>
@@ -18926,6 +19375,7 @@
         </w:tabs>
         <w:ind w:start="3240" w:hanging="360"/>
       </w:pPr>
+      <w:rPr/>
     </w:lvl>
     <w:lvl w:ilvl="8">
       <w:start w:val="1"/>
@@ -18938,6 +19388,7 @@
         </w:tabs>
         <w:ind w:start="3600" w:hanging="360"/>
       </w:pPr>
+      <w:rPr/>
     </w:lvl>
   </w:abstractNum>
   <w:abstractNum w:abstractNumId="5">
@@ -18965,6 +19416,7 @@
         </w:tabs>
         <w:ind w:start="1080" w:hanging="360"/>
       </w:pPr>
+      <w:rPr/>
     </w:lvl>
     <w:lvl w:ilvl="2">
       <w:start w:val="1"/>
@@ -18977,6 +19429,7 @@
         </w:tabs>
         <w:ind w:start="1440" w:hanging="360"/>
       </w:pPr>
+      <w:rPr/>
     </w:lvl>
     <w:lvl w:ilvl="3">
       <w:start w:val="1"/>
@@ -18989,6 +19442,7 @@
         </w:tabs>
         <w:ind w:start="1800" w:hanging="360"/>
       </w:pPr>
+      <w:rPr/>
     </w:lvl>
     <w:lvl w:ilvl="4">
       <w:start w:val="1"/>
@@ -19001,6 +19455,7 @@
         </w:tabs>
         <w:ind w:start="2160" w:hanging="360"/>
       </w:pPr>
+      <w:rPr/>
     </w:lvl>
     <w:lvl w:ilvl="5">
       <w:start w:val="1"/>
@@ -19013,6 +19468,7 @@
         </w:tabs>
         <w:ind w:start="2520" w:hanging="360"/>
       </w:pPr>
+      <w:rPr/>
     </w:lvl>
     <w:lvl w:ilvl="6">
       <w:start w:val="1"/>
@@ -19025,6 +19481,7 @@
         </w:tabs>
         <w:ind w:start="2880" w:hanging="360"/>
       </w:pPr>
+      <w:rPr/>
     </w:lvl>
     <w:lvl w:ilvl="7">
       <w:start w:val="1"/>
@@ -19037,6 +19494,7 @@
         </w:tabs>
         <w:ind w:start="3240" w:hanging="360"/>
       </w:pPr>
+      <w:rPr/>
     </w:lvl>
     <w:lvl w:ilvl="8">
       <w:start w:val="1"/>
@@ -19049,6 +19507,7 @@
         </w:tabs>
         <w:ind w:start="3600" w:hanging="360"/>
       </w:pPr>
+      <w:rPr/>
     </w:lvl>
   </w:abstractNum>
   <w:abstractNum w:abstractNumId="6">
@@ -19076,6 +19535,7 @@
         </w:tabs>
         <w:ind w:start="1080" w:hanging="360"/>
       </w:pPr>
+      <w:rPr/>
     </w:lvl>
     <w:lvl w:ilvl="2">
       <w:start w:val="1"/>
@@ -19088,6 +19548,7 @@
         </w:tabs>
         <w:ind w:start="1440" w:hanging="360"/>
       </w:pPr>
+      <w:rPr/>
     </w:lvl>
     <w:lvl w:ilvl="3">
       <w:start w:val="1"/>
@@ -19100,6 +19561,7 @@
         </w:tabs>
         <w:ind w:start="1800" w:hanging="360"/>
       </w:pPr>
+      <w:rPr/>
     </w:lvl>
     <w:lvl w:ilvl="4">
       <w:start w:val="1"/>
@@ -19112,6 +19574,7 @@
         </w:tabs>
         <w:ind w:start="2160" w:hanging="360"/>
       </w:pPr>
+      <w:rPr/>
     </w:lvl>
     <w:lvl w:ilvl="5">
       <w:start w:val="1"/>
@@ -19124,6 +19587,7 @@
         </w:tabs>
         <w:ind w:start="2520" w:hanging="360"/>
       </w:pPr>
+      <w:rPr/>
     </w:lvl>
     <w:lvl w:ilvl="6">
       <w:start w:val="1"/>
@@ -19136,6 +19600,7 @@
         </w:tabs>
         <w:ind w:start="2880" w:hanging="360"/>
       </w:pPr>
+      <w:rPr/>
     </w:lvl>
     <w:lvl w:ilvl="7">
       <w:start w:val="1"/>
@@ -19148,6 +19613,7 @@
         </w:tabs>
         <w:ind w:start="3240" w:hanging="360"/>
       </w:pPr>
+      <w:rPr/>
     </w:lvl>
     <w:lvl w:ilvl="8">
       <w:start w:val="1"/>
@@ -19160,6 +19626,7 @@
         </w:tabs>
         <w:ind w:start="3600" w:hanging="360"/>
       </w:pPr>
+      <w:rPr/>
     </w:lvl>
   </w:abstractNum>
   <w:abstractNum w:abstractNumId="7">
@@ -19310,7 +19777,7 @@
   <w:docDefaults>
     <w:rPrDefault>
       <w:rPr>
-        <w:rFonts w:ascii="Cambria" w:hAnsi="Cambria" w:eastAsia="ＭＳ 明朝" w:cs="" w:asciiTheme="minorHAnsi" w:cstheme="minorBidi" w:eastAsiaTheme="minorEastAsia" w:hAnsiTheme="minorHAnsi"/>
+        <w:rFonts w:ascii="Cambria" w:hAnsi="Cambria" w:eastAsia="" w:cs="" w:asciiTheme="minorHAnsi" w:cstheme="minorBidi" w:eastAsiaTheme="minorEastAsia" w:hAnsiTheme="minorHAnsi"/>
         <w:sz w:val="22"/>
         <w:szCs w:val="22"/>
         <w:lang w:val="en-US" w:eastAsia="en-US" w:bidi="ar-SA"/>
@@ -19467,12 +19934,13 @@
     <w:rsid w:val="00fc693f"/>
     <w:pPr>
       <w:widowControl/>
+      <w:suppressAutoHyphens w:val="true"/>
       <w:bidi w:val="0"/>
       <w:spacing w:lineRule="auto" w:line="276" w:before="0" w:after="200"/>
       <w:jc w:val="start"/>
     </w:pPr>
     <w:rPr>
-      <w:rFonts w:ascii="Cambria" w:hAnsi="Cambria" w:eastAsia="ＭＳ 明朝" w:cs="" w:asciiTheme="minorHAnsi" w:cstheme="minorBidi" w:eastAsiaTheme="minorEastAsia" w:hAnsiTheme="minorHAnsi"/>
+      <w:rFonts w:ascii="Cambria" w:hAnsi="Cambria" w:eastAsia="" w:cs="" w:asciiTheme="minorHAnsi" w:cstheme="minorBidi" w:eastAsiaTheme="minorEastAsia" w:hAnsiTheme="minorHAnsi"/>
       <w:color w:val="auto"/>
       <w:kern w:val="0"/>
       <w:sz w:val="22"/>
@@ -19495,7 +19963,7 @@
       <w:outlineLvl w:val="0"/>
     </w:pPr>
     <w:rPr>
-      <w:rFonts w:ascii="Calibri" w:hAnsi="Calibri" w:eastAsia="ＭＳ ゴシック" w:cs="" w:asciiTheme="majorHAnsi" w:cstheme="majorBidi" w:eastAsiaTheme="majorEastAsia" w:hAnsiTheme="majorHAnsi"/>
+      <w:rFonts w:ascii="Calibri" w:hAnsi="Calibri" w:eastAsia="" w:cs="" w:asciiTheme="majorHAnsi" w:cstheme="majorBidi" w:eastAsiaTheme="majorEastAsia" w:hAnsiTheme="majorHAnsi"/>
       <w:b/>
       <w:bCs/>
       <w:color w:themeColor="accent1" w:themeShade="bf" w:val="365F91"/>
@@ -19519,7 +19987,7 @@
       <w:outlineLvl w:val="1"/>
     </w:pPr>
     <w:rPr>
-      <w:rFonts w:ascii="Calibri" w:hAnsi="Calibri" w:eastAsia="ＭＳ ゴシック" w:cs="" w:asciiTheme="majorHAnsi" w:cstheme="majorBidi" w:eastAsiaTheme="majorEastAsia" w:hAnsiTheme="majorHAnsi"/>
+      <w:rFonts w:ascii="Calibri" w:hAnsi="Calibri" w:eastAsia="" w:cs="" w:asciiTheme="majorHAnsi" w:cstheme="majorBidi" w:eastAsiaTheme="majorEastAsia" w:hAnsiTheme="majorHAnsi"/>
       <w:b/>
       <w:bCs/>
       <w:color w:themeColor="accent1" w:val="4F81BD"/>
@@ -19543,7 +20011,7 @@
       <w:outlineLvl w:val="2"/>
     </w:pPr>
     <w:rPr>
-      <w:rFonts w:ascii="Calibri" w:hAnsi="Calibri" w:eastAsia="ＭＳ ゴシック" w:cs="" w:asciiTheme="majorHAnsi" w:cstheme="majorBidi" w:eastAsiaTheme="majorEastAsia" w:hAnsiTheme="majorHAnsi"/>
+      <w:rFonts w:ascii="Calibri" w:hAnsi="Calibri" w:eastAsia="" w:cs="" w:asciiTheme="majorHAnsi" w:cstheme="majorBidi" w:eastAsiaTheme="majorEastAsia" w:hAnsiTheme="majorHAnsi"/>
       <w:b/>
       <w:bCs/>
       <w:color w:themeColor="accent1" w:val="4F81BD"/>
@@ -19566,7 +20034,7 @@
       <w:outlineLvl w:val="3"/>
     </w:pPr>
     <w:rPr>
-      <w:rFonts w:ascii="Calibri" w:hAnsi="Calibri" w:eastAsia="ＭＳ ゴシック" w:cs="" w:asciiTheme="majorHAnsi" w:cstheme="majorBidi" w:eastAsiaTheme="majorEastAsia" w:hAnsiTheme="majorHAnsi"/>
+      <w:rFonts w:ascii="Calibri" w:hAnsi="Calibri" w:eastAsia="" w:cs="" w:asciiTheme="majorHAnsi" w:cstheme="majorBidi" w:eastAsiaTheme="majorEastAsia" w:hAnsiTheme="majorHAnsi"/>
       <w:b/>
       <w:bCs/>
       <w:i/>
@@ -19591,7 +20059,7 @@
       <w:outlineLvl w:val="4"/>
     </w:pPr>
     <w:rPr>
-      <w:rFonts w:ascii="Calibri" w:hAnsi="Calibri" w:eastAsia="ＭＳ ゴシック" w:cs="" w:asciiTheme="majorHAnsi" w:cstheme="majorBidi" w:eastAsiaTheme="majorEastAsia" w:hAnsiTheme="majorHAnsi"/>
+      <w:rFonts w:ascii="Calibri" w:hAnsi="Calibri" w:eastAsia="" w:cs="" w:asciiTheme="majorHAnsi" w:cstheme="majorBidi" w:eastAsiaTheme="majorEastAsia" w:hAnsiTheme="majorHAnsi"/>
       <w:color w:themeColor="accent1" w:themeShade="7f" w:val="243F60"/>
     </w:rPr>
   </w:style>
@@ -19612,7 +20080,7 @@
       <w:outlineLvl w:val="5"/>
     </w:pPr>
     <w:rPr>
-      <w:rFonts w:ascii="Calibri" w:hAnsi="Calibri" w:eastAsia="ＭＳ ゴシック" w:cs="" w:asciiTheme="majorHAnsi" w:cstheme="majorBidi" w:eastAsiaTheme="majorEastAsia" w:hAnsiTheme="majorHAnsi"/>
+      <w:rFonts w:ascii="Calibri" w:hAnsi="Calibri" w:eastAsia="" w:cs="" w:asciiTheme="majorHAnsi" w:cstheme="majorBidi" w:eastAsiaTheme="majorEastAsia" w:hAnsiTheme="majorHAnsi"/>
       <w:i/>
       <w:iCs/>
       <w:color w:themeColor="accent1" w:themeShade="7f" w:val="243F60"/>
@@ -19635,7 +20103,7 @@
       <w:outlineLvl w:val="6"/>
     </w:pPr>
     <w:rPr>
-      <w:rFonts w:ascii="Calibri" w:hAnsi="Calibri" w:eastAsia="ＭＳ ゴシック" w:cs="" w:asciiTheme="majorHAnsi" w:cstheme="majorBidi" w:eastAsiaTheme="majorEastAsia" w:hAnsiTheme="majorHAnsi"/>
+      <w:rFonts w:ascii="Calibri" w:hAnsi="Calibri" w:eastAsia="" w:cs="" w:asciiTheme="majorHAnsi" w:cstheme="majorBidi" w:eastAsiaTheme="majorEastAsia" w:hAnsiTheme="majorHAnsi"/>
       <w:i/>
       <w:iCs/>
       <w:color w:themeColor="text1" w:themeTint="bf" w:val="404040"/>
@@ -19658,7 +20126,7 @@
       <w:outlineLvl w:val="7"/>
     </w:pPr>
     <w:rPr>
-      <w:rFonts w:ascii="Calibri" w:hAnsi="Calibri" w:eastAsia="ＭＳ ゴシック" w:cs="" w:asciiTheme="majorHAnsi" w:cstheme="majorBidi" w:eastAsiaTheme="majorEastAsia" w:hAnsiTheme="majorHAnsi"/>
+      <w:rFonts w:ascii="Calibri" w:hAnsi="Calibri" w:eastAsia="" w:cs="" w:asciiTheme="majorHAnsi" w:cstheme="majorBidi" w:eastAsiaTheme="majorEastAsia" w:hAnsiTheme="majorHAnsi"/>
       <w:color w:themeColor="accent1" w:val="4F81BD"/>
       <w:sz w:val="20"/>
       <w:szCs w:val="20"/>
@@ -19681,7 +20149,7 @@
       <w:outlineLvl w:val="8"/>
     </w:pPr>
     <w:rPr>
-      <w:rFonts w:ascii="Calibri" w:hAnsi="Calibri" w:eastAsia="ＭＳ ゴシック" w:cs="" w:asciiTheme="majorHAnsi" w:cstheme="majorBidi" w:eastAsiaTheme="majorEastAsia" w:hAnsiTheme="majorHAnsi"/>
+      <w:rFonts w:ascii="Calibri" w:hAnsi="Calibri" w:eastAsia="" w:cs="" w:asciiTheme="majorHAnsi" w:cstheme="majorBidi" w:eastAsiaTheme="majorEastAsia" w:hAnsiTheme="majorHAnsi"/>
       <w:i/>
       <w:iCs/>
       <w:color w:themeColor="text1" w:themeTint="bf" w:val="404040"/>
@@ -19723,7 +20191,7 @@
     <w:qFormat/>
     <w:rsid w:val="00fc693f"/>
     <w:rPr>
-      <w:rFonts w:ascii="Calibri" w:hAnsi="Calibri" w:eastAsia="ＭＳ ゴシック" w:cs="" w:asciiTheme="majorHAnsi" w:cstheme="majorBidi" w:eastAsiaTheme="majorEastAsia" w:hAnsiTheme="majorHAnsi"/>
+      <w:rFonts w:ascii="Calibri" w:hAnsi="Calibri" w:eastAsia="" w:cs="" w:asciiTheme="majorHAnsi" w:cstheme="majorBidi" w:eastAsiaTheme="majorEastAsia" w:hAnsiTheme="majorHAnsi"/>
       <w:b/>
       <w:bCs/>
       <w:color w:themeColor="accent1" w:themeShade="bf" w:val="365F91"/>
@@ -19739,7 +20207,7 @@
     <w:qFormat/>
     <w:rsid w:val="00fc693f"/>
     <w:rPr>
-      <w:rFonts w:ascii="Calibri" w:hAnsi="Calibri" w:eastAsia="ＭＳ ゴシック" w:cs="" w:asciiTheme="majorHAnsi" w:cstheme="majorBidi" w:eastAsiaTheme="majorEastAsia" w:hAnsiTheme="majorHAnsi"/>
+      <w:rFonts w:ascii="Calibri" w:hAnsi="Calibri" w:eastAsia="" w:cs="" w:asciiTheme="majorHAnsi" w:cstheme="majorBidi" w:eastAsiaTheme="majorEastAsia" w:hAnsiTheme="majorHAnsi"/>
       <w:b/>
       <w:bCs/>
       <w:color w:themeColor="accent1" w:val="4F81BD"/>
@@ -19755,7 +20223,7 @@
     <w:qFormat/>
     <w:rsid w:val="00fc693f"/>
     <w:rPr>
-      <w:rFonts w:ascii="Calibri" w:hAnsi="Calibri" w:eastAsia="ＭＳ ゴシック" w:cs="" w:asciiTheme="majorHAnsi" w:cstheme="majorBidi" w:eastAsiaTheme="majorEastAsia" w:hAnsiTheme="majorHAnsi"/>
+      <w:rFonts w:ascii="Calibri" w:hAnsi="Calibri" w:eastAsia="" w:cs="" w:asciiTheme="majorHAnsi" w:cstheme="majorBidi" w:eastAsiaTheme="majorEastAsia" w:hAnsiTheme="majorHAnsi"/>
       <w:b/>
       <w:bCs/>
       <w:color w:themeColor="accent1" w:val="4F81BD"/>
@@ -19769,7 +20237,7 @@
     <w:qFormat/>
     <w:rsid w:val="00fc693f"/>
     <w:rPr>
-      <w:rFonts w:ascii="Calibri" w:hAnsi="Calibri" w:eastAsia="ＭＳ ゴシック" w:cs="" w:asciiTheme="majorHAnsi" w:cstheme="majorBidi" w:eastAsiaTheme="majorEastAsia" w:hAnsiTheme="majorHAnsi"/>
+      <w:rFonts w:ascii="Calibri" w:hAnsi="Calibri" w:eastAsia="" w:cs="" w:asciiTheme="majorHAnsi" w:cstheme="majorBidi" w:eastAsiaTheme="majorEastAsia" w:hAnsiTheme="majorHAnsi"/>
       <w:color w:themeColor="text2" w:themeShade="bf" w:val="17365D"/>
       <w:spacing w:val="5"/>
       <w:kern w:val="2"/>
@@ -19785,7 +20253,7 @@
     <w:qFormat/>
     <w:rsid w:val="00fc693f"/>
     <w:rPr>
-      <w:rFonts w:ascii="Calibri" w:hAnsi="Calibri" w:eastAsia="ＭＳ ゴシック" w:cs="" w:asciiTheme="majorHAnsi" w:cstheme="majorBidi" w:eastAsiaTheme="majorEastAsia" w:hAnsiTheme="majorHAnsi"/>
+      <w:rFonts w:ascii="Calibri" w:hAnsi="Calibri" w:eastAsia="" w:cs="" w:asciiTheme="majorHAnsi" w:cstheme="majorBidi" w:eastAsiaTheme="majorEastAsia" w:hAnsiTheme="majorHAnsi"/>
       <w:i/>
       <w:iCs/>
       <w:color w:themeColor="accent1" w:val="4F81BD"/>
@@ -19858,7 +20326,7 @@
     <w:qFormat/>
     <w:rsid w:val="00fc693f"/>
     <w:rPr>
-      <w:rFonts w:ascii="Calibri" w:hAnsi="Calibri" w:eastAsia="ＭＳ ゴシック" w:cs="" w:asciiTheme="majorHAnsi" w:cstheme="majorBidi" w:eastAsiaTheme="majorEastAsia" w:hAnsiTheme="majorHAnsi"/>
+      <w:rFonts w:ascii="Calibri" w:hAnsi="Calibri" w:eastAsia="" w:cs="" w:asciiTheme="majorHAnsi" w:cstheme="majorBidi" w:eastAsiaTheme="majorEastAsia" w:hAnsiTheme="majorHAnsi"/>
       <w:b/>
       <w:bCs/>
       <w:i/>
@@ -19875,7 +20343,7 @@
     <w:qFormat/>
     <w:rsid w:val="00fc693f"/>
     <w:rPr>
-      <w:rFonts w:ascii="Calibri" w:hAnsi="Calibri" w:eastAsia="ＭＳ ゴシック" w:cs="" w:asciiTheme="majorHAnsi" w:cstheme="majorBidi" w:eastAsiaTheme="majorEastAsia" w:hAnsiTheme="majorHAnsi"/>
+      <w:rFonts w:ascii="Calibri" w:hAnsi="Calibri" w:eastAsia="" w:cs="" w:asciiTheme="majorHAnsi" w:cstheme="majorBidi" w:eastAsiaTheme="majorEastAsia" w:hAnsiTheme="majorHAnsi"/>
       <w:color w:themeColor="accent1" w:themeShade="7f" w:val="243F60"/>
     </w:rPr>
   </w:style>
@@ -19888,7 +20356,7 @@
     <w:qFormat/>
     <w:rsid w:val="00fc693f"/>
     <w:rPr>
-      <w:rFonts w:ascii="Calibri" w:hAnsi="Calibri" w:eastAsia="ＭＳ ゴシック" w:cs="" w:asciiTheme="majorHAnsi" w:cstheme="majorBidi" w:eastAsiaTheme="majorEastAsia" w:hAnsiTheme="majorHAnsi"/>
+      <w:rFonts w:ascii="Calibri" w:hAnsi="Calibri" w:eastAsia="" w:cs="" w:asciiTheme="majorHAnsi" w:cstheme="majorBidi" w:eastAsiaTheme="majorEastAsia" w:hAnsiTheme="majorHAnsi"/>
       <w:i/>
       <w:iCs/>
       <w:color w:themeColor="accent1" w:themeShade="7f" w:val="243F60"/>
@@ -19903,7 +20371,7 @@
     <w:qFormat/>
     <w:rsid w:val="00fc693f"/>
     <w:rPr>
-      <w:rFonts w:ascii="Calibri" w:hAnsi="Calibri" w:eastAsia="ＭＳ ゴシック" w:cs="" w:asciiTheme="majorHAnsi" w:cstheme="majorBidi" w:eastAsiaTheme="majorEastAsia" w:hAnsiTheme="majorHAnsi"/>
+      <w:rFonts w:ascii="Calibri" w:hAnsi="Calibri" w:eastAsia="" w:cs="" w:asciiTheme="majorHAnsi" w:cstheme="majorBidi" w:eastAsiaTheme="majorEastAsia" w:hAnsiTheme="majorHAnsi"/>
       <w:i/>
       <w:iCs/>
       <w:color w:themeColor="text1" w:themeTint="bf" w:val="404040"/>
@@ -19918,7 +20386,7 @@
     <w:qFormat/>
     <w:rsid w:val="00fc693f"/>
     <w:rPr>
-      <w:rFonts w:ascii="Calibri" w:hAnsi="Calibri" w:eastAsia="ＭＳ ゴシック" w:cs="" w:asciiTheme="majorHAnsi" w:cstheme="majorBidi" w:eastAsiaTheme="majorEastAsia" w:hAnsiTheme="majorHAnsi"/>
+      <w:rFonts w:ascii="Calibri" w:hAnsi="Calibri" w:eastAsia="" w:cs="" w:asciiTheme="majorHAnsi" w:cstheme="majorBidi" w:eastAsiaTheme="majorEastAsia" w:hAnsiTheme="majorHAnsi"/>
       <w:color w:themeColor="accent1" w:val="4F81BD"/>
       <w:sz w:val="20"/>
       <w:szCs w:val="20"/>
@@ -19933,7 +20401,7 @@
     <w:qFormat/>
     <w:rsid w:val="00fc693f"/>
     <w:rPr>
-      <w:rFonts w:ascii="Calibri" w:hAnsi="Calibri" w:eastAsia="ＭＳ ゴシック" w:cs="" w:asciiTheme="majorHAnsi" w:cstheme="majorBidi" w:eastAsiaTheme="majorEastAsia" w:hAnsiTheme="majorHAnsi"/>
+      <w:rFonts w:ascii="Calibri" w:hAnsi="Calibri" w:eastAsia="" w:cs="" w:asciiTheme="majorHAnsi" w:cstheme="majorBidi" w:eastAsiaTheme="majorEastAsia" w:hAnsiTheme="majorHAnsi"/>
       <w:i/>
       <w:iCs/>
       <w:color w:themeColor="text1" w:themeTint="bf" w:val="404040"/>
@@ -20163,12 +20631,13 @@
     <w:rsid w:val="00fc693f"/>
     <w:pPr>
       <w:widowControl/>
+      <w:suppressAutoHyphens w:val="true"/>
       <w:bidi w:val="0"/>
       <w:spacing w:lineRule="auto" w:line="240" w:before="0" w:after="0"/>
       <w:jc w:val="start"/>
     </w:pPr>
     <w:rPr>
-      <w:rFonts w:ascii="Cambria" w:hAnsi="Cambria" w:eastAsia="ＭＳ 明朝" w:cs="" w:asciiTheme="minorHAnsi" w:cstheme="minorBidi" w:eastAsiaTheme="minorEastAsia" w:hAnsiTheme="minorHAnsi"/>
+      <w:rFonts w:ascii="Cambria" w:hAnsi="Cambria" w:eastAsia="" w:cs="" w:asciiTheme="minorHAnsi" w:cstheme="minorBidi" w:eastAsiaTheme="minorEastAsia" w:hAnsiTheme="minorHAnsi"/>
       <w:color w:val="auto"/>
       <w:kern w:val="0"/>
       <w:sz w:val="22"/>
@@ -20192,7 +20661,7 @@
       <w:contextualSpacing/>
     </w:pPr>
     <w:rPr>
-      <w:rFonts w:ascii="Calibri" w:hAnsi="Calibri" w:eastAsia="ＭＳ ゴシック" w:cs="" w:asciiTheme="majorHAnsi" w:cstheme="majorBidi" w:eastAsiaTheme="majorEastAsia" w:hAnsiTheme="majorHAnsi"/>
+      <w:rFonts w:ascii="Calibri" w:hAnsi="Calibri" w:eastAsia="" w:cs="" w:asciiTheme="majorHAnsi" w:cstheme="majorBidi" w:eastAsiaTheme="majorEastAsia" w:hAnsiTheme="majorHAnsi"/>
       <w:color w:themeColor="text2" w:themeShade="bf" w:val="17365D"/>
       <w:spacing w:val="5"/>
       <w:kern w:val="2"/>
@@ -20210,7 +20679,7 @@
     <w:rsid w:val="00fc693f"/>
     <w:pPr/>
     <w:rPr>
-      <w:rFonts w:ascii="Calibri" w:hAnsi="Calibri" w:eastAsia="ＭＳ ゴシック" w:cs="" w:asciiTheme="majorHAnsi" w:cstheme="majorBidi" w:eastAsiaTheme="majorEastAsia" w:hAnsiTheme="majorHAnsi"/>
+      <w:rFonts w:ascii="Calibri" w:hAnsi="Calibri" w:eastAsia="" w:cs="" w:asciiTheme="majorHAnsi" w:cstheme="majorBidi" w:eastAsiaTheme="majorEastAsia" w:hAnsiTheme="majorHAnsi"/>
       <w:i/>
       <w:iCs/>
       <w:color w:themeColor="accent1" w:val="4F81BD"/>
@@ -20443,12 +20912,13 @@
         <w:tab w:val="left" w:pos="3456" w:leader="none"/>
         <w:tab w:val="left" w:pos="4032" w:leader="none"/>
       </w:tabs>
+      <w:suppressAutoHyphens w:val="true"/>
       <w:bidi w:val="0"/>
       <w:spacing w:lineRule="auto" w:line="276" w:before="0" w:after="200"/>
       <w:jc w:val="start"/>
     </w:pPr>
     <w:rPr>
-      <w:rFonts w:ascii="Courier" w:hAnsi="Courier" w:eastAsia="ＭＳ 明朝" w:cs="" w:cstheme="minorBidi" w:eastAsiaTheme="minorEastAsia"/>
+      <w:rFonts w:ascii="Courier" w:hAnsi="Courier" w:eastAsia="" w:cs="" w:cstheme="minorBidi" w:eastAsiaTheme="minorEastAsia"/>
       <w:color w:val="auto"/>
       <w:kern w:val="0"/>
       <w:sz w:val="20"/>
@@ -23646,7 +24116,6 @@
       <w:pPr>
         <w:spacing w:before="0" w:after="0" w:line="240" w:lineRule="auto"/>
       </w:pPr>
-      <w:rPr/>
       <w:tblPr/>
       <w:tcPr>
         <w:tcBorders>
@@ -23792,7 +24261,6 @@
       <w:pPr>
         <w:spacing w:before="0" w:after="0" w:line="240" w:lineRule="auto"/>
       </w:pPr>
-      <w:rPr/>
       <w:tblPr/>
       <w:tcPr>
         <w:tcBorders>
@@ -23938,7 +24406,6 @@
       <w:pPr>
         <w:spacing w:before="0" w:after="0" w:line="240" w:lineRule="auto"/>
       </w:pPr>
-      <w:rPr/>
       <w:tblPr/>
       <w:tcPr>
         <w:tcBorders>
@@ -24084,7 +24551,6 @@
       <w:pPr>
         <w:spacing w:before="0" w:after="0" w:line="240" w:lineRule="auto"/>
       </w:pPr>
-      <w:rPr/>
       <w:tblPr/>
       <w:tcPr>
         <w:tcBorders>
@@ -24230,7 +24696,6 @@
       <w:pPr>
         <w:spacing w:before="0" w:after="0" w:line="240" w:lineRule="auto"/>
       </w:pPr>
-      <w:rPr/>
       <w:tblPr/>
       <w:tcPr>
         <w:tcBorders>
@@ -24376,7 +24841,6 @@
       <w:pPr>
         <w:spacing w:before="0" w:after="0" w:line="240" w:lineRule="auto"/>
       </w:pPr>
-      <w:rPr/>
       <w:tblPr/>
       <w:tcPr>
         <w:tcBorders>
@@ -24522,7 +24986,6 @@
       <w:pPr>
         <w:spacing w:before="0" w:after="0" w:line="240" w:lineRule="auto"/>
       </w:pPr>
-      <w:rPr/>
       <w:tblPr/>
       <w:tcPr>
         <w:tcBorders>

</xml_diff>